<commit_message>
release(0.5.0): media-library picker — library-first image picking with demo parity — 757 tests / 104 files; docs current; both Word editions regenerated (0 field codes)
</commit_message>
<xml_diff>
--- a/docs/ICJIA-Studio-20-analysis-roadmap-copperhead.docx
+++ b/docs/ICJIA-Studio-20-analysis-roadmap-copperhead.docx
@@ -6603,7 +6603,7 @@
           <w:b/>
           <w:bCs/>
         </w:rPr>
-        <w:t xml:space="preserve">Hub Studio 2.0 · Studio build v0.4.0</w:t>
+        <w:t xml:space="preserve">Hub Studio 2.0 · Studio build v0.5.0</w:t>
       </w:r>
       <w:r>
         <w:t xml:space="preserve"> </w:t>
@@ -14262,6 +14262,51 @@
               <w:pStyle w:val="Compact"/>
             </w:pPr>
             <w:r>
+              <w:t xml:space="preserve">Media-library picker (browse ~20 newest, search, upload tab)</w:t>
+            </w:r>
+          </w:p>
+        </w:tc>
+        <w:tc>
+          <w:tcPr/>
+          <w:p>
+            <w:pPr>
+              <w:pStyle w:val="Compact"/>
+            </w:pPr>
+            <w:r>
+              <w:t xml:space="preserve">Reuse existing library images; alt write-back for alt-less picks</w:t>
+            </w:r>
+          </w:p>
+        </w:tc>
+        <w:tc>
+          <w:tcPr/>
+          <w:p>
+            <w:pPr>
+              <w:pStyle w:val="Compact"/>
+            </w:pPr>
+            <w:r>
+              <w:rPr>
+                <w:b/>
+                <w:bCs/>
+              </w:rPr>
+              <w:t xml:space="preserve">Built</w:t>
+            </w:r>
+            <w:r>
+              <w:t xml:space="preserve"> </w:t>
+            </w:r>
+            <w:r>
+              <w:t xml:space="preserve">(v0.5.0)</w:t>
+            </w:r>
+          </w:p>
+        </w:tc>
+      </w:tr>
+      <w:tr>
+        <w:tc>
+          <w:tcPr/>
+          <w:p>
+            <w:pPr>
+              <w:pStyle w:val="Compact"/>
+            </w:pPr>
+            <w:r>
               <w:t xml:space="preserve">Document/PDF file upload</w:t>
             </w:r>
           </w:p>
@@ -21308,37 +21353,53 @@
           <w:b/>
           <w:bCs/>
         </w:rPr>
-        <w:t xml:space="preserve">2026-07-16 — Media-library picker: design approved, build underway.</w:t>
-      </w:r>
-      <w:r>
-        <w:t xml:space="preserve"> </w:t>
-      </w:r>
-      <w:r>
-        <w:t xml:space="preserve">Every image</w:t>
-      </w:r>
-      <w:r>
-        <w:t xml:space="preserve"> </w:t>
-      </w:r>
-      <w:r>
-        <w:t xml:space="preserve">surface will open on the ~20 newest Media Library images (searchable) with</w:t>
-      </w:r>
-      <w:r>
-        <w:t xml:space="preserve"> </w:t>
-      </w:r>
-      <w:r>
-        <w:t xml:space="preserve">upload-from-desktop one tab away; picking an image that lacks alt text requires supplying</w:t>
-      </w:r>
-      <w:r>
-        <w:t xml:space="preserve"> </w:t>
-      </w:r>
-      <w:r>
-        <w:t xml:space="preserve">it, which is written back to the shared library. Works identically in the public demo,</w:t>
-      </w:r>
-      <w:r>
-        <w:t xml:space="preserve"> </w:t>
-      </w:r>
-      <w:r>
-        <w:t xml:space="preserve">where nothing persists.</w:t>
+        <w:t xml:space="preserve">2026-07-16 — Media-library picker shipped (v0.5.0).</w:t>
+      </w:r>
+      <w:r>
+        <w:t xml:space="preserve"> </w:t>
+      </w:r>
+      <w:r>
+        <w:t xml:space="preserve">Every image surface now opens on</w:t>
+      </w:r>
+      <w:r>
+        <w:t xml:space="preserve"> </w:t>
+      </w:r>
+      <w:r>
+        <w:t xml:space="preserve">the ~20 newest Media Library images (searchable) with upload-from-desktop one tab away;</w:t>
+      </w:r>
+      <w:r>
+        <w:t xml:space="preserve"> </w:t>
+      </w:r>
+      <w:r>
+        <w:t xml:space="preserve">picking an image that lacks alt text requires supplying it, which is written back to the</w:t>
+      </w:r>
+      <w:r>
+        <w:t xml:space="preserve"> </w:t>
+      </w:r>
+      <w:r>
+        <w:t xml:space="preserve">shared library so it improves for everyone. Works identically in the public demo, where</w:t>
+      </w:r>
+      <w:r>
+        <w:t xml:space="preserve"> </w:t>
+      </w:r>
+      <w:r>
+        <w:t xml:space="preserve">new images live only for the session and nothing persists. Built test-first over ten</w:t>
+      </w:r>
+      <w:r>
+        <w:t xml:space="preserve"> </w:t>
+      </w:r>
+      <w:r>
+        <w:t xml:space="preserve">adversarially-reviewed tasks and verified end-to-end in the running demo before merge.</w:t>
+      </w:r>
+      <w:r>
+        <w:t xml:space="preserve"> </w:t>
+      </w:r>
+      <w:r>
+        <w:rPr>
+          <w:b/>
+          <w:bCs/>
+        </w:rPr>
+        <w:t xml:space="preserve">757 automated tests / 104 files.</w:t>
       </w:r>
     </w:p>
     <w:p>
@@ -21556,7 +21617,7 @@
           <w:b/>
           <w:bCs/>
         </w:rPr>
-        <w:t xml:space="preserve">Hub Studio 2.0 · Studio build v0.4.0</w:t>
+        <w:t xml:space="preserve">Hub Studio 2.0 · Studio build v0.5.0</w:t>
       </w:r>
       <w:r>
         <w:t xml:space="preserve"> </w:t>
@@ -43028,6 +43089,92 @@
       </w:r>
       <w:r>
         <w:t xml:space="preserve">§2. Symptom if missed: login fails with CORS errors in the console, not a 401.</w:t>
+      </w:r>
+    </w:p>
+    <w:p>
+      <w:pPr>
+        <w:pStyle w:val="Compact"/>
+        <w:numPr>
+          <w:ilvl w:val="0"/>
+          <w:numId w:val="1085"/>
+        </w:numPr>
+      </w:pPr>
+      <w:r>
+        <w:rPr>
+          <w:b/>
+          <w:bCs/>
+        </w:rPr>
+        <w:t xml:space="preserve">Media Library update permission.</w:t>
+      </w:r>
+      <w:r>
+        <w:t xml:space="preserve"> </w:t>
+      </w:r>
+      <w:r>
+        <w:t xml:space="preserve">Grant the Author and Editor roles the upload</w:t>
+      </w:r>
+      <w:r>
+        <w:t xml:space="preserve"> </w:t>
+      </w:r>
+      <w:r>
+        <w:t xml:space="preserve">plugin's</w:t>
+      </w:r>
+      <w:r>
+        <w:t xml:space="preserve"> </w:t>
+      </w:r>
+      <w:r>
+        <w:rPr>
+          <w:i/>
+          <w:iCs/>
+        </w:rPr>
+        <w:t xml:space="preserve">update file info</w:t>
+      </w:r>
+      <w:r>
+        <w:t xml:space="preserve"> </w:t>
+      </w:r>
+      <w:r>
+        <w:t xml:space="preserve">action — the Studio's library picker writes alt text back to</w:t>
+      </w:r>
+      <w:r>
+        <w:t xml:space="preserve"> </w:t>
+      </w:r>
+      <w:r>
+        <w:t xml:space="preserve">alt-less images (</w:t>
+      </w:r>
+      <w:r>
+        <w:rPr>
+          <w:rStyle w:val="VerbatimChar"/>
+        </w:rPr>
+        <w:t xml:space="preserve">POST /upload?id=&lt;id&gt;</w:t>
+      </w:r>
+      <w:r>
+        <w:t xml:space="preserve"> </w:t>
+      </w:r>
+      <w:r>
+        <w:t xml:space="preserve">with</w:t>
+      </w:r>
+      <w:r>
+        <w:t xml:space="preserve"> </w:t>
+      </w:r>
+      <w:r>
+        <w:rPr>
+          <w:rStyle w:val="VerbatimChar"/>
+        </w:rPr>
+        <w:t xml:space="preserve">fileInfo</w:t>
+      </w:r>
+      <w:r>
+        <w:t xml:space="preserve">). Verify during the staging</w:t>
+      </w:r>
+      <w:r>
+        <w:t xml:space="preserve"> </w:t>
+      </w:r>
+      <w:r>
+        <w:t xml:space="preserve">rehearsal (§2): pick an alt-less image as an Author, supply alt, confirm the record</w:t>
+      </w:r>
+      <w:r>
+        <w:t xml:space="preserve"> </w:t>
+      </w:r>
+      <w:r>
+        <w:t xml:space="preserve">updates.</w:t>
       </w:r>
     </w:p>
     <w:p>

</xml_diff>

<commit_message>
release(0.6.0): unsaved-work guard — leave warnings, 30s local snapshots (live only), restore banner — 800 tests / 107 files; docs current; follow-ups filed in ROADMAP; both Word editions regenerated (0 field codes)
</commit_message>
<xml_diff>
--- a/docs/ICJIA-Studio-20-analysis-roadmap-copperhead.docx
+++ b/docs/ICJIA-Studio-20-analysis-roadmap-copperhead.docx
@@ -6603,7 +6603,7 @@
           <w:b/>
           <w:bCs/>
         </w:rPr>
-        <w:t xml:space="preserve">Hub Studio 2.0 · Studio build v0.5.0</w:t>
+        <w:t xml:space="preserve">Hub Studio 2.0 · Studio build v0.6.0</w:t>
       </w:r>
       <w:r>
         <w:t xml:space="preserve"> </w:t>
@@ -14424,6 +14424,51 @@
               <w:pStyle w:val="Compact"/>
             </w:pPr>
             <w:r>
+              <w:t xml:space="preserve">Unsaved-work guard (leave warning, 30 s local backup, restore banner)</w:t>
+            </w:r>
+          </w:p>
+        </w:tc>
+        <w:tc>
+          <w:tcPr/>
+          <w:p>
+            <w:pPr>
+              <w:pStyle w:val="Compact"/>
+            </w:pPr>
+            <w:r>
+              <w:t xml:space="preserve">Authors can't silently lose in-progress work</w:t>
+            </w:r>
+          </w:p>
+        </w:tc>
+        <w:tc>
+          <w:tcPr/>
+          <w:p>
+            <w:pPr>
+              <w:pStyle w:val="Compact"/>
+            </w:pPr>
+            <w:r>
+              <w:rPr>
+                <w:b/>
+                <w:bCs/>
+              </w:rPr>
+              <w:t xml:space="preserve">Built</w:t>
+            </w:r>
+            <w:r>
+              <w:t xml:space="preserve"> </w:t>
+            </w:r>
+            <w:r>
+              <w:t xml:space="preserve">(v0.6.0)</w:t>
+            </w:r>
+          </w:p>
+        </w:tc>
+      </w:tr>
+      <w:tr>
+        <w:tc>
+          <w:tcPr/>
+          <w:p>
+            <w:pPr>
+              <w:pStyle w:val="Compact"/>
+            </w:pPr>
+            <w:r>
               <w:t xml:space="preserve">"Preview as published" (TOC, end matter, Print)</w:t>
             </w:r>
           </w:p>
@@ -21291,6 +21336,110 @@
           <w:b/>
           <w:bCs/>
         </w:rPr>
+        <w:t xml:space="preserve">2026-07-16 — Unsaved-work guard shipped (v0.6.0).</w:t>
+      </w:r>
+      <w:r>
+        <w:t xml:space="preserve"> </w:t>
+      </w:r>
+      <w:r>
+        <w:t xml:space="preserve">Authors can no longer silently</w:t>
+      </w:r>
+      <w:r>
+        <w:t xml:space="preserve"> </w:t>
+      </w:r>
+      <w:r>
+        <w:t xml:space="preserve">lose in-progress work: a native leave-page warning, a 30-second local draft snapshot</w:t>
+      </w:r>
+      <w:r>
+        <w:t xml:space="preserve"> </w:t>
+      </w:r>
+      <w:r>
+        <w:t xml:space="preserve">while a form is dirty, and a non-blocking restore banner ("Restore" / "Discard") when a</w:t>
+      </w:r>
+      <w:r>
+        <w:t xml:space="preserve"> </w:t>
+      </w:r>
+      <w:r>
+        <w:t xml:space="preserve">surviving snapshot is found; every successful save clears the backup.</w:t>
+      </w:r>
+      <w:r>
+        <w:t xml:space="preserve"> </w:t>
+      </w:r>
+      <w:r>
+        <w:rPr>
+          <w:b/>
+          <w:bCs/>
+        </w:rPr>
+        <w:t xml:space="preserve">Live builds</w:t>
+      </w:r>
+      <w:r>
+        <w:rPr>
+          <w:b/>
+          <w:bCs/>
+        </w:rPr>
+        <w:t xml:space="preserve"> </w:t>
+      </w:r>
+      <w:r>
+        <w:rPr>
+          <w:b/>
+          <w:bCs/>
+        </w:rPr>
+        <w:t xml:space="preserve">only</w:t>
+      </w:r>
+      <w:r>
+        <w:t xml:space="preserve"> </w:t>
+      </w:r>
+      <w:r>
+        <w:t xml:space="preserve">— the public demo deliberately takes no snapshots, so its "nothing is saved /</w:t>
+      </w:r>
+      <w:r>
+        <w:t xml:space="preserve"> </w:t>
+      </w:r>
+      <w:r>
+        <w:t xml:space="preserve">resets each session" promise stays literally true; the demo still shows both warnings.</w:t>
+      </w:r>
+      <w:r>
+        <w:t xml:space="preserve"> </w:t>
+      </w:r>
+      <w:r>
+        <w:t xml:space="preserve">Built test-first over six reviewed tasks with per-task adversarial review, then verified</w:t>
+      </w:r>
+      <w:r>
+        <w:t xml:space="preserve"> </w:t>
+      </w:r>
+      <w:r>
+        <w:t xml:space="preserve">end-to-end in the running app (snapshot, restore, clear-on-save, and the demo's</w:t>
+      </w:r>
+      <w:r>
+        <w:t xml:space="preserve"> </w:t>
+      </w:r>
+      <w:r>
+        <w:t xml:space="preserve">zero-write policy all observed live).</w:t>
+      </w:r>
+      <w:r>
+        <w:t xml:space="preserve"> </w:t>
+      </w:r>
+      <w:r>
+        <w:rPr>
+          <w:b/>
+          <w:bCs/>
+        </w:rPr>
+        <w:t xml:space="preserve">800 automated tests / 107 files.</w:t>
+      </w:r>
+    </w:p>
+    <w:p>
+      <w:pPr>
+        <w:pStyle w:val="Compact"/>
+        <w:numPr>
+          <w:ilvl w:val="0"/>
+          <w:numId w:val="1030"/>
+        </w:numPr>
+      </w:pPr>
+      <w:r>
+        <w:rPr>
+          <w:b/>
+          <w:bCs/>
+        </w:rPr>
         <w:t xml:space="preserve">2026-07-16 — Manager-docs workflow (v0.4.0).</w:t>
       </w:r>
       <w:r>
@@ -21617,7 +21766,7 @@
           <w:b/>
           <w:bCs/>
         </w:rPr>
-        <w:t xml:space="preserve">Hub Studio 2.0 · Studio build v0.5.0</w:t>
+        <w:t xml:space="preserve">Hub Studio 2.0 · Studio build v0.6.0</w:t>
       </w:r>
       <w:r>
         <w:t xml:space="preserve"> </w:t>

</xml_diff>

<commit_message>
release(0.7.0): title search — debounced whole-library search on all content lists; CRITICAL wire-format fix for live Strapi filters — 822 tests / 107 files; docs current; both Word editions regenerated (0 field codes)
</commit_message>
<xml_diff>
--- a/docs/ICJIA-Studio-20-analysis-roadmap-copperhead.docx
+++ b/docs/ICJIA-Studio-20-analysis-roadmap-copperhead.docx
@@ -6603,7 +6603,7 @@
           <w:b/>
           <w:bCs/>
         </w:rPr>
-        <w:t xml:space="preserve">Hub Studio 2.0 · Studio build v0.6.0</w:t>
+        <w:t xml:space="preserve">Hub Studio 2.0 · Studio build v0.7.0</w:t>
       </w:r>
       <w:r>
         <w:t xml:space="preserve"> </w:t>
@@ -14631,6 +14631,51 @@
               <w:pStyle w:val="Compact"/>
             </w:pPr>
             <w:r>
+              <w:t xml:space="preserve">Title search on content lists (debounced, whole-library)</w:t>
+            </w:r>
+          </w:p>
+        </w:tc>
+        <w:tc>
+          <w:tcPr/>
+          <w:p>
+            <w:pPr>
+              <w:pStyle w:val="Compact"/>
+            </w:pPr>
+            <w:r>
+              <w:t xml:space="preserve">Find any item by title — 236 real articles arrive at launch</w:t>
+            </w:r>
+          </w:p>
+        </w:tc>
+        <w:tc>
+          <w:tcPr/>
+          <w:p>
+            <w:pPr>
+              <w:pStyle w:val="Compact"/>
+            </w:pPr>
+            <w:r>
+              <w:rPr>
+                <w:b/>
+                <w:bCs/>
+              </w:rPr>
+              <w:t xml:space="preserve">Built</w:t>
+            </w:r>
+            <w:r>
+              <w:t xml:space="preserve"> </w:t>
+            </w:r>
+            <w:r>
+              <w:t xml:space="preserve">(v0.7.0)</w:t>
+            </w:r>
+          </w:p>
+        </w:tc>
+      </w:tr>
+      <w:tr>
+        <w:tc>
+          <w:tcPr/>
+          <w:p>
+            <w:pPr>
+              <w:pStyle w:val="Compact"/>
+            </w:pPr>
+            <w:r>
               <w:t xml:space="preserve">Guided onboarding tour</w:t>
             </w:r>
           </w:p>
@@ -21336,6 +21381,138 @@
           <w:b/>
           <w:bCs/>
         </w:rPr>
+        <w:t xml:space="preserve">2026-07-16 — Title search shipped (v0.7.0).</w:t>
+      </w:r>
+      <w:r>
+        <w:t xml:space="preserve"> </w:t>
+      </w:r>
+      <w:r>
+        <w:t xml:space="preserve">A labeled, 300 ms-debounced search box</w:t>
+      </w:r>
+      <w:r>
+        <w:t xml:space="preserve"> </w:t>
+      </w:r>
+      <w:r>
+        <w:t xml:space="preserve">now sits beside the Type filter on every content list — Articles, Apps, and Datasets</w:t>
+      </w:r>
+      <w:r>
+        <w:t xml:space="preserve"> </w:t>
+      </w:r>
+      <w:r>
+        <w:t xml:space="preserve">alike — filtering by title, case-insensitive, across the</w:t>
+      </w:r>
+      <w:r>
+        <w:t xml:space="preserve"> </w:t>
+      </w:r>
+      <w:r>
+        <w:rPr>
+          <w:b/>
+          <w:bCs/>
+        </w:rPr>
+        <w:t xml:space="preserve">whole library</w:t>
+      </w:r>
+      <w:r>
+        <w:t xml:space="preserve">, server-side,</w:t>
+      </w:r>
+      <w:r>
+        <w:t xml:space="preserve"> </w:t>
+      </w:r>
+      <w:r>
+        <w:t xml:space="preserve">identically in live and demo modes; a search change re-pages to 1, and a distinct "No</w:t>
+      </w:r>
+      <w:r>
+        <w:t xml:space="preserve"> </w:t>
+      </w:r>
+      <w:r>
+        <w:t xml:space="preserve">matches" message replaces the generic empty state. Ahead of launch's 236 real articles</w:t>
+      </w:r>
+      <w:r>
+        <w:t xml:space="preserve"> </w:t>
+      </w:r>
+      <w:r>
+        <w:t xml:space="preserve">(analysis-roadmap §5.3-6). The release also fixes a</w:t>
+      </w:r>
+      <w:r>
+        <w:t xml:space="preserve"> </w:t>
+      </w:r>
+      <w:r>
+        <w:rPr>
+          <w:b/>
+          <w:bCs/>
+        </w:rPr>
+        <w:t xml:space="preserve">latent live-mode defect the</w:t>
+      </w:r>
+      <w:r>
+        <w:rPr>
+          <w:b/>
+          <w:bCs/>
+        </w:rPr>
+        <w:t xml:space="preserve"> </w:t>
+      </w:r>
+      <w:r>
+        <w:rPr>
+          <w:b/>
+          <w:bCs/>
+        </w:rPr>
+        <w:t xml:space="preserve">whole-branch review uncovered</w:t>
+      </w:r>
+      <w:r>
+        <w:t xml:space="preserve">: filter parameters (including the existing type filter)</w:t>
+      </w:r>
+      <w:r>
+        <w:t xml:space="preserve"> </w:t>
+      </w:r>
+      <w:r>
+        <w:t xml:space="preserve">were serialized in a form the live content system would reject — invisible until now</w:t>
+      </w:r>
+      <w:r>
+        <w:t xml:space="preserve"> </w:t>
+      </w:r>
+      <w:r>
+        <w:t xml:space="preserve">because the demo and dev sessions run in-memory. The wire format now matches the</w:t>
+      </w:r>
+      <w:r>
+        <w:t xml:space="preserve"> </w:t>
+      </w:r>
+      <w:r>
+        <w:t xml:space="preserve">sandbox-validated pattern, with a final confirmation step added to the staging</w:t>
+      </w:r>
+      <w:r>
+        <w:t xml:space="preserve"> </w:t>
+      </w:r>
+      <w:r>
+        <w:t xml:space="preserve">rehearsal checklist. Verified live in the demo (whole-library filtering, no-matches</w:t>
+      </w:r>
+      <w:r>
+        <w:t xml:space="preserve"> </w:t>
+      </w:r>
+      <w:r>
+        <w:t xml:space="preserve">state, and the unsaved-work guard's leave warning intercepting a real navigation).</w:t>
+      </w:r>
+      <w:r>
+        <w:t xml:space="preserve"> </w:t>
+      </w:r>
+      <w:r>
+        <w:rPr>
+          <w:b/>
+          <w:bCs/>
+        </w:rPr>
+        <w:t xml:space="preserve">822 automated tests / 107 files.</w:t>
+      </w:r>
+    </w:p>
+    <w:p>
+      <w:pPr>
+        <w:pStyle w:val="Compact"/>
+        <w:numPr>
+          <w:ilvl w:val="0"/>
+          <w:numId w:val="1030"/>
+        </w:numPr>
+      </w:pPr>
+      <w:r>
+        <w:rPr>
+          <w:b/>
+          <w:bCs/>
+        </w:rPr>
         <w:t xml:space="preserve">2026-07-16 — Unsaved-work guard shipped (v0.6.0).</w:t>
       </w:r>
       <w:r>
@@ -21766,7 +21943,7 @@
           <w:b/>
           <w:bCs/>
         </w:rPr>
-        <w:t xml:space="preserve">Hub Studio 2.0 · Studio build v0.6.0</w:t>
+        <w:t xml:space="preserve">Hub Studio 2.0 · Studio build v0.7.0</w:t>
       </w:r>
       <w:r>
         <w:t xml:space="preserve"> </w:t>
@@ -43614,43 +43791,214 @@
           <w:b/>
           <w:bCs/>
         </w:rPr>
-        <w:t xml:space="preserve">Annotations end-to-end:</w:t>
-      </w:r>
-      <w:r>
-        <w:t xml:space="preserve"> </w:t>
-      </w:r>
-      <w:r>
-        <w:t xml:space="preserve">in the Live preview (and on</w:t>
-      </w:r>
-      <w:r>
-        <w:t xml:space="preserve"> </w:t>
-      </w:r>
-      <w:r>
-        <w:rPr>
-          <w:rStyle w:val="VerbatimChar"/>
-        </w:rPr>
-        <w:t xml:space="preserve">/preview/...</w:t>
-      </w:r>
-      <w:r>
-        <w:t xml:space="preserve">), highlight →</w:t>
-      </w:r>
-      <w:r>
-        <w:t xml:space="preserve"> </w:t>
-      </w:r>
-      <w:r>
-        <w:t xml:space="preserve">comment → reply → resolve → delete. Then the cross-user test: annotate as user A,</w:t>
-      </w:r>
-      <w:r>
-        <w:t xml:space="preserve"> </w:t>
-      </w:r>
-      <w:r>
-        <w:t xml:space="preserve">open the same draft as user B on another machine — the thread is there; reply as B;</w:t>
-      </w:r>
-      <w:r>
-        <w:t xml:space="preserve"> </w:t>
-      </w:r>
-      <w:r>
-        <w:t xml:space="preserve">reload as A. (Freshness model is refetch-on-open + after-write; there is no live push.)</w:t>
+        <w:t xml:space="preserve">Filters wire format:</w:t>
+      </w:r>
+      <w:r>
+        <w:t xml:space="preserve"> </w:t>
+      </w:r>
+      <w:r>
+        <w:t xml:space="preserve">use the Type filter and the title search box and confirm each</w:t>
+      </w:r>
+      <w:r>
+        <w:t xml:space="preserve"> </w:t>
+      </w:r>
+      <w:r>
+        <w:t xml:space="preserve">returns real (filtered) results, not an error toast/blank list. These — plus</w:t>
+      </w:r>
+      <w:r>
+        <w:t xml:space="preserve"> </w:t>
+      </w:r>
+      <w:r>
+        <w:rPr>
+          <w:rStyle w:val="VerbatimChar"/>
+        </w:rPr>
+        <w:t xml:space="preserve">studio-profile</w:t>
+      </w:r>
+      <w:r>
+        <w:t xml:space="preserve">'s first-login author-email lookup — are the first live-mode calls to</w:t>
+      </w:r>
+      <w:r>
+        <w:t xml:space="preserve"> </w:t>
+      </w:r>
+      <w:r>
+        <w:t xml:space="preserve">exercise</w:t>
+      </w:r>
+      <w:r>
+        <w:t xml:space="preserve"> </w:t>
+      </w:r>
+      <w:r>
+        <w:rPr>
+          <w:rStyle w:val="VerbatimChar"/>
+        </w:rPr>
+        <w:t xml:space="preserve">repository.ts</w:t>
+      </w:r>
+      <w:r>
+        <w:t xml:space="preserve">'s filter query params; a prior bug sent them as a JSON-stringified</w:t>
+      </w:r>
+      <w:r>
+        <w:t xml:space="preserve"> </w:t>
+      </w:r>
+      <w:r>
+        <w:rPr>
+          <w:rStyle w:val="VerbatimChar"/>
+        </w:rPr>
+        <w:t xml:space="preserve">filters</w:t>
+      </w:r>
+      <w:r>
+        <w:t xml:space="preserve"> </w:t>
+      </w:r>
+      <w:r>
+        <w:t xml:space="preserve">value (</w:t>
+      </w:r>
+      <w:r>
+        <w:rPr>
+          <w:rStyle w:val="VerbatimChar"/>
+        </w:rPr>
+        <w:t xml:space="preserve">ofetch</w:t>
+      </w:r>
+      <w:r>
+        <w:t xml:space="preserve">/</w:t>
+      </w:r>
+      <w:r>
+        <w:rPr>
+          <w:rStyle w:val="VerbatimChar"/>
+        </w:rPr>
+        <w:t xml:space="preserve">ufo</w:t>
+      </w:r>
+      <w:r>
+        <w:t xml:space="preserve"> </w:t>
+      </w:r>
+      <w:r>
+        <w:t xml:space="preserve">has no custom query serializer for nested objects), which</w:t>
+      </w:r>
+      <w:r>
+        <w:t xml:space="preserve"> </w:t>
+      </w:r>
+      <w:r>
+        <w:t xml:space="preserve">Strapi 5's qs-based parser rejects. Fixed to flat bracket-key params</w:t>
+      </w:r>
+      <w:r>
+        <w:t xml:space="preserve"> </w:t>
+      </w:r>
+      <w:r>
+        <w:t xml:space="preserve">(</w:t>
+      </w:r>
+      <w:r>
+        <w:rPr>
+          <w:rStyle w:val="VerbatimChar"/>
+        </w:rPr>
+        <w:t xml:space="preserve">filters[title][$containsi]=...</w:t>
+      </w:r>
+      <w:r>
+        <w:t xml:space="preserve">), but this repo cannot reach live Strapi to confirm —</w:t>
+      </w:r>
+      <w:r>
+        <w:t xml:space="preserve"> </w:t>
+      </w:r>
+      <w:r>
+        <w:t xml:space="preserve">this is the first empirical check. Quick manual cross-check with curl (admin JWT from</w:t>
+      </w:r>
+      <w:r>
+        <w:t xml:space="preserve"> </w:t>
+      </w:r>
+      <w:r>
+        <w:t xml:space="preserve">devtools → Network → any</w:t>
+      </w:r>
+      <w:r>
+        <w:t xml:space="preserve"> </w:t>
+      </w:r>
+      <w:r>
+        <w:rPr>
+          <w:rStyle w:val="VerbatimChar"/>
+        </w:rPr>
+        <w:t xml:space="preserve">content-manager</w:t>
+      </w:r>
+      <w:r>
+        <w:t xml:space="preserve"> </w:t>
+      </w:r>
+      <w:r>
+        <w:t xml:space="preserve">request →</w:t>
+      </w:r>
+      <w:r>
+        <w:t xml:space="preserve"> </w:t>
+      </w:r>
+      <w:r>
+        <w:rPr>
+          <w:rStyle w:val="VerbatimChar"/>
+        </w:rPr>
+        <w:t xml:space="preserve">Authorization</w:t>
+      </w:r>
+      <w:r>
+        <w:t xml:space="preserve"> </w:t>
+      </w:r>
+      <w:r>
+        <w:t xml:space="preserve">header):</w:t>
+      </w:r>
+      <w:r>
+        <w:t xml:space="preserve"> </w:t>
+      </w:r>
+      <w:r>
+        <w:rPr>
+          <w:rStyle w:val="VerbatimChar"/>
+        </w:rPr>
+        <w:t xml:space="preserve">curl -H "Authorization: Bearer &lt;admin JWT&gt;" "https://v2.hub.icjia-api.cloud/content-manager/collection-types/api::article.article?filters%5Btitle%5D%5B%24containsi%5D=a"</w:t>
+      </w:r>
+      <w:r>
+        <w:t xml:space="preserve"> </w:t>
+      </w:r>
+      <w:r>
+        <w:t xml:space="preserve">→</w:t>
+      </w:r>
+      <w:r>
+        <w:t xml:space="preserve"> </w:t>
+      </w:r>
+      <w:r>
+        <w:rPr>
+          <w:rStyle w:val="VerbatimChar"/>
+        </w:rPr>
+        <w:t xml:space="preserve">200</w:t>
+      </w:r>
+      <w:r>
+        <w:t xml:space="preserve"> </w:t>
+      </w:r>
+      <w:r>
+        <w:t xml:space="preserve">with a</w:t>
+      </w:r>
+      <w:r>
+        <w:t xml:space="preserve"> </w:t>
+      </w:r>
+      <w:r>
+        <w:rPr>
+          <w:rStyle w:val="VerbatimChar"/>
+        </w:rPr>
+        <w:t xml:space="preserve">results</w:t>
+      </w:r>
+      <w:r>
+        <w:t xml:space="preserve"> </w:t>
+      </w:r>
+      <w:r>
+        <w:t xml:space="preserve">array, NOT a</w:t>
+      </w:r>
+      <w:r>
+        <w:t xml:space="preserve"> </w:t>
+      </w:r>
+      <w:r>
+        <w:rPr>
+          <w:rStyle w:val="VerbatimChar"/>
+        </w:rPr>
+        <w:t xml:space="preserve">400</w:t>
+      </w:r>
+      <w:r>
+        <w:t xml:space="preserve"> </w:t>
+      </w:r>
+      <w:r>
+        <w:t xml:space="preserve">("The filters parameter must be an object or</w:t>
+      </w:r>
+      <w:r>
+        <w:t xml:space="preserve"> </w:t>
+      </w:r>
+      <w:r>
+        <w:t xml:space="preserve">an array").</w:t>
       </w:r>
     </w:p>
     <w:p>
@@ -43662,57 +44010,47 @@
         </w:numPr>
       </w:pPr>
       <w:r>
-        <w:t xml:space="preserve">Verify rows land in Strapi under</w:t>
-      </w:r>
-      <w:r>
-        <w:t xml:space="preserve"> </w:t>
-      </w:r>
-      <w:r>
-        <w:rPr>
-          <w:b/>
-          <w:bCs/>
-        </w:rPr>
-        <w:t xml:space="preserve">Review Annotation</w:t>
-      </w:r>
-      <w:r>
-        <w:t xml:space="preserve"> </w:t>
-      </w:r>
-      <w:r>
-        <w:t xml:space="preserve">and are</w:t>
-      </w:r>
-      <w:r>
-        <w:t xml:space="preserve"> </w:t>
-      </w:r>
-      <w:r>
-        <w:rPr>
-          <w:b/>
-          <w:bCs/>
-        </w:rPr>
-        <w:t xml:space="preserve">absent</w:t>
-      </w:r>
-      <w:r>
-        <w:t xml:space="preserve"> </w:t>
-      </w:r>
-      <w:r>
-        <w:t xml:space="preserve">from the</w:t>
-      </w:r>
-      <w:r>
-        <w:t xml:space="preserve"> </w:t>
-      </w:r>
-      <w:r>
-        <w:t xml:space="preserve">public API (</w:t>
-      </w:r>
-      <w:r>
-        <w:rPr>
-          <w:rStyle w:val="VerbatimChar"/>
-        </w:rPr>
-        <w:t xml:space="preserve">/api/review-annotations</w:t>
-      </w:r>
-      <w:r>
-        <w:t xml:space="preserve"> </w:t>
-      </w:r>
-      <w:r>
-        <w:t xml:space="preserve">unauthenticated → 403/404).</w:t>
+        <w:rPr>
+          <w:b/>
+          <w:bCs/>
+        </w:rPr>
+        <w:t xml:space="preserve">Annotations end-to-end:</w:t>
+      </w:r>
+      <w:r>
+        <w:t xml:space="preserve"> </w:t>
+      </w:r>
+      <w:r>
+        <w:t xml:space="preserve">in the Live preview (and on</w:t>
+      </w:r>
+      <w:r>
+        <w:t xml:space="preserve"> </w:t>
+      </w:r>
+      <w:r>
+        <w:rPr>
+          <w:rStyle w:val="VerbatimChar"/>
+        </w:rPr>
+        <w:t xml:space="preserve">/preview/...</w:t>
+      </w:r>
+      <w:r>
+        <w:t xml:space="preserve">), highlight →</w:t>
+      </w:r>
+      <w:r>
+        <w:t xml:space="preserve"> </w:t>
+      </w:r>
+      <w:r>
+        <w:t xml:space="preserve">comment → reply → resolve → delete. Then the cross-user test: annotate as user A,</w:t>
+      </w:r>
+      <w:r>
+        <w:t xml:space="preserve"> </w:t>
+      </w:r>
+      <w:r>
+        <w:t xml:space="preserve">open the same draft as user B on another machine — the thread is there; reply as B;</w:t>
+      </w:r>
+      <w:r>
+        <w:t xml:space="preserve"> </w:t>
+      </w:r>
+      <w:r>
+        <w:t xml:space="preserve">reload as A. (Freshness model is refetch-on-open + after-write; there is no live push.)</w:t>
       </w:r>
     </w:p>
     <w:p>
@@ -43724,7 +44062,57 @@
         </w:numPr>
       </w:pPr>
       <w:r>
-        <w:t xml:space="preserve">Publish + unpublish an article as Editor; confirm on the public Hub side.</w:t>
+        <w:t xml:space="preserve">Verify rows land in Strapi under</w:t>
+      </w:r>
+      <w:r>
+        <w:t xml:space="preserve"> </w:t>
+      </w:r>
+      <w:r>
+        <w:rPr>
+          <w:b/>
+          <w:bCs/>
+        </w:rPr>
+        <w:t xml:space="preserve">Review Annotation</w:t>
+      </w:r>
+      <w:r>
+        <w:t xml:space="preserve"> </w:t>
+      </w:r>
+      <w:r>
+        <w:t xml:space="preserve">and are</w:t>
+      </w:r>
+      <w:r>
+        <w:t xml:space="preserve"> </w:t>
+      </w:r>
+      <w:r>
+        <w:rPr>
+          <w:b/>
+          <w:bCs/>
+        </w:rPr>
+        <w:t xml:space="preserve">absent</w:t>
+      </w:r>
+      <w:r>
+        <w:t xml:space="preserve"> </w:t>
+      </w:r>
+      <w:r>
+        <w:t xml:space="preserve">from the</w:t>
+      </w:r>
+      <w:r>
+        <w:t xml:space="preserve"> </w:t>
+      </w:r>
+      <w:r>
+        <w:t xml:space="preserve">public API (</w:t>
+      </w:r>
+      <w:r>
+        <w:rPr>
+          <w:rStyle w:val="VerbatimChar"/>
+        </w:rPr>
+        <w:t xml:space="preserve">/api/review-annotations</w:t>
+      </w:r>
+      <w:r>
+        <w:t xml:space="preserve"> </w:t>
+      </w:r>
+      <w:r>
+        <w:t xml:space="preserve">unauthenticated → 403/404).</w:t>
       </w:r>
     </w:p>
     <w:p>
@@ -43736,23 +44124,7 @@
         </w:numPr>
       </w:pPr>
       <w:r>
-        <w:rPr>
-          <w:b/>
-          <w:bCs/>
-        </w:rPr>
-        <w:t xml:space="preserve">Request review</w:t>
-      </w:r>
-      <w:r>
-        <w:t xml:space="preserve"> </w:t>
-      </w:r>
-      <w:r>
-        <w:t xml:space="preserve">email: submit the form; confirm the Mailgun send and the rate limit</w:t>
-      </w:r>
-      <w:r>
-        <w:t xml:space="preserve"> </w:t>
-      </w:r>
-      <w:r>
-        <w:t xml:space="preserve">(6th request inside 10 minutes → 429).</w:t>
+        <w:t xml:space="preserve">Publish + unpublish an article as Editor; confirm on the public Hub side.</w:t>
       </w:r>
     </w:p>
     <w:p>
@@ -43768,76 +44140,19 @@
           <w:b/>
           <w:bCs/>
         </w:rPr>
-        <w:t xml:space="preserve">CSP check</w:t>
-      </w:r>
-      <w:r>
-        <w:t xml:space="preserve"> </w:t>
-      </w:r>
-      <w:r>
-        <w:t xml:space="preserve">(README "Action required before launch"): open devtools on the staging</w:t>
-      </w:r>
-      <w:r>
-        <w:t xml:space="preserve"> </w:t>
-      </w:r>
-      <w:r>
-        <w:t xml:space="preserve">deploy — if a Nuxt bootstrap inline script is blocked, add its</w:t>
-      </w:r>
-      <w:r>
-        <w:t xml:space="preserve"> </w:t>
-      </w:r>
-      <w:r>
-        <w:rPr>
-          <w:rStyle w:val="VerbatimChar"/>
-        </w:rPr>
-        <w:t xml:space="preserve">sha256</w:t>
-      </w:r>
-      <w:r>
-        <w:t xml:space="preserve"> </w:t>
-      </w:r>
-      <w:r>
-        <w:t xml:space="preserve">hash to</w:t>
-      </w:r>
-      <w:r>
-        <w:t xml:space="preserve"> </w:t>
-      </w:r>
-      <w:r>
-        <w:rPr>
-          <w:rStyle w:val="VerbatimChar"/>
-        </w:rPr>
-        <w:t xml:space="preserve">script-src</w:t>
-      </w:r>
-      <w:r>
-        <w:t xml:space="preserve"> </w:t>
-      </w:r>
-      <w:r>
-        <w:t xml:space="preserve">in</w:t>
-      </w:r>
-      <w:r>
-        <w:t xml:space="preserve"> </w:t>
-      </w:r>
-      <w:r>
-        <w:rPr>
-          <w:rStyle w:val="VerbatimChar"/>
-        </w:rPr>
-        <w:t xml:space="preserve">public/_headers</w:t>
-      </w:r>
-      <w:r>
-        <w:t xml:space="preserve">. Never add</w:t>
-      </w:r>
-      <w:r>
-        <w:t xml:space="preserve"> </w:t>
-      </w:r>
-      <w:r>
-        <w:rPr>
-          <w:rStyle w:val="VerbatimChar"/>
-        </w:rPr>
-        <w:t xml:space="preserve">'unsafe-inline'</w:t>
-      </w:r>
-      <w:r>
-        <w:t xml:space="preserve"> </w:t>
-      </w:r>
-      <w:r>
-        <w:t xml:space="preserve">to production.</w:t>
+        <w:t xml:space="preserve">Request review</w:t>
+      </w:r>
+      <w:r>
+        <w:t xml:space="preserve"> </w:t>
+      </w:r>
+      <w:r>
+        <w:t xml:space="preserve">email: submit the form; confirm the Mailgun send and the rate limit</w:t>
+      </w:r>
+      <w:r>
+        <w:t xml:space="preserve"> </w:t>
+      </w:r>
+      <w:r>
+        <w:t xml:space="preserve">(6th request inside 10 minutes → 429).</w:t>
       </w:r>
     </w:p>
     <w:p>
@@ -43849,13 +44164,80 @@
         </w:numPr>
       </w:pPr>
       <w:r>
-        <w:t xml:space="preserve">Uploads: add a splash image / main-file PDF via the Media Library path; confirm no</w:t>
-      </w:r>
-      <w:r>
-        <w:t xml:space="preserve"> </w:t>
-      </w:r>
-      <w:r>
-        <w:t xml:space="preserve">base64 ever hits the payload (the write guard throws if it does).</w:t>
+        <w:rPr>
+          <w:b/>
+          <w:bCs/>
+        </w:rPr>
+        <w:t xml:space="preserve">CSP check</w:t>
+      </w:r>
+      <w:r>
+        <w:t xml:space="preserve"> </w:t>
+      </w:r>
+      <w:r>
+        <w:t xml:space="preserve">(README "Action required before launch"): open devtools on the staging</w:t>
+      </w:r>
+      <w:r>
+        <w:t xml:space="preserve"> </w:t>
+      </w:r>
+      <w:r>
+        <w:t xml:space="preserve">deploy — if a Nuxt bootstrap inline script is blocked, add its</w:t>
+      </w:r>
+      <w:r>
+        <w:t xml:space="preserve"> </w:t>
+      </w:r>
+      <w:r>
+        <w:rPr>
+          <w:rStyle w:val="VerbatimChar"/>
+        </w:rPr>
+        <w:t xml:space="preserve">sha256</w:t>
+      </w:r>
+      <w:r>
+        <w:t xml:space="preserve"> </w:t>
+      </w:r>
+      <w:r>
+        <w:t xml:space="preserve">hash to</w:t>
+      </w:r>
+      <w:r>
+        <w:t xml:space="preserve"> </w:t>
+      </w:r>
+      <w:r>
+        <w:rPr>
+          <w:rStyle w:val="VerbatimChar"/>
+        </w:rPr>
+        <w:t xml:space="preserve">script-src</w:t>
+      </w:r>
+      <w:r>
+        <w:t xml:space="preserve"> </w:t>
+      </w:r>
+      <w:r>
+        <w:t xml:space="preserve">in</w:t>
+      </w:r>
+      <w:r>
+        <w:t xml:space="preserve"> </w:t>
+      </w:r>
+      <w:r>
+        <w:rPr>
+          <w:rStyle w:val="VerbatimChar"/>
+        </w:rPr>
+        <w:t xml:space="preserve">public/_headers</w:t>
+      </w:r>
+      <w:r>
+        <w:t xml:space="preserve">. Never add</w:t>
+      </w:r>
+      <w:r>
+        <w:t xml:space="preserve"> </w:t>
+      </w:r>
+      <w:r>
+        <w:rPr>
+          <w:rStyle w:val="VerbatimChar"/>
+        </w:rPr>
+        <w:t xml:space="preserve">'unsafe-inline'</w:t>
+      </w:r>
+      <w:r>
+        <w:t xml:space="preserve"> </w:t>
+      </w:r>
+      <w:r>
+        <w:t xml:space="preserve">to production.</w:t>
       </w:r>
     </w:p>
     <w:p>
@@ -43864,6 +44246,24 @@
         <w:numPr>
           <w:ilvl w:val="0"/>
           <w:numId w:val="1097"/>
+        </w:numPr>
+      </w:pPr>
+      <w:r>
+        <w:t xml:space="preserve">Uploads: add a splash image / main-file PDF via the Media Library path; confirm no</w:t>
+      </w:r>
+      <w:r>
+        <w:t xml:space="preserve"> </w:t>
+      </w:r>
+      <w:r>
+        <w:t xml:space="preserve">base64 ever hits the payload (the write guard throws if it does).</w:t>
+      </w:r>
+    </w:p>
+    <w:p>
+      <w:pPr>
+        <w:pStyle w:val="Compact"/>
+        <w:numPr>
+          <w:ilvl w:val="0"/>
+          <w:numId w:val="1098"/>
         </w:numPr>
       </w:pPr>
       <w:r>
@@ -44541,7 +44941,7 @@
         <w:pStyle w:val="Compact"/>
         <w:numPr>
           <w:ilvl w:val="0"/>
-          <w:numId w:val="1098"/>
+          <w:numId w:val="1099"/>
         </w:numPr>
       </w:pPr>
       <w:r>
@@ -44561,206 +44961,6 @@
       </w:r>
       <w:r>
         <w:t xml:space="preserve">during the window.</w:t>
-      </w:r>
-    </w:p>
-    <w:p>
-      <w:pPr>
-        <w:pStyle w:val="Compact"/>
-        <w:numPr>
-          <w:ilvl w:val="0"/>
-          <w:numId w:val="1098"/>
-        </w:numPr>
-      </w:pPr>
-      <w:r>
-        <w:t xml:space="preserve">Flip the production site's build settings + env per §3 (or merge the production TOML).</w:t>
-      </w:r>
-    </w:p>
-    <w:p>
-      <w:pPr>
-        <w:pStyle w:val="Compact"/>
-        <w:numPr>
-          <w:ilvl w:val="0"/>
-          <w:numId w:val="1098"/>
-        </w:numPr>
-      </w:pPr>
-      <w:r>
-        <w:t xml:space="preserve">Trigger the deploy; watch the Netlify build log — expect</w:t>
-      </w:r>
-      <w:r>
-        <w:t xml:space="preserve"> </w:t>
-      </w:r>
-      <w:r>
-        <w:rPr>
-          <w:b/>
-          <w:bCs/>
-        </w:rPr>
-        <w:t xml:space="preserve">functions deployed</w:t>
-      </w:r>
-      <w:r>
-        <w:t xml:space="preserve"> </w:t>
-      </w:r>
-      <w:r>
-        <w:t xml:space="preserve">(the</w:t>
-      </w:r>
-      <w:r>
-        <w:t xml:space="preserve"> </w:t>
-      </w:r>
-      <w:r>
-        <w:t xml:space="preserve">request-review route), unlike the demo's "No functions deployed".</w:t>
-      </w:r>
-    </w:p>
-    <w:p>
-      <w:pPr>
-        <w:pStyle w:val="Compact"/>
-        <w:numPr>
-          <w:ilvl w:val="0"/>
-          <w:numId w:val="1098"/>
-        </w:numPr>
-      </w:pPr>
-      <w:r>
-        <w:t xml:space="preserve">Run the §2 checklist's top five lines against production (login ×2 roles, real content,</w:t>
-      </w:r>
-      <w:r>
-        <w:t xml:space="preserve"> </w:t>
-      </w:r>
-      <w:r>
-        <w:t xml:space="preserve">one annotation round-trip, one publish round-trip).</w:t>
-      </w:r>
-    </w:p>
-    <w:p>
-      <w:pPr>
-        <w:pStyle w:val="Compact"/>
-        <w:numPr>
-          <w:ilvl w:val="0"/>
-          <w:numId w:val="1098"/>
-        </w:numPr>
-      </w:pPr>
-      <w:r>
-        <w:rPr>
-          <w:b/>
-          <w:bCs/>
-        </w:rPr>
-        <w:t xml:space="preserve">Custom domain, if one is planned</w:t>
-      </w:r>
-      <w:r>
-        <w:t xml:space="preserve"> </w:t>
-      </w:r>
-      <w:r>
-        <w:t xml:space="preserve">(e.g.</w:t>
-      </w:r>
-      <w:r>
-        <w:t xml:space="preserve"> </w:t>
-      </w:r>
-      <w:r>
-        <w:rPr>
-          <w:rStyle w:val="VerbatimChar"/>
-        </w:rPr>
-        <w:t xml:space="preserve">studio.icjia.example</w:t>
-      </w:r>
-      <w:r>
-        <w:t xml:space="preserve">): add it to the</w:t>
-      </w:r>
-      <w:r>
-        <w:t xml:space="preserve"> </w:t>
-      </w:r>
-      <w:r>
-        <w:t xml:space="preserve">production Netlify site, wait for DNS + the auto-provisioned certificate, and re-run the</w:t>
-      </w:r>
-      <w:r>
-        <w:t xml:space="preserve"> </w:t>
-      </w:r>
-      <w:r>
-        <w:t xml:space="preserve">login smoke test from that hostname (it must also be in Strapi's CORS allowlist, §1.6).</w:t>
-      </w:r>
-      <w:r>
-        <w:t xml:space="preserve"> </w:t>
-      </w:r>
-      <w:r>
-        <w:t xml:space="preserve">Do this before announcing — HSTS (</w:t>
-      </w:r>
-      <w:r>
-        <w:rPr>
-          <w:rStyle w:val="VerbatimChar"/>
-        </w:rPr>
-        <w:t xml:space="preserve">max-age=31536000</w:t>
-      </w:r>
-      <w:r>
-        <w:t xml:space="preserve">) makes the hostname hard to walk back.</w:t>
-      </w:r>
-    </w:p>
-    <w:p>
-      <w:pPr>
-        <w:pStyle w:val="Compact"/>
-        <w:numPr>
-          <w:ilvl w:val="0"/>
-          <w:numId w:val="1098"/>
-        </w:numPr>
-      </w:pPr>
-      <w:r>
-        <w:t xml:space="preserve">Point people at the production URL. The demo site can keep running as long as it's useful —</w:t>
-      </w:r>
-      <w:r>
-        <w:t xml:space="preserve"> </w:t>
-      </w:r>
-      <w:r>
-        <w:t xml:space="preserve">it is isolated by design (own site, own flag, zero backend reach).</w:t>
-      </w:r>
-    </w:p>
-    <w:p>
-      <w:pPr>
-        <w:pStyle w:val="Compact"/>
-        <w:numPr>
-          <w:ilvl w:val="0"/>
-          <w:numId w:val="1098"/>
-        </w:numPr>
-      </w:pPr>
-      <w:r>
-        <w:t xml:space="preserve">Tag the release: version + date in</w:t>
-      </w:r>
-      <w:r>
-        <w:t xml:space="preserve"> </w:t>
-      </w:r>
-      <w:r>
-        <w:rPr>
-          <w:rStyle w:val="VerbatimChar"/>
-        </w:rPr>
-        <w:t xml:space="preserve">CHANGELOG.md</w:t>
-      </w:r>
-      <w:r>
-        <w:t xml:space="preserve"> </w:t>
-      </w:r>
-      <w:r>
-        <w:t xml:space="preserve">(per repo convention),</w:t>
-      </w:r>
-      <w:r>
-        <w:t xml:space="preserve"> </w:t>
-      </w:r>
-      <w:r>
-        <w:rPr>
-          <w:rStyle w:val="VerbatimChar"/>
-        </w:rPr>
-        <w:t xml:space="preserve">git tag</w:t>
-      </w:r>
-      <w:r>
-        <w:t xml:space="preserve">.</w:t>
-      </w:r>
-    </w:p>
-    <w:bookmarkEnd w:id="144"/>
-    <w:bookmarkStart w:id="145" w:name="toc58"/>
-    <w:p>
-      <w:pPr>
-        <w:pStyle w:val="Heading3"/>
-      </w:pPr>
-      <w:r>
-        <w:t xml:space="preserve">5. Rollback</w:t>
-      </w:r>
-    </w:p>
-    <w:p>
-      <w:pPr>
-        <w:pStyle w:val="FirstParagraph"/>
-      </w:pPr>
-      <w:r>
-        <w:t xml:space="preserve">The demo is unaffected by anything above, so rollback is only about the production site:</w:t>
       </w:r>
     </w:p>
     <w:p>
@@ -44772,23 +44972,7 @@
         </w:numPr>
       </w:pPr>
       <w:r>
-        <w:t xml:space="preserve">Bad build → Netlify → Deploys →</w:t>
-      </w:r>
-      <w:r>
-        <w:t xml:space="preserve"> </w:t>
-      </w:r>
-      <w:r>
-        <w:rPr>
-          <w:b/>
-          <w:bCs/>
-        </w:rPr>
-        <w:t xml:space="preserve">Publish</w:t>
-      </w:r>
-      <w:r>
-        <w:t xml:space="preserve"> </w:t>
-      </w:r>
-      <w:r>
-        <w:t xml:space="preserve">the previous known-good deploy (instant).</w:t>
+        <w:t xml:space="preserve">Flip the production site's build settings + env per §3 (or merge the production TOML).</w:t>
       </w:r>
     </w:p>
     <w:p>
@@ -44800,7 +44984,29 @@
         </w:numPr>
       </w:pPr>
       <w:r>
-        <w:t xml:space="preserve">Bad config → restore §3 settings; redeploy.</w:t>
+        <w:t xml:space="preserve">Trigger the deploy; watch the Netlify build log — expect</w:t>
+      </w:r>
+      <w:r>
+        <w:t xml:space="preserve"> </w:t>
+      </w:r>
+      <w:r>
+        <w:rPr>
+          <w:b/>
+          <w:bCs/>
+        </w:rPr>
+        <w:t xml:space="preserve">functions deployed</w:t>
+      </w:r>
+      <w:r>
+        <w:t xml:space="preserve"> </w:t>
+      </w:r>
+      <w:r>
+        <w:t xml:space="preserve">(the</w:t>
+      </w:r>
+      <w:r>
+        <w:t xml:space="preserve"> </w:t>
+      </w:r>
+      <w:r>
+        <w:t xml:space="preserve">request-review route), unlike the demo's "No functions deployed".</w:t>
       </w:r>
     </w:p>
     <w:p>
@@ -44812,44 +45018,149 @@
         </w:numPr>
       </w:pPr>
       <w:r>
-        <w:t xml:space="preserve">Strapi-side trouble with</w:t>
-      </w:r>
-      <w:r>
-        <w:t xml:space="preserve"> </w:t>
-      </w:r>
-      <w:r>
-        <w:rPr>
-          <w:rStyle w:val="VerbatimChar"/>
-        </w:rPr>
-        <w:t xml:space="preserve">review-annotation</w:t>
-      </w:r>
-      <w:r>
-        <w:t xml:space="preserve"> </w:t>
-      </w:r>
-      <w:r>
-        <w:t xml:space="preserve">→ the Studio degrades cleanly: annotation</w:t>
-      </w:r>
-      <w:r>
-        <w:t xml:space="preserve"> </w:t>
-      </w:r>
-      <w:r>
-        <w:t xml:space="preserve">calls fail with toasts/console errors but drafts, editing, and publishing are untouched</w:t>
-      </w:r>
-      <w:r>
-        <w:t xml:space="preserve"> </w:t>
-      </w:r>
-      <w:r>
-        <w:t xml:space="preserve">(the adapter is only reached from the preview surfaces).</w:t>
-      </w:r>
-    </w:p>
-    <w:bookmarkEnd w:id="145"/>
-    <w:bookmarkStart w:id="146" w:name="toc59"/>
+        <w:t xml:space="preserve">Run the §2 checklist's top five lines against production (login ×2 roles, real content,</w:t>
+      </w:r>
+      <w:r>
+        <w:t xml:space="preserve"> </w:t>
+      </w:r>
+      <w:r>
+        <w:t xml:space="preserve">one annotation round-trip, one publish round-trip).</w:t>
+      </w:r>
+    </w:p>
+    <w:p>
+      <w:pPr>
+        <w:pStyle w:val="Compact"/>
+        <w:numPr>
+          <w:ilvl w:val="0"/>
+          <w:numId w:val="1099"/>
+        </w:numPr>
+      </w:pPr>
+      <w:r>
+        <w:rPr>
+          <w:b/>
+          <w:bCs/>
+        </w:rPr>
+        <w:t xml:space="preserve">Custom domain, if one is planned</w:t>
+      </w:r>
+      <w:r>
+        <w:t xml:space="preserve"> </w:t>
+      </w:r>
+      <w:r>
+        <w:t xml:space="preserve">(e.g.</w:t>
+      </w:r>
+      <w:r>
+        <w:t xml:space="preserve"> </w:t>
+      </w:r>
+      <w:r>
+        <w:rPr>
+          <w:rStyle w:val="VerbatimChar"/>
+        </w:rPr>
+        <w:t xml:space="preserve">studio.icjia.example</w:t>
+      </w:r>
+      <w:r>
+        <w:t xml:space="preserve">): add it to the</w:t>
+      </w:r>
+      <w:r>
+        <w:t xml:space="preserve"> </w:t>
+      </w:r>
+      <w:r>
+        <w:t xml:space="preserve">production Netlify site, wait for DNS + the auto-provisioned certificate, and re-run the</w:t>
+      </w:r>
+      <w:r>
+        <w:t xml:space="preserve"> </w:t>
+      </w:r>
+      <w:r>
+        <w:t xml:space="preserve">login smoke test from that hostname (it must also be in Strapi's CORS allowlist, §1.6).</w:t>
+      </w:r>
+      <w:r>
+        <w:t xml:space="preserve"> </w:t>
+      </w:r>
+      <w:r>
+        <w:t xml:space="preserve">Do this before announcing — HSTS (</w:t>
+      </w:r>
+      <w:r>
+        <w:rPr>
+          <w:rStyle w:val="VerbatimChar"/>
+        </w:rPr>
+        <w:t xml:space="preserve">max-age=31536000</w:t>
+      </w:r>
+      <w:r>
+        <w:t xml:space="preserve">) makes the hostname hard to walk back.</w:t>
+      </w:r>
+    </w:p>
+    <w:p>
+      <w:pPr>
+        <w:pStyle w:val="Compact"/>
+        <w:numPr>
+          <w:ilvl w:val="0"/>
+          <w:numId w:val="1099"/>
+        </w:numPr>
+      </w:pPr>
+      <w:r>
+        <w:t xml:space="preserve">Point people at the production URL. The demo site can keep running as long as it's useful —</w:t>
+      </w:r>
+      <w:r>
+        <w:t xml:space="preserve"> </w:t>
+      </w:r>
+      <w:r>
+        <w:t xml:space="preserve">it is isolated by design (own site, own flag, zero backend reach).</w:t>
+      </w:r>
+    </w:p>
+    <w:p>
+      <w:pPr>
+        <w:pStyle w:val="Compact"/>
+        <w:numPr>
+          <w:ilvl w:val="0"/>
+          <w:numId w:val="1099"/>
+        </w:numPr>
+      </w:pPr>
+      <w:r>
+        <w:t xml:space="preserve">Tag the release: version + date in</w:t>
+      </w:r>
+      <w:r>
+        <w:t xml:space="preserve"> </w:t>
+      </w:r>
+      <w:r>
+        <w:rPr>
+          <w:rStyle w:val="VerbatimChar"/>
+        </w:rPr>
+        <w:t xml:space="preserve">CHANGELOG.md</w:t>
+      </w:r>
+      <w:r>
+        <w:t xml:space="preserve"> </w:t>
+      </w:r>
+      <w:r>
+        <w:t xml:space="preserve">(per repo convention),</w:t>
+      </w:r>
+      <w:r>
+        <w:t xml:space="preserve"> </w:t>
+      </w:r>
+      <w:r>
+        <w:rPr>
+          <w:rStyle w:val="VerbatimChar"/>
+        </w:rPr>
+        <w:t xml:space="preserve">git tag</w:t>
+      </w:r>
+      <w:r>
+        <w:t xml:space="preserve">.</w:t>
+      </w:r>
+    </w:p>
+    <w:bookmarkEnd w:id="144"/>
+    <w:bookmarkStart w:id="145" w:name="toc58"/>
     <w:p>
       <w:pPr>
         <w:pStyle w:val="Heading3"/>
       </w:pPr>
       <w:r>
-        <w:t xml:space="preserve">6. Known launch-posture decisions (documented, deliberate)</w:t>
+        <w:t xml:space="preserve">5. Rollback</w:t>
+      </w:r>
+    </w:p>
+    <w:p>
+      <w:pPr>
+        <w:pStyle w:val="FirstParagraph"/>
+      </w:pPr>
+      <w:r>
+        <w:t xml:space="preserve">The demo is unaffected by anything above, so rollback is only about the production site:</w:t>
       </w:r>
     </w:p>
     <w:p>
@@ -44861,63 +45172,23 @@
         </w:numPr>
       </w:pPr>
       <w:r>
-        <w:rPr>
-          <w:b/>
-          <w:bCs/>
-        </w:rPr>
-        <w:t xml:space="preserve">Annotation freshness:</w:t>
-      </w:r>
-      <w:r>
-        <w:t xml:space="preserve"> </w:t>
-      </w:r>
-      <w:r>
-        <w:t xml:space="preserve">refetch on preview open and after every write. No polling, no</w:t>
-      </w:r>
-      <w:r>
-        <w:t xml:space="preserve"> </w:t>
-      </w:r>
-      <w:r>
-        <w:t xml:space="preserve">websockets. Two reviewers replying to the</w:t>
-      </w:r>
-      <w:r>
-        <w:t xml:space="preserve"> </w:t>
-      </w:r>
-      <w:r>
-        <w:rPr>
-          <w:i/>
-          <w:iCs/>
-        </w:rPr>
-        <w:t xml:space="preserve">same thread</w:t>
-      </w:r>
-      <w:r>
-        <w:t xml:space="preserve"> </w:t>
-      </w:r>
-      <w:r>
-        <w:t xml:space="preserve">in the same instant is</w:t>
-      </w:r>
-      <w:r>
-        <w:t xml:space="preserve"> </w:t>
-      </w:r>
-      <w:r>
-        <w:t xml:space="preserve">last-write-wins (</w:t>
-      </w:r>
-      <w:r>
-        <w:rPr>
-          <w:rStyle w:val="VerbatimChar"/>
-        </w:rPr>
-        <w:t xml:space="preserve">addComment</w:t>
-      </w:r>
-      <w:r>
-        <w:t xml:space="preserve"> </w:t>
-      </w:r>
-      <w:r>
-        <w:t xml:space="preserve">re-fetches then PUTs the whole row). Fine at ICJIA review</w:t>
-      </w:r>
-      <w:r>
-        <w:t xml:space="preserve"> </w:t>
-      </w:r>
-      <w:r>
-        <w:t xml:space="preserve">volumes; revisit only if it ever bites.</w:t>
+        <w:t xml:space="preserve">Bad build → Netlify → Deploys →</w:t>
+      </w:r>
+      <w:r>
+        <w:t xml:space="preserve"> </w:t>
+      </w:r>
+      <w:r>
+        <w:rPr>
+          <w:b/>
+          <w:bCs/>
+        </w:rPr>
+        <w:t xml:space="preserve">Publish</w:t>
+      </w:r>
+      <w:r>
+        <w:t xml:space="preserve"> </w:t>
+      </w:r>
+      <w:r>
+        <w:t xml:space="preserve">the previous known-good deploy (instant).</w:t>
       </w:r>
     </w:p>
     <w:p>
@@ -44929,50 +45200,7 @@
         </w:numPr>
       </w:pPr>
       <w:r>
-        <w:rPr>
-          <w:b/>
-          <w:bCs/>
-        </w:rPr>
-        <w:t xml:space="preserve">Annotation ids:</w:t>
-      </w:r>
-      <w:r>
-        <w:t xml:space="preserve"> </w:t>
-      </w:r>
-      <w:r>
-        <w:t xml:space="preserve">in production, an annotation's id IS its Strapi</w:t>
-      </w:r>
-      <w:r>
-        <w:t xml:space="preserve"> </w:t>
-      </w:r>
-      <w:r>
-        <w:rPr>
-          <w:rStyle w:val="VerbatimChar"/>
-        </w:rPr>
-        <w:t xml:space="preserve">documentId</w:t>
-      </w:r>
-      <w:r>
-        <w:t xml:space="preserve"> </w:t>
-      </w:r>
-      <w:r>
-        <w:t xml:space="preserve">(the</w:t>
-      </w:r>
-      <w:r>
-        <w:t xml:space="preserve"> </w:t>
-      </w:r>
-      <w:r>
-        <w:t xml:space="preserve">target entry's id lives in</w:t>
-      </w:r>
-      <w:r>
-        <w:t xml:space="preserve"> </w:t>
-      </w:r>
-      <w:r>
-        <w:rPr>
-          <w:rStyle w:val="VerbatimChar"/>
-        </w:rPr>
-        <w:t xml:space="preserve">targetDocumentId</w:t>
-      </w:r>
-      <w:r>
-        <w:t xml:space="preserve">). localStorage (demo) ids are client UUIDs.</w:t>
+        <w:t xml:space="preserve">Bad config → restore §3 settings; redeploy.</w:t>
       </w:r>
     </w:p>
     <w:p>
@@ -44984,29 +45212,44 @@
         </w:numPr>
       </w:pPr>
       <w:r>
-        <w:rPr>
-          <w:b/>
-          <w:bCs/>
-        </w:rPr>
-        <w:t xml:space="preserve">Demo annotations do not migrate.</w:t>
-      </w:r>
-      <w:r>
-        <w:t xml:space="preserve"> </w:t>
-      </w:r>
-      <w:r>
-        <w:t xml:space="preserve">localStorage threads live in individual browsers and</w:t>
-      </w:r>
-      <w:r>
-        <w:t xml:space="preserve"> </w:t>
-      </w:r>
-      <w:r>
-        <w:t xml:space="preserve">reference synthetic demo documentIds; they are demonstration data by definition. Anything</w:t>
-      </w:r>
-      <w:r>
-        <w:t xml:space="preserve"> </w:t>
-      </w:r>
-      <w:r>
-        <w:t xml:space="preserve">worth keeping should be re-entered against real drafts after cutover.</w:t>
+        <w:t xml:space="preserve">Strapi-side trouble with</w:t>
+      </w:r>
+      <w:r>
+        <w:t xml:space="preserve"> </w:t>
+      </w:r>
+      <w:r>
+        <w:rPr>
+          <w:rStyle w:val="VerbatimChar"/>
+        </w:rPr>
+        <w:t xml:space="preserve">review-annotation</w:t>
+      </w:r>
+      <w:r>
+        <w:t xml:space="preserve"> </w:t>
+      </w:r>
+      <w:r>
+        <w:t xml:space="preserve">→ the Studio degrades cleanly: annotation</w:t>
+      </w:r>
+      <w:r>
+        <w:t xml:space="preserve"> </w:t>
+      </w:r>
+      <w:r>
+        <w:t xml:space="preserve">calls fail with toasts/console errors but drafts, editing, and publishing are untouched</w:t>
+      </w:r>
+      <w:r>
+        <w:t xml:space="preserve"> </w:t>
+      </w:r>
+      <w:r>
+        <w:t xml:space="preserve">(the adapter is only reached from the preview surfaces).</w:t>
+      </w:r>
+    </w:p>
+    <w:bookmarkEnd w:id="145"/>
+    <w:bookmarkStart w:id="146" w:name="toc59"/>
+    <w:p>
+      <w:pPr>
+        <w:pStyle w:val="Heading3"/>
+      </w:pPr>
+      <w:r>
+        <w:t xml:space="preserve">6. Known launch-posture decisions (documented, deliberate)</w:t>
       </w:r>
     </w:p>
     <w:p>
@@ -45014,7 +45257,7 @@
         <w:pStyle w:val="Compact"/>
         <w:numPr>
           <w:ilvl w:val="0"/>
-          <w:numId w:val="1100"/>
+          <w:numId w:val="1101"/>
         </w:numPr>
       </w:pPr>
       <w:r>
@@ -45022,19 +45265,59 @@
           <w:b/>
           <w:bCs/>
         </w:rPr>
-        <w:t xml:space="preserve">Coarse RBAC on annotations</w:t>
-      </w:r>
-      <w:r>
-        <w:t xml:space="preserve"> </w:t>
-      </w:r>
-      <w:r>
-        <w:t xml:space="preserve">(any Author/Editor can CRUD all of them at the API level)</w:t>
-      </w:r>
-      <w:r>
-        <w:t xml:space="preserve"> </w:t>
-      </w:r>
-      <w:r>
-        <w:t xml:space="preserve">is intentional for launch; the UI enforces the polite rules.</w:t>
+        <w:t xml:space="preserve">Annotation freshness:</w:t>
+      </w:r>
+      <w:r>
+        <w:t xml:space="preserve"> </w:t>
+      </w:r>
+      <w:r>
+        <w:t xml:space="preserve">refetch on preview open and after every write. No polling, no</w:t>
+      </w:r>
+      <w:r>
+        <w:t xml:space="preserve"> </w:t>
+      </w:r>
+      <w:r>
+        <w:t xml:space="preserve">websockets. Two reviewers replying to the</w:t>
+      </w:r>
+      <w:r>
+        <w:t xml:space="preserve"> </w:t>
+      </w:r>
+      <w:r>
+        <w:rPr>
+          <w:i/>
+          <w:iCs/>
+        </w:rPr>
+        <w:t xml:space="preserve">same thread</w:t>
+      </w:r>
+      <w:r>
+        <w:t xml:space="preserve"> </w:t>
+      </w:r>
+      <w:r>
+        <w:t xml:space="preserve">in the same instant is</w:t>
+      </w:r>
+      <w:r>
+        <w:t xml:space="preserve"> </w:t>
+      </w:r>
+      <w:r>
+        <w:t xml:space="preserve">last-write-wins (</w:t>
+      </w:r>
+      <w:r>
+        <w:rPr>
+          <w:rStyle w:val="VerbatimChar"/>
+        </w:rPr>
+        <w:t xml:space="preserve">addComment</w:t>
+      </w:r>
+      <w:r>
+        <w:t xml:space="preserve"> </w:t>
+      </w:r>
+      <w:r>
+        <w:t xml:space="preserve">re-fetches then PUTs the whole row). Fine at ICJIA review</w:t>
+      </w:r>
+      <w:r>
+        <w:t xml:space="preserve"> </w:t>
+      </w:r>
+      <w:r>
+        <w:t xml:space="preserve">volumes; revisit only if it ever bites.</w:t>
       </w:r>
     </w:p>
     <w:p>
@@ -45042,7 +45325,7 @@
         <w:pStyle w:val="Compact"/>
         <w:numPr>
           <w:ilvl w:val="0"/>
-          <w:numId w:val="1100"/>
+          <w:numId w:val="1101"/>
         </w:numPr>
       </w:pPr>
       <w:r>
@@ -45050,46 +45333,46 @@
           <w:b/>
           <w:bCs/>
         </w:rPr>
-        <w:t xml:space="preserve">Non-blocking polish backlog:</w:t>
-      </w:r>
-      <w:r>
-        <w:t xml:space="preserve"> </w:t>
-      </w:r>
-      <w:r>
-        <w:t xml:space="preserve">the Phase-1 final review logged a hardening follow-up</w:t>
-      </w:r>
-      <w:r>
-        <w:t xml:space="preserve"> </w:t>
-      </w:r>
-      <w:r>
-        <w:t xml:space="preserve">list at the end of</w:t>
-      </w:r>
-      <w:r>
-        <w:t xml:space="preserve"> </w:t>
-      </w:r>
-      <w:r>
-        <w:rPr>
-          <w:rStyle w:val="VerbatimChar"/>
-        </w:rPr>
-        <w:t xml:space="preserve">.superpowers/sdd/progress.md</w:t>
-      </w:r>
-      <w:r>
-        <w:t xml:space="preserve"> </w:t>
-      </w:r>
-      <w:r>
-        <w:t xml:space="preserve">(annotation a11y riders: swatch</w:t>
-      </w:r>
-      <w:r>
-        <w:t xml:space="preserve"> </w:t>
-      </w:r>
-      <w:r>
-        <w:t xml:space="preserve">radiogroup semantics, roving toolbar tabindex, drawer dialog semantics, document-level</w:t>
-      </w:r>
-      <w:r>
-        <w:t xml:space="preserve"> </w:t>
-      </w:r>
-      <w:r>
-        <w:t xml:space="preserve">keyboard-create listener). None block launch; keep them visible.</w:t>
+        <w:t xml:space="preserve">Annotation ids:</w:t>
+      </w:r>
+      <w:r>
+        <w:t xml:space="preserve"> </w:t>
+      </w:r>
+      <w:r>
+        <w:t xml:space="preserve">in production, an annotation's id IS its Strapi</w:t>
+      </w:r>
+      <w:r>
+        <w:t xml:space="preserve"> </w:t>
+      </w:r>
+      <w:r>
+        <w:rPr>
+          <w:rStyle w:val="VerbatimChar"/>
+        </w:rPr>
+        <w:t xml:space="preserve">documentId</w:t>
+      </w:r>
+      <w:r>
+        <w:t xml:space="preserve"> </w:t>
+      </w:r>
+      <w:r>
+        <w:t xml:space="preserve">(the</w:t>
+      </w:r>
+      <w:r>
+        <w:t xml:space="preserve"> </w:t>
+      </w:r>
+      <w:r>
+        <w:t xml:space="preserve">target entry's id lives in</w:t>
+      </w:r>
+      <w:r>
+        <w:t xml:space="preserve"> </w:t>
+      </w:r>
+      <w:r>
+        <w:rPr>
+          <w:rStyle w:val="VerbatimChar"/>
+        </w:rPr>
+        <w:t xml:space="preserve">targetDocumentId</w:t>
+      </w:r>
+      <w:r>
+        <w:t xml:space="preserve">). localStorage (demo) ids are client UUIDs.</w:t>
       </w:r>
     </w:p>
     <w:p>
@@ -45097,7 +45380,124 @@
         <w:pStyle w:val="Compact"/>
         <w:numPr>
           <w:ilvl w:val="0"/>
-          <w:numId w:val="1100"/>
+          <w:numId w:val="1101"/>
+        </w:numPr>
+      </w:pPr>
+      <w:r>
+        <w:rPr>
+          <w:b/>
+          <w:bCs/>
+        </w:rPr>
+        <w:t xml:space="preserve">Demo annotations do not migrate.</w:t>
+      </w:r>
+      <w:r>
+        <w:t xml:space="preserve"> </w:t>
+      </w:r>
+      <w:r>
+        <w:t xml:space="preserve">localStorage threads live in individual browsers and</w:t>
+      </w:r>
+      <w:r>
+        <w:t xml:space="preserve"> </w:t>
+      </w:r>
+      <w:r>
+        <w:t xml:space="preserve">reference synthetic demo documentIds; they are demonstration data by definition. Anything</w:t>
+      </w:r>
+      <w:r>
+        <w:t xml:space="preserve"> </w:t>
+      </w:r>
+      <w:r>
+        <w:t xml:space="preserve">worth keeping should be re-entered against real drafts after cutover.</w:t>
+      </w:r>
+    </w:p>
+    <w:p>
+      <w:pPr>
+        <w:pStyle w:val="Compact"/>
+        <w:numPr>
+          <w:ilvl w:val="0"/>
+          <w:numId w:val="1101"/>
+        </w:numPr>
+      </w:pPr>
+      <w:r>
+        <w:rPr>
+          <w:b/>
+          <w:bCs/>
+        </w:rPr>
+        <w:t xml:space="preserve">Coarse RBAC on annotations</w:t>
+      </w:r>
+      <w:r>
+        <w:t xml:space="preserve"> </w:t>
+      </w:r>
+      <w:r>
+        <w:t xml:space="preserve">(any Author/Editor can CRUD all of them at the API level)</w:t>
+      </w:r>
+      <w:r>
+        <w:t xml:space="preserve"> </w:t>
+      </w:r>
+      <w:r>
+        <w:t xml:space="preserve">is intentional for launch; the UI enforces the polite rules.</w:t>
+      </w:r>
+    </w:p>
+    <w:p>
+      <w:pPr>
+        <w:pStyle w:val="Compact"/>
+        <w:numPr>
+          <w:ilvl w:val="0"/>
+          <w:numId w:val="1101"/>
+        </w:numPr>
+      </w:pPr>
+      <w:r>
+        <w:rPr>
+          <w:b/>
+          <w:bCs/>
+        </w:rPr>
+        <w:t xml:space="preserve">Non-blocking polish backlog:</w:t>
+      </w:r>
+      <w:r>
+        <w:t xml:space="preserve"> </w:t>
+      </w:r>
+      <w:r>
+        <w:t xml:space="preserve">the Phase-1 final review logged a hardening follow-up</w:t>
+      </w:r>
+      <w:r>
+        <w:t xml:space="preserve"> </w:t>
+      </w:r>
+      <w:r>
+        <w:t xml:space="preserve">list at the end of</w:t>
+      </w:r>
+      <w:r>
+        <w:t xml:space="preserve"> </w:t>
+      </w:r>
+      <w:r>
+        <w:rPr>
+          <w:rStyle w:val="VerbatimChar"/>
+        </w:rPr>
+        <w:t xml:space="preserve">.superpowers/sdd/progress.md</w:t>
+      </w:r>
+      <w:r>
+        <w:t xml:space="preserve"> </w:t>
+      </w:r>
+      <w:r>
+        <w:t xml:space="preserve">(annotation a11y riders: swatch</w:t>
+      </w:r>
+      <w:r>
+        <w:t xml:space="preserve"> </w:t>
+      </w:r>
+      <w:r>
+        <w:t xml:space="preserve">radiogroup semantics, roving toolbar tabindex, drawer dialog semantics, document-level</w:t>
+      </w:r>
+      <w:r>
+        <w:t xml:space="preserve"> </w:t>
+      </w:r>
+      <w:r>
+        <w:t xml:space="preserve">keyboard-create listener). None block launch; keep them visible.</w:t>
+      </w:r>
+    </w:p>
+    <w:p>
+      <w:pPr>
+        <w:pStyle w:val="Compact"/>
+        <w:numPr>
+          <w:ilvl w:val="0"/>
+          <w:numId w:val="1101"/>
         </w:numPr>
       </w:pPr>
       <w:r>
@@ -46161,6 +46561,9 @@
     <w:abstractNumId w:val="992"/>
   </w:num>
   <w:num w:numId="1098">
+    <w:abstractNumId w:val="992"/>
+  </w:num>
+  <w:num w:numId="1099">
     <w:abstractNumId w:val="99411"/>
     <w:lvlOverride w:ilvl="0">
       <w:startOverride w:val="1"/>
@@ -46190,10 +46593,10 @@
       <w:startOverride w:val="1"/>
     </w:lvlOverride>
   </w:num>
-  <w:num w:numId="1099">
+  <w:num w:numId="1100">
     <w:abstractNumId w:val="991"/>
   </w:num>
-  <w:num w:numId="1100">
+  <w:num w:numId="1101">
     <w:abstractNumId w:val="991"/>
   </w:num>
 </w:numbering>

</xml_diff>

<commit_message>
release(0.8.0): edit-conflict detection — save-time warn-and-choose, draft-backup synergy — 868 tests / 109 files; docs current; both Word editions regenerated (0 field codes)
</commit_message>
<xml_diff>
--- a/docs/ICJIA-Studio-20-analysis-roadmap-copperhead.docx
+++ b/docs/ICJIA-Studio-20-analysis-roadmap-copperhead.docx
@@ -6603,7 +6603,7 @@
           <w:b/>
           <w:bCs/>
         </w:rPr>
-        <w:t xml:space="preserve">Hub Studio 2.0 · Studio build v0.7.0</w:t>
+        <w:t xml:space="preserve">Hub Studio 2.0 · Studio build v0.8.0</w:t>
       </w:r>
       <w:r>
         <w:t xml:space="preserve"> </w:t>
@@ -14469,6 +14469,51 @@
               <w:pStyle w:val="Compact"/>
             </w:pPr>
             <w:r>
+              <w:t xml:space="preserve">Edit-conflict detection (save-time check, warn and choose)</w:t>
+            </w:r>
+          </w:p>
+        </w:tc>
+        <w:tc>
+          <w:tcPr/>
+          <w:p>
+            <w:pPr>
+              <w:pStyle w:val="Compact"/>
+            </w:pPr>
+            <w:r>
+              <w:t xml:space="preserve">Two editors can no longer silently overwrite each other</w:t>
+            </w:r>
+          </w:p>
+        </w:tc>
+        <w:tc>
+          <w:tcPr/>
+          <w:p>
+            <w:pPr>
+              <w:pStyle w:val="Compact"/>
+            </w:pPr>
+            <w:r>
+              <w:rPr>
+                <w:b/>
+                <w:bCs/>
+              </w:rPr>
+              <w:t xml:space="preserve">Built</w:t>
+            </w:r>
+            <w:r>
+              <w:t xml:space="preserve"> </w:t>
+            </w:r>
+            <w:r>
+              <w:t xml:space="preserve">(v0.8.0)</w:t>
+            </w:r>
+          </w:p>
+        </w:tc>
+      </w:tr>
+      <w:tr>
+        <w:tc>
+          <w:tcPr/>
+          <w:p>
+            <w:pPr>
+              <w:pStyle w:val="Compact"/>
+            </w:pPr>
+            <w:r>
               <w:t xml:space="preserve">"Preview as published" (TOC, end matter, Print)</w:t>
             </w:r>
           </w:p>
@@ -21381,6 +21426,194 @@
           <w:b/>
           <w:bCs/>
         </w:rPr>
+        <w:t xml:space="preserve">2026-07-16 — Edit-conflict detection shipped (v0.8.0).</w:t>
+      </w:r>
+      <w:r>
+        <w:t xml:space="preserve"> </w:t>
+      </w:r>
+      <w:r>
+        <w:t xml:space="preserve">A</w:t>
+      </w:r>
+      <w:r>
+        <w:t xml:space="preserve"> </w:t>
+      </w:r>
+      <w:r>
+        <w:t xml:space="preserve">fields-limited</w:t>
+      </w:r>
+      <w:r>
+        <w:t xml:space="preserve"> </w:t>
+      </w:r>
+      <w:r>
+        <w:rPr>
+          <w:rStyle w:val="VerbatimChar"/>
+        </w:rPr>
+        <w:t xml:space="preserve">updatedAt</w:t>
+      </w:r>
+      <w:r>
+        <w:t xml:space="preserve"> </w:t>
+      </w:r>
+      <w:r>
+        <w:t xml:space="preserve">check now runs before every edit-mode save on all three</w:t>
+      </w:r>
+      <w:r>
+        <w:t xml:space="preserve"> </w:t>
+      </w:r>
+      <w:r>
+        <w:t xml:space="preserve">content forms; a genuine conflict raises a</w:t>
+      </w:r>
+      <w:r>
+        <w:t xml:space="preserve"> </w:t>
+      </w:r>
+      <w:r>
+        <w:rPr>
+          <w:rStyle w:val="VerbatimChar"/>
+        </w:rPr>
+        <w:t xml:space="preserve">role="alert"</w:t>
+      </w:r>
+      <w:r>
+        <w:t xml:space="preserve"> </w:t>
+      </w:r>
+      <w:r>
+        <w:t xml:space="preserve">banner — "This draft was</w:t>
+      </w:r>
+      <w:r>
+        <w:t xml:space="preserve"> </w:t>
+      </w:r>
+      <w:r>
+        <w:t xml:space="preserve">changed by someone else while you were editing (their save: ⟨time⟩)." — offering</w:t>
+      </w:r>
+      <w:r>
+        <w:t xml:space="preserve"> </w:t>
+      </w:r>
+      <w:r>
+        <w:rPr>
+          <w:b/>
+          <w:bCs/>
+        </w:rPr>
+        <w:t xml:space="preserve">Save anyway</w:t>
+      </w:r>
+      <w:r>
+        <w:t xml:space="preserve"> </w:t>
+      </w:r>
+      <w:r>
+        <w:t xml:space="preserve">or</w:t>
+      </w:r>
+      <w:r>
+        <w:t xml:space="preserve"> </w:t>
+      </w:r>
+      <w:r>
+        <w:rPr>
+          <w:b/>
+          <w:bCs/>
+        </w:rPr>
+        <w:t xml:space="preserve">Load their version</w:t>
+      </w:r>
+      <w:r>
+        <w:t xml:space="preserve">. Load-theirs snapshots the author's own edits</w:t>
+      </w:r>
+      <w:r>
+        <w:t xml:space="preserve"> </w:t>
+      </w:r>
+      <w:r>
+        <w:t xml:space="preserve">to the local draft backup</w:t>
+      </w:r>
+      <w:r>
+        <w:t xml:space="preserve"> </w:t>
+      </w:r>
+      <w:r>
+        <w:rPr>
+          <w:i/>
+          <w:iCs/>
+        </w:rPr>
+        <w:t xml:space="preserve">first</w:t>
+      </w:r>
+      <w:r>
+        <w:t xml:space="preserve">, so the v0.6.0 restore banner can hand them back</w:t>
+      </w:r>
+      <w:r>
+        <w:t xml:space="preserve"> </w:t>
+      </w:r>
+      <w:r>
+        <w:t xml:space="preserve">afterward — the two features now work as one system, including a restore-vs-Load-theirs</w:t>
+      </w:r>
+      <w:r>
+        <w:t xml:space="preserve"> </w:t>
+      </w:r>
+      <w:r>
+        <w:t xml:space="preserve">race the whole-branch final review found and closed the same way as the original</w:t>
+      </w:r>
+      <w:r>
+        <w:t xml:space="preserve"> </w:t>
+      </w:r>
+      <w:r>
+        <w:t xml:space="preserve">Save-anyway race, plus a stamp reseed on Restore and a publish/unpublish refresh that</w:t>
+      </w:r>
+      <w:r>
+        <w:t xml:space="preserve"> </w:t>
+      </w:r>
+      <w:r>
+        <w:t xml:space="preserve">close two more false-conflict gaps. Fails open on any check error; the check runs the</w:t>
+      </w:r>
+      <w:r>
+        <w:t xml:space="preserve"> </w:t>
+      </w:r>
+      <w:r>
+        <w:t xml:space="preserve">same logic in the public demo against its in-memory store's stamps (the demo store is</w:t>
+      </w:r>
+      <w:r>
+        <w:t xml:space="preserve"> </w:t>
+      </w:r>
+      <w:r>
+        <w:t xml:space="preserve">per-tab, so reproducing a genuine collision is a two-browser staging-rehearsal exercise,</w:t>
+      </w:r>
+      <w:r>
+        <w:t xml:space="preserve"> </w:t>
+      </w:r>
+      <w:r>
+        <w:t xml:space="preserve">not a two-demo-tab one). Built test-first over five reviewed tasks with per-task</w:t>
+      </w:r>
+      <w:r>
+        <w:t xml:space="preserve"> </w:t>
+      </w:r>
+      <w:r>
+        <w:t xml:space="preserve">adversarial review plus a whole-branch final review (two reviewer-found Critical races</w:t>
+      </w:r>
+      <w:r>
+        <w:t xml:space="preserve"> </w:t>
+      </w:r>
+      <w:r>
+        <w:t xml:space="preserve">closed with layered tests), then verified live in the running app (clean saves,</w:t>
+      </w:r>
+      <w:r>
+        <w:t xml:space="preserve"> </w:t>
+      </w:r>
+      <w:r>
+        <w:t xml:space="preserve">no false conflict after unpublish, restore-then-save with the reseeded stamp).</w:t>
+      </w:r>
+      <w:r>
+        <w:t xml:space="preserve"> </w:t>
+      </w:r>
+      <w:r>
+        <w:rPr>
+          <w:b/>
+          <w:bCs/>
+        </w:rPr>
+        <w:t xml:space="preserve">868 automated tests / 109 files.</w:t>
+      </w:r>
+    </w:p>
+    <w:p>
+      <w:pPr>
+        <w:pStyle w:val="Compact"/>
+        <w:numPr>
+          <w:ilvl w:val="0"/>
+          <w:numId w:val="1030"/>
+        </w:numPr>
+      </w:pPr>
+      <w:r>
+        <w:rPr>
+          <w:b/>
+          <w:bCs/>
+        </w:rPr>
         <w:t xml:space="preserve">2026-07-16 — Title search shipped (v0.7.0).</w:t>
       </w:r>
       <w:r>
@@ -21943,7 +22176,7 @@
           <w:b/>
           <w:bCs/>
         </w:rPr>
-        <w:t xml:space="preserve">Hub Studio 2.0 · Studio build v0.7.0</w:t>
+        <w:t xml:space="preserve">Hub Studio 2.0 · Studio build v0.8.0</w:t>
       </w:r>
       <w:r>
         <w:t xml:space="preserve"> </w:t>
@@ -43791,214 +44024,81 @@
           <w:b/>
           <w:bCs/>
         </w:rPr>
-        <w:t xml:space="preserve">Filters wire format:</w:t>
-      </w:r>
-      <w:r>
-        <w:t xml:space="preserve"> </w:t>
-      </w:r>
-      <w:r>
-        <w:t xml:space="preserve">use the Type filter and the title search box and confirm each</w:t>
-      </w:r>
-      <w:r>
-        <w:t xml:space="preserve"> </w:t>
-      </w:r>
-      <w:r>
-        <w:t xml:space="preserve">returns real (filtered) results, not an error toast/blank list. These — plus</w:t>
-      </w:r>
-      <w:r>
-        <w:t xml:space="preserve"> </w:t>
-      </w:r>
-      <w:r>
-        <w:rPr>
-          <w:rStyle w:val="VerbatimChar"/>
-        </w:rPr>
-        <w:t xml:space="preserve">studio-profile</w:t>
-      </w:r>
-      <w:r>
-        <w:t xml:space="preserve">'s first-login author-email lookup — are the first live-mode calls to</w:t>
-      </w:r>
-      <w:r>
-        <w:t xml:space="preserve"> </w:t>
-      </w:r>
-      <w:r>
-        <w:t xml:space="preserve">exercise</w:t>
-      </w:r>
-      <w:r>
-        <w:t xml:space="preserve"> </w:t>
-      </w:r>
-      <w:r>
-        <w:rPr>
-          <w:rStyle w:val="VerbatimChar"/>
-        </w:rPr>
-        <w:t xml:space="preserve">repository.ts</w:t>
-      </w:r>
-      <w:r>
-        <w:t xml:space="preserve">'s filter query params; a prior bug sent them as a JSON-stringified</w:t>
-      </w:r>
-      <w:r>
-        <w:t xml:space="preserve"> </w:t>
-      </w:r>
-      <w:r>
-        <w:rPr>
-          <w:rStyle w:val="VerbatimChar"/>
-        </w:rPr>
-        <w:t xml:space="preserve">filters</w:t>
-      </w:r>
-      <w:r>
-        <w:t xml:space="preserve"> </w:t>
-      </w:r>
-      <w:r>
-        <w:t xml:space="preserve">value (</w:t>
-      </w:r>
-      <w:r>
-        <w:rPr>
-          <w:rStyle w:val="VerbatimChar"/>
-        </w:rPr>
-        <w:t xml:space="preserve">ofetch</w:t>
-      </w:r>
-      <w:r>
-        <w:t xml:space="preserve">/</w:t>
-      </w:r>
-      <w:r>
-        <w:rPr>
-          <w:rStyle w:val="VerbatimChar"/>
-        </w:rPr>
-        <w:t xml:space="preserve">ufo</w:t>
-      </w:r>
-      <w:r>
-        <w:t xml:space="preserve"> </w:t>
-      </w:r>
-      <w:r>
-        <w:t xml:space="preserve">has no custom query serializer for nested objects), which</w:t>
-      </w:r>
-      <w:r>
-        <w:t xml:space="preserve"> </w:t>
-      </w:r>
-      <w:r>
-        <w:t xml:space="preserve">Strapi 5's qs-based parser rejects. Fixed to flat bracket-key params</w:t>
-      </w:r>
-      <w:r>
-        <w:t xml:space="preserve"> </w:t>
-      </w:r>
-      <w:r>
-        <w:t xml:space="preserve">(</w:t>
-      </w:r>
-      <w:r>
-        <w:rPr>
-          <w:rStyle w:val="VerbatimChar"/>
-        </w:rPr>
-        <w:t xml:space="preserve">filters[title][$containsi]=...</w:t>
-      </w:r>
-      <w:r>
-        <w:t xml:space="preserve">), but this repo cannot reach live Strapi to confirm —</w:t>
-      </w:r>
-      <w:r>
-        <w:t xml:space="preserve"> </w:t>
-      </w:r>
-      <w:r>
-        <w:t xml:space="preserve">this is the first empirical check. Quick manual cross-check with curl (admin JWT from</w:t>
-      </w:r>
-      <w:r>
-        <w:t xml:space="preserve"> </w:t>
-      </w:r>
-      <w:r>
-        <w:t xml:space="preserve">devtools → Network → any</w:t>
-      </w:r>
-      <w:r>
-        <w:t xml:space="preserve"> </w:t>
-      </w:r>
-      <w:r>
-        <w:rPr>
-          <w:rStyle w:val="VerbatimChar"/>
-        </w:rPr>
-        <w:t xml:space="preserve">content-manager</w:t>
-      </w:r>
-      <w:r>
-        <w:t xml:space="preserve"> </w:t>
-      </w:r>
-      <w:r>
-        <w:t xml:space="preserve">request →</w:t>
-      </w:r>
-      <w:r>
-        <w:t xml:space="preserve"> </w:t>
-      </w:r>
-      <w:r>
-        <w:rPr>
-          <w:rStyle w:val="VerbatimChar"/>
-        </w:rPr>
-        <w:t xml:space="preserve">Authorization</w:t>
-      </w:r>
-      <w:r>
-        <w:t xml:space="preserve"> </w:t>
-      </w:r>
-      <w:r>
-        <w:t xml:space="preserve">header):</w:t>
-      </w:r>
-      <w:r>
-        <w:t xml:space="preserve"> </w:t>
-      </w:r>
-      <w:r>
-        <w:rPr>
-          <w:rStyle w:val="VerbatimChar"/>
-        </w:rPr>
-        <w:t xml:space="preserve">curl -H "Authorization: Bearer &lt;admin JWT&gt;" "https://v2.hub.icjia-api.cloud/content-manager/collection-types/api::article.article?filters%5Btitle%5D%5B%24containsi%5D=a"</w:t>
-      </w:r>
-      <w:r>
-        <w:t xml:space="preserve"> </w:t>
-      </w:r>
-      <w:r>
-        <w:t xml:space="preserve">→</w:t>
-      </w:r>
-      <w:r>
-        <w:t xml:space="preserve"> </w:t>
-      </w:r>
-      <w:r>
-        <w:rPr>
-          <w:rStyle w:val="VerbatimChar"/>
-        </w:rPr>
-        <w:t xml:space="preserve">200</w:t>
-      </w:r>
-      <w:r>
-        <w:t xml:space="preserve"> </w:t>
-      </w:r>
-      <w:r>
-        <w:t xml:space="preserve">with a</w:t>
-      </w:r>
-      <w:r>
-        <w:t xml:space="preserve"> </w:t>
-      </w:r>
-      <w:r>
-        <w:rPr>
-          <w:rStyle w:val="VerbatimChar"/>
-        </w:rPr>
-        <w:t xml:space="preserve">results</w:t>
-      </w:r>
-      <w:r>
-        <w:t xml:space="preserve"> </w:t>
-      </w:r>
-      <w:r>
-        <w:t xml:space="preserve">array, NOT a</w:t>
-      </w:r>
-      <w:r>
-        <w:t xml:space="preserve"> </w:t>
-      </w:r>
-      <w:r>
-        <w:rPr>
-          <w:rStyle w:val="VerbatimChar"/>
-        </w:rPr>
-        <w:t xml:space="preserve">400</w:t>
-      </w:r>
-      <w:r>
-        <w:t xml:space="preserve"> </w:t>
-      </w:r>
-      <w:r>
-        <w:t xml:space="preserve">("The filters parameter must be an object or</w:t>
-      </w:r>
-      <w:r>
-        <w:t xml:space="preserve"> </w:t>
-      </w:r>
-      <w:r>
-        <w:t xml:space="preserve">an array").</w:t>
+        <w:t xml:space="preserve">Edit-conflict round-trip (two browsers):</w:t>
+      </w:r>
+      <w:r>
+        <w:t xml:space="preserve"> </w:t>
+      </w:r>
+      <w:r>
+        <w:t xml:space="preserve">open the SAME draft for edit as user A</w:t>
+      </w:r>
+      <w:r>
+        <w:t xml:space="preserve"> </w:t>
+      </w:r>
+      <w:r>
+        <w:t xml:space="preserve">(one browser) and user B (a second browser or machine). Save as A first, then save as</w:t>
+      </w:r>
+      <w:r>
+        <w:t xml:space="preserve"> </w:t>
+      </w:r>
+      <w:r>
+        <w:t xml:space="preserve">B — confirm B's save is stopped by the conflict banner ("This draft was changed by</w:t>
+      </w:r>
+      <w:r>
+        <w:t xml:space="preserve"> </w:t>
+      </w:r>
+      <w:r>
+        <w:t xml:space="preserve">someone else while you were editing…") showing A's save time. Exercise both choices</w:t>
+      </w:r>
+      <w:r>
+        <w:t xml:space="preserve"> </w:t>
+      </w:r>
+      <w:r>
+        <w:t xml:space="preserve">from B's side on repeat attempts:</w:t>
+      </w:r>
+      <w:r>
+        <w:t xml:space="preserve"> </w:t>
+      </w:r>
+      <w:r>
+        <w:rPr>
+          <w:b/>
+          <w:bCs/>
+        </w:rPr>
+        <w:t xml:space="preserve">Save anyway</w:t>
+      </w:r>
+      <w:r>
+        <w:t xml:space="preserve"> </w:t>
+      </w:r>
+      <w:r>
+        <w:t xml:space="preserve">(confirm A's edit is overwritten in</w:t>
+      </w:r>
+      <w:r>
+        <w:t xml:space="preserve"> </w:t>
+      </w:r>
+      <w:r>
+        <w:t xml:space="preserve">Strapi) and</w:t>
+      </w:r>
+      <w:r>
+        <w:t xml:space="preserve"> </w:t>
+      </w:r>
+      <w:r>
+        <w:rPr>
+          <w:b/>
+          <w:bCs/>
+        </w:rPr>
+        <w:t xml:space="preserve">Load their version</w:t>
+      </w:r>
+      <w:r>
+        <w:t xml:space="preserve"> </w:t>
+      </w:r>
+      <w:r>
+        <w:t xml:space="preserve">(confirm B's own in-progress edits reappear via the</w:t>
+      </w:r>
+      <w:r>
+        <w:t xml:space="preserve"> </w:t>
+      </w:r>
+      <w:r>
+        <w:t xml:space="preserve">restore banner afterward, and A's content is now in B's form).</w:t>
       </w:r>
     </w:p>
     <w:p>
@@ -44014,43 +44114,214 @@
           <w:b/>
           <w:bCs/>
         </w:rPr>
-        <w:t xml:space="preserve">Annotations end-to-end:</w:t>
-      </w:r>
-      <w:r>
-        <w:t xml:space="preserve"> </w:t>
-      </w:r>
-      <w:r>
-        <w:t xml:space="preserve">in the Live preview (and on</w:t>
-      </w:r>
-      <w:r>
-        <w:t xml:space="preserve"> </w:t>
-      </w:r>
-      <w:r>
-        <w:rPr>
-          <w:rStyle w:val="VerbatimChar"/>
-        </w:rPr>
-        <w:t xml:space="preserve">/preview/...</w:t>
-      </w:r>
-      <w:r>
-        <w:t xml:space="preserve">), highlight →</w:t>
-      </w:r>
-      <w:r>
-        <w:t xml:space="preserve"> </w:t>
-      </w:r>
-      <w:r>
-        <w:t xml:space="preserve">comment → reply → resolve → delete. Then the cross-user test: annotate as user A,</w:t>
-      </w:r>
-      <w:r>
-        <w:t xml:space="preserve"> </w:t>
-      </w:r>
-      <w:r>
-        <w:t xml:space="preserve">open the same draft as user B on another machine — the thread is there; reply as B;</w:t>
-      </w:r>
-      <w:r>
-        <w:t xml:space="preserve"> </w:t>
-      </w:r>
-      <w:r>
-        <w:t xml:space="preserve">reload as A. (Freshness model is refetch-on-open + after-write; there is no live push.)</w:t>
+        <w:t xml:space="preserve">Filters wire format:</w:t>
+      </w:r>
+      <w:r>
+        <w:t xml:space="preserve"> </w:t>
+      </w:r>
+      <w:r>
+        <w:t xml:space="preserve">use the Type filter and the title search box and confirm each</w:t>
+      </w:r>
+      <w:r>
+        <w:t xml:space="preserve"> </w:t>
+      </w:r>
+      <w:r>
+        <w:t xml:space="preserve">returns real (filtered) results, not an error toast/blank list. These — plus</w:t>
+      </w:r>
+      <w:r>
+        <w:t xml:space="preserve"> </w:t>
+      </w:r>
+      <w:r>
+        <w:rPr>
+          <w:rStyle w:val="VerbatimChar"/>
+        </w:rPr>
+        <w:t xml:space="preserve">studio-profile</w:t>
+      </w:r>
+      <w:r>
+        <w:t xml:space="preserve">'s first-login author-email lookup — are the first live-mode calls to</w:t>
+      </w:r>
+      <w:r>
+        <w:t xml:space="preserve"> </w:t>
+      </w:r>
+      <w:r>
+        <w:t xml:space="preserve">exercise</w:t>
+      </w:r>
+      <w:r>
+        <w:t xml:space="preserve"> </w:t>
+      </w:r>
+      <w:r>
+        <w:rPr>
+          <w:rStyle w:val="VerbatimChar"/>
+        </w:rPr>
+        <w:t xml:space="preserve">repository.ts</w:t>
+      </w:r>
+      <w:r>
+        <w:t xml:space="preserve">'s filter query params; a prior bug sent them as a JSON-stringified</w:t>
+      </w:r>
+      <w:r>
+        <w:t xml:space="preserve"> </w:t>
+      </w:r>
+      <w:r>
+        <w:rPr>
+          <w:rStyle w:val="VerbatimChar"/>
+        </w:rPr>
+        <w:t xml:space="preserve">filters</w:t>
+      </w:r>
+      <w:r>
+        <w:t xml:space="preserve"> </w:t>
+      </w:r>
+      <w:r>
+        <w:t xml:space="preserve">value (</w:t>
+      </w:r>
+      <w:r>
+        <w:rPr>
+          <w:rStyle w:val="VerbatimChar"/>
+        </w:rPr>
+        <w:t xml:space="preserve">ofetch</w:t>
+      </w:r>
+      <w:r>
+        <w:t xml:space="preserve">/</w:t>
+      </w:r>
+      <w:r>
+        <w:rPr>
+          <w:rStyle w:val="VerbatimChar"/>
+        </w:rPr>
+        <w:t xml:space="preserve">ufo</w:t>
+      </w:r>
+      <w:r>
+        <w:t xml:space="preserve"> </w:t>
+      </w:r>
+      <w:r>
+        <w:t xml:space="preserve">has no custom query serializer for nested objects), which</w:t>
+      </w:r>
+      <w:r>
+        <w:t xml:space="preserve"> </w:t>
+      </w:r>
+      <w:r>
+        <w:t xml:space="preserve">Strapi 5's qs-based parser rejects. Fixed to flat bracket-key params</w:t>
+      </w:r>
+      <w:r>
+        <w:t xml:space="preserve"> </w:t>
+      </w:r>
+      <w:r>
+        <w:t xml:space="preserve">(</w:t>
+      </w:r>
+      <w:r>
+        <w:rPr>
+          <w:rStyle w:val="VerbatimChar"/>
+        </w:rPr>
+        <w:t xml:space="preserve">filters[title][$containsi]=...</w:t>
+      </w:r>
+      <w:r>
+        <w:t xml:space="preserve">), but this repo cannot reach live Strapi to confirm —</w:t>
+      </w:r>
+      <w:r>
+        <w:t xml:space="preserve"> </w:t>
+      </w:r>
+      <w:r>
+        <w:t xml:space="preserve">this is the first empirical check. Quick manual cross-check with curl (admin JWT from</w:t>
+      </w:r>
+      <w:r>
+        <w:t xml:space="preserve"> </w:t>
+      </w:r>
+      <w:r>
+        <w:t xml:space="preserve">devtools → Network → any</w:t>
+      </w:r>
+      <w:r>
+        <w:t xml:space="preserve"> </w:t>
+      </w:r>
+      <w:r>
+        <w:rPr>
+          <w:rStyle w:val="VerbatimChar"/>
+        </w:rPr>
+        <w:t xml:space="preserve">content-manager</w:t>
+      </w:r>
+      <w:r>
+        <w:t xml:space="preserve"> </w:t>
+      </w:r>
+      <w:r>
+        <w:t xml:space="preserve">request →</w:t>
+      </w:r>
+      <w:r>
+        <w:t xml:space="preserve"> </w:t>
+      </w:r>
+      <w:r>
+        <w:rPr>
+          <w:rStyle w:val="VerbatimChar"/>
+        </w:rPr>
+        <w:t xml:space="preserve">Authorization</w:t>
+      </w:r>
+      <w:r>
+        <w:t xml:space="preserve"> </w:t>
+      </w:r>
+      <w:r>
+        <w:t xml:space="preserve">header):</w:t>
+      </w:r>
+      <w:r>
+        <w:t xml:space="preserve"> </w:t>
+      </w:r>
+      <w:r>
+        <w:rPr>
+          <w:rStyle w:val="VerbatimChar"/>
+        </w:rPr>
+        <w:t xml:space="preserve">curl -H "Authorization: Bearer &lt;admin JWT&gt;" "https://v2.hub.icjia-api.cloud/content-manager/collection-types/api::article.article?filters%5Btitle%5D%5B%24containsi%5D=a"</w:t>
+      </w:r>
+      <w:r>
+        <w:t xml:space="preserve"> </w:t>
+      </w:r>
+      <w:r>
+        <w:t xml:space="preserve">→</w:t>
+      </w:r>
+      <w:r>
+        <w:t xml:space="preserve"> </w:t>
+      </w:r>
+      <w:r>
+        <w:rPr>
+          <w:rStyle w:val="VerbatimChar"/>
+        </w:rPr>
+        <w:t xml:space="preserve">200</w:t>
+      </w:r>
+      <w:r>
+        <w:t xml:space="preserve"> </w:t>
+      </w:r>
+      <w:r>
+        <w:t xml:space="preserve">with a</w:t>
+      </w:r>
+      <w:r>
+        <w:t xml:space="preserve"> </w:t>
+      </w:r>
+      <w:r>
+        <w:rPr>
+          <w:rStyle w:val="VerbatimChar"/>
+        </w:rPr>
+        <w:t xml:space="preserve">results</w:t>
+      </w:r>
+      <w:r>
+        <w:t xml:space="preserve"> </w:t>
+      </w:r>
+      <w:r>
+        <w:t xml:space="preserve">array, NOT a</w:t>
+      </w:r>
+      <w:r>
+        <w:t xml:space="preserve"> </w:t>
+      </w:r>
+      <w:r>
+        <w:rPr>
+          <w:rStyle w:val="VerbatimChar"/>
+        </w:rPr>
+        <w:t xml:space="preserve">400</w:t>
+      </w:r>
+      <w:r>
+        <w:t xml:space="preserve"> </w:t>
+      </w:r>
+      <w:r>
+        <w:t xml:space="preserve">("The filters parameter must be an object or</w:t>
+      </w:r>
+      <w:r>
+        <w:t xml:space="preserve"> </w:t>
+      </w:r>
+      <w:r>
+        <w:t xml:space="preserve">an array").</w:t>
       </w:r>
     </w:p>
     <w:p>
@@ -44062,57 +44333,47 @@
         </w:numPr>
       </w:pPr>
       <w:r>
-        <w:t xml:space="preserve">Verify rows land in Strapi under</w:t>
-      </w:r>
-      <w:r>
-        <w:t xml:space="preserve"> </w:t>
-      </w:r>
-      <w:r>
-        <w:rPr>
-          <w:b/>
-          <w:bCs/>
-        </w:rPr>
-        <w:t xml:space="preserve">Review Annotation</w:t>
-      </w:r>
-      <w:r>
-        <w:t xml:space="preserve"> </w:t>
-      </w:r>
-      <w:r>
-        <w:t xml:space="preserve">and are</w:t>
-      </w:r>
-      <w:r>
-        <w:t xml:space="preserve"> </w:t>
-      </w:r>
-      <w:r>
-        <w:rPr>
-          <w:b/>
-          <w:bCs/>
-        </w:rPr>
-        <w:t xml:space="preserve">absent</w:t>
-      </w:r>
-      <w:r>
-        <w:t xml:space="preserve"> </w:t>
-      </w:r>
-      <w:r>
-        <w:t xml:space="preserve">from the</w:t>
-      </w:r>
-      <w:r>
-        <w:t xml:space="preserve"> </w:t>
-      </w:r>
-      <w:r>
-        <w:t xml:space="preserve">public API (</w:t>
-      </w:r>
-      <w:r>
-        <w:rPr>
-          <w:rStyle w:val="VerbatimChar"/>
-        </w:rPr>
-        <w:t xml:space="preserve">/api/review-annotations</w:t>
-      </w:r>
-      <w:r>
-        <w:t xml:space="preserve"> </w:t>
-      </w:r>
-      <w:r>
-        <w:t xml:space="preserve">unauthenticated → 403/404).</w:t>
+        <w:rPr>
+          <w:b/>
+          <w:bCs/>
+        </w:rPr>
+        <w:t xml:space="preserve">Annotations end-to-end:</w:t>
+      </w:r>
+      <w:r>
+        <w:t xml:space="preserve"> </w:t>
+      </w:r>
+      <w:r>
+        <w:t xml:space="preserve">in the Live preview (and on</w:t>
+      </w:r>
+      <w:r>
+        <w:t xml:space="preserve"> </w:t>
+      </w:r>
+      <w:r>
+        <w:rPr>
+          <w:rStyle w:val="VerbatimChar"/>
+        </w:rPr>
+        <w:t xml:space="preserve">/preview/...</w:t>
+      </w:r>
+      <w:r>
+        <w:t xml:space="preserve">), highlight →</w:t>
+      </w:r>
+      <w:r>
+        <w:t xml:space="preserve"> </w:t>
+      </w:r>
+      <w:r>
+        <w:t xml:space="preserve">comment → reply → resolve → delete. Then the cross-user test: annotate as user A,</w:t>
+      </w:r>
+      <w:r>
+        <w:t xml:space="preserve"> </w:t>
+      </w:r>
+      <w:r>
+        <w:t xml:space="preserve">open the same draft as user B on another machine — the thread is there; reply as B;</w:t>
+      </w:r>
+      <w:r>
+        <w:t xml:space="preserve"> </w:t>
+      </w:r>
+      <w:r>
+        <w:t xml:space="preserve">reload as A. (Freshness model is refetch-on-open + after-write; there is no live push.)</w:t>
       </w:r>
     </w:p>
     <w:p>
@@ -44124,7 +44385,57 @@
         </w:numPr>
       </w:pPr>
       <w:r>
-        <w:t xml:space="preserve">Publish + unpublish an article as Editor; confirm on the public Hub side.</w:t>
+        <w:t xml:space="preserve">Verify rows land in Strapi under</w:t>
+      </w:r>
+      <w:r>
+        <w:t xml:space="preserve"> </w:t>
+      </w:r>
+      <w:r>
+        <w:rPr>
+          <w:b/>
+          <w:bCs/>
+        </w:rPr>
+        <w:t xml:space="preserve">Review Annotation</w:t>
+      </w:r>
+      <w:r>
+        <w:t xml:space="preserve"> </w:t>
+      </w:r>
+      <w:r>
+        <w:t xml:space="preserve">and are</w:t>
+      </w:r>
+      <w:r>
+        <w:t xml:space="preserve"> </w:t>
+      </w:r>
+      <w:r>
+        <w:rPr>
+          <w:b/>
+          <w:bCs/>
+        </w:rPr>
+        <w:t xml:space="preserve">absent</w:t>
+      </w:r>
+      <w:r>
+        <w:t xml:space="preserve"> </w:t>
+      </w:r>
+      <w:r>
+        <w:t xml:space="preserve">from the</w:t>
+      </w:r>
+      <w:r>
+        <w:t xml:space="preserve"> </w:t>
+      </w:r>
+      <w:r>
+        <w:t xml:space="preserve">public API (</w:t>
+      </w:r>
+      <w:r>
+        <w:rPr>
+          <w:rStyle w:val="VerbatimChar"/>
+        </w:rPr>
+        <w:t xml:space="preserve">/api/review-annotations</w:t>
+      </w:r>
+      <w:r>
+        <w:t xml:space="preserve"> </w:t>
+      </w:r>
+      <w:r>
+        <w:t xml:space="preserve">unauthenticated → 403/404).</w:t>
       </w:r>
     </w:p>
     <w:p>
@@ -44136,23 +44447,68 @@
         </w:numPr>
       </w:pPr>
       <w:r>
-        <w:rPr>
-          <w:b/>
-          <w:bCs/>
-        </w:rPr>
-        <w:t xml:space="preserve">Request review</w:t>
-      </w:r>
-      <w:r>
-        <w:t xml:space="preserve"> </w:t>
-      </w:r>
-      <w:r>
-        <w:t xml:space="preserve">email: submit the form; confirm the Mailgun send and the rate limit</w:t>
-      </w:r>
-      <w:r>
-        <w:t xml:space="preserve"> </w:t>
-      </w:r>
-      <w:r>
-        <w:t xml:space="preserve">(6th request inside 10 minutes → 429).</w:t>
+        <w:t xml:space="preserve">Publish + unpublish an article as Editor; confirm on the public Hub side. Then,</w:t>
+      </w:r>
+      <w:r>
+        <w:t xml:space="preserve"> </w:t>
+      </w:r>
+      <w:r>
+        <w:rPr>
+          <w:b/>
+          <w:bCs/>
+        </w:rPr>
+        <w:t xml:space="preserve">without reloading the page</w:t>
+      </w:r>
+      <w:r>
+        <w:t xml:space="preserve">, edit a field and save — confirm the save proceeds</w:t>
+      </w:r>
+      <w:r>
+        <w:t xml:space="preserve"> </w:t>
+      </w:r>
+      <w:r>
+        <w:t xml:space="preserve">normally with NO conflict banner. (Publish/unpublish bumps the server's</w:t>
+      </w:r>
+      <w:r>
+        <w:t xml:space="preserve"> </w:t>
+      </w:r>
+      <w:r>
+        <w:rPr>
+          <w:rStyle w:val="VerbatimChar"/>
+        </w:rPr>
+        <w:t xml:space="preserve">updatedAt</w:t>
+      </w:r>
+      <w:r>
+        <w:t xml:space="preserve">;</w:t>
+      </w:r>
+      <w:r>
+        <w:t xml:space="preserve"> </w:t>
+      </w:r>
+      <w:r>
+        <w:t xml:space="preserve">the form refreshes its own remembered stamp from the publish/unpublish response</w:t>
+      </w:r>
+      <w:r>
+        <w:t xml:space="preserve"> </w:t>
+      </w:r>
+      <w:r>
+        <w:t xml:space="preserve">specifically so this next save isn't falsely flagged as "changed by someone else."</w:t>
+      </w:r>
+      <w:r>
+        <w:t xml:space="preserve"> </w:t>
+      </w:r>
+      <w:r>
+        <w:t xml:space="preserve">Repeat for an App or a Dataset if time allows — their Publish control lives on the</w:t>
+      </w:r>
+      <w:r>
+        <w:t xml:space="preserve"> </w:t>
+      </w:r>
+      <w:r>
+        <w:t xml:space="preserve">edit page itself rather than the form's toolbar, a different wiring path worth the</w:t>
+      </w:r>
+      <w:r>
+        <w:t xml:space="preserve"> </w:t>
+      </w:r>
+      <w:r>
+        <w:t xml:space="preserve">spot-check.)</w:t>
       </w:r>
     </w:p>
     <w:p>
@@ -44168,76 +44524,19 @@
           <w:b/>
           <w:bCs/>
         </w:rPr>
-        <w:t xml:space="preserve">CSP check</w:t>
-      </w:r>
-      <w:r>
-        <w:t xml:space="preserve"> </w:t>
-      </w:r>
-      <w:r>
-        <w:t xml:space="preserve">(README "Action required before launch"): open devtools on the staging</w:t>
-      </w:r>
-      <w:r>
-        <w:t xml:space="preserve"> </w:t>
-      </w:r>
-      <w:r>
-        <w:t xml:space="preserve">deploy — if a Nuxt bootstrap inline script is blocked, add its</w:t>
-      </w:r>
-      <w:r>
-        <w:t xml:space="preserve"> </w:t>
-      </w:r>
-      <w:r>
-        <w:rPr>
-          <w:rStyle w:val="VerbatimChar"/>
-        </w:rPr>
-        <w:t xml:space="preserve">sha256</w:t>
-      </w:r>
-      <w:r>
-        <w:t xml:space="preserve"> </w:t>
-      </w:r>
-      <w:r>
-        <w:t xml:space="preserve">hash to</w:t>
-      </w:r>
-      <w:r>
-        <w:t xml:space="preserve"> </w:t>
-      </w:r>
-      <w:r>
-        <w:rPr>
-          <w:rStyle w:val="VerbatimChar"/>
-        </w:rPr>
-        <w:t xml:space="preserve">script-src</w:t>
-      </w:r>
-      <w:r>
-        <w:t xml:space="preserve"> </w:t>
-      </w:r>
-      <w:r>
-        <w:t xml:space="preserve">in</w:t>
-      </w:r>
-      <w:r>
-        <w:t xml:space="preserve"> </w:t>
-      </w:r>
-      <w:r>
-        <w:rPr>
-          <w:rStyle w:val="VerbatimChar"/>
-        </w:rPr>
-        <w:t xml:space="preserve">public/_headers</w:t>
-      </w:r>
-      <w:r>
-        <w:t xml:space="preserve">. Never add</w:t>
-      </w:r>
-      <w:r>
-        <w:t xml:space="preserve"> </w:t>
-      </w:r>
-      <w:r>
-        <w:rPr>
-          <w:rStyle w:val="VerbatimChar"/>
-        </w:rPr>
-        <w:t xml:space="preserve">'unsafe-inline'</w:t>
-      </w:r>
-      <w:r>
-        <w:t xml:space="preserve"> </w:t>
-      </w:r>
-      <w:r>
-        <w:t xml:space="preserve">to production.</w:t>
+        <w:t xml:space="preserve">Request review</w:t>
+      </w:r>
+      <w:r>
+        <w:t xml:space="preserve"> </w:t>
+      </w:r>
+      <w:r>
+        <w:t xml:space="preserve">email: submit the form; confirm the Mailgun send and the rate limit</w:t>
+      </w:r>
+      <w:r>
+        <w:t xml:space="preserve"> </w:t>
+      </w:r>
+      <w:r>
+        <w:t xml:space="preserve">(6th request inside 10 minutes → 429).</w:t>
       </w:r>
     </w:p>
     <w:p>
@@ -44249,13 +44548,80 @@
         </w:numPr>
       </w:pPr>
       <w:r>
-        <w:t xml:space="preserve">Uploads: add a splash image / main-file PDF via the Media Library path; confirm no</w:t>
-      </w:r>
-      <w:r>
-        <w:t xml:space="preserve"> </w:t>
-      </w:r>
-      <w:r>
-        <w:t xml:space="preserve">base64 ever hits the payload (the write guard throws if it does).</w:t>
+        <w:rPr>
+          <w:b/>
+          <w:bCs/>
+        </w:rPr>
+        <w:t xml:space="preserve">CSP check</w:t>
+      </w:r>
+      <w:r>
+        <w:t xml:space="preserve"> </w:t>
+      </w:r>
+      <w:r>
+        <w:t xml:space="preserve">(README "Action required before launch"): open devtools on the staging</w:t>
+      </w:r>
+      <w:r>
+        <w:t xml:space="preserve"> </w:t>
+      </w:r>
+      <w:r>
+        <w:t xml:space="preserve">deploy — if a Nuxt bootstrap inline script is blocked, add its</w:t>
+      </w:r>
+      <w:r>
+        <w:t xml:space="preserve"> </w:t>
+      </w:r>
+      <w:r>
+        <w:rPr>
+          <w:rStyle w:val="VerbatimChar"/>
+        </w:rPr>
+        <w:t xml:space="preserve">sha256</w:t>
+      </w:r>
+      <w:r>
+        <w:t xml:space="preserve"> </w:t>
+      </w:r>
+      <w:r>
+        <w:t xml:space="preserve">hash to</w:t>
+      </w:r>
+      <w:r>
+        <w:t xml:space="preserve"> </w:t>
+      </w:r>
+      <w:r>
+        <w:rPr>
+          <w:rStyle w:val="VerbatimChar"/>
+        </w:rPr>
+        <w:t xml:space="preserve">script-src</w:t>
+      </w:r>
+      <w:r>
+        <w:t xml:space="preserve"> </w:t>
+      </w:r>
+      <w:r>
+        <w:t xml:space="preserve">in</w:t>
+      </w:r>
+      <w:r>
+        <w:t xml:space="preserve"> </w:t>
+      </w:r>
+      <w:r>
+        <w:rPr>
+          <w:rStyle w:val="VerbatimChar"/>
+        </w:rPr>
+        <w:t xml:space="preserve">public/_headers</w:t>
+      </w:r>
+      <w:r>
+        <w:t xml:space="preserve">. Never add</w:t>
+      </w:r>
+      <w:r>
+        <w:t xml:space="preserve"> </w:t>
+      </w:r>
+      <w:r>
+        <w:rPr>
+          <w:rStyle w:val="VerbatimChar"/>
+        </w:rPr>
+        <w:t xml:space="preserve">'unsafe-inline'</w:t>
+      </w:r>
+      <w:r>
+        <w:t xml:space="preserve"> </w:t>
+      </w:r>
+      <w:r>
+        <w:t xml:space="preserve">to production.</w:t>
       </w:r>
     </w:p>
     <w:p>
@@ -44264,6 +44630,24 @@
         <w:numPr>
           <w:ilvl w:val="0"/>
           <w:numId w:val="1098"/>
+        </w:numPr>
+      </w:pPr>
+      <w:r>
+        <w:t xml:space="preserve">Uploads: add a splash image / main-file PDF via the Media Library path; confirm no</w:t>
+      </w:r>
+      <w:r>
+        <w:t xml:space="preserve"> </w:t>
+      </w:r>
+      <w:r>
+        <w:t xml:space="preserve">base64 ever hits the payload (the write guard throws if it does).</w:t>
+      </w:r>
+    </w:p>
+    <w:p>
+      <w:pPr>
+        <w:pStyle w:val="Compact"/>
+        <w:numPr>
+          <w:ilvl w:val="0"/>
+          <w:numId w:val="1099"/>
         </w:numPr>
       </w:pPr>
       <w:r>
@@ -44941,7 +45325,7 @@
         <w:pStyle w:val="Compact"/>
         <w:numPr>
           <w:ilvl w:val="0"/>
-          <w:numId w:val="1099"/>
+          <w:numId w:val="1100"/>
         </w:numPr>
       </w:pPr>
       <w:r>
@@ -44961,206 +45345,6 @@
       </w:r>
       <w:r>
         <w:t xml:space="preserve">during the window.</w:t>
-      </w:r>
-    </w:p>
-    <w:p>
-      <w:pPr>
-        <w:pStyle w:val="Compact"/>
-        <w:numPr>
-          <w:ilvl w:val="0"/>
-          <w:numId w:val="1099"/>
-        </w:numPr>
-      </w:pPr>
-      <w:r>
-        <w:t xml:space="preserve">Flip the production site's build settings + env per §3 (or merge the production TOML).</w:t>
-      </w:r>
-    </w:p>
-    <w:p>
-      <w:pPr>
-        <w:pStyle w:val="Compact"/>
-        <w:numPr>
-          <w:ilvl w:val="0"/>
-          <w:numId w:val="1099"/>
-        </w:numPr>
-      </w:pPr>
-      <w:r>
-        <w:t xml:space="preserve">Trigger the deploy; watch the Netlify build log — expect</w:t>
-      </w:r>
-      <w:r>
-        <w:t xml:space="preserve"> </w:t>
-      </w:r>
-      <w:r>
-        <w:rPr>
-          <w:b/>
-          <w:bCs/>
-        </w:rPr>
-        <w:t xml:space="preserve">functions deployed</w:t>
-      </w:r>
-      <w:r>
-        <w:t xml:space="preserve"> </w:t>
-      </w:r>
-      <w:r>
-        <w:t xml:space="preserve">(the</w:t>
-      </w:r>
-      <w:r>
-        <w:t xml:space="preserve"> </w:t>
-      </w:r>
-      <w:r>
-        <w:t xml:space="preserve">request-review route), unlike the demo's "No functions deployed".</w:t>
-      </w:r>
-    </w:p>
-    <w:p>
-      <w:pPr>
-        <w:pStyle w:val="Compact"/>
-        <w:numPr>
-          <w:ilvl w:val="0"/>
-          <w:numId w:val="1099"/>
-        </w:numPr>
-      </w:pPr>
-      <w:r>
-        <w:t xml:space="preserve">Run the §2 checklist's top five lines against production (login ×2 roles, real content,</w:t>
-      </w:r>
-      <w:r>
-        <w:t xml:space="preserve"> </w:t>
-      </w:r>
-      <w:r>
-        <w:t xml:space="preserve">one annotation round-trip, one publish round-trip).</w:t>
-      </w:r>
-    </w:p>
-    <w:p>
-      <w:pPr>
-        <w:pStyle w:val="Compact"/>
-        <w:numPr>
-          <w:ilvl w:val="0"/>
-          <w:numId w:val="1099"/>
-        </w:numPr>
-      </w:pPr>
-      <w:r>
-        <w:rPr>
-          <w:b/>
-          <w:bCs/>
-        </w:rPr>
-        <w:t xml:space="preserve">Custom domain, if one is planned</w:t>
-      </w:r>
-      <w:r>
-        <w:t xml:space="preserve"> </w:t>
-      </w:r>
-      <w:r>
-        <w:t xml:space="preserve">(e.g.</w:t>
-      </w:r>
-      <w:r>
-        <w:t xml:space="preserve"> </w:t>
-      </w:r>
-      <w:r>
-        <w:rPr>
-          <w:rStyle w:val="VerbatimChar"/>
-        </w:rPr>
-        <w:t xml:space="preserve">studio.icjia.example</w:t>
-      </w:r>
-      <w:r>
-        <w:t xml:space="preserve">): add it to the</w:t>
-      </w:r>
-      <w:r>
-        <w:t xml:space="preserve"> </w:t>
-      </w:r>
-      <w:r>
-        <w:t xml:space="preserve">production Netlify site, wait for DNS + the auto-provisioned certificate, and re-run the</w:t>
-      </w:r>
-      <w:r>
-        <w:t xml:space="preserve"> </w:t>
-      </w:r>
-      <w:r>
-        <w:t xml:space="preserve">login smoke test from that hostname (it must also be in Strapi's CORS allowlist, §1.6).</w:t>
-      </w:r>
-      <w:r>
-        <w:t xml:space="preserve"> </w:t>
-      </w:r>
-      <w:r>
-        <w:t xml:space="preserve">Do this before announcing — HSTS (</w:t>
-      </w:r>
-      <w:r>
-        <w:rPr>
-          <w:rStyle w:val="VerbatimChar"/>
-        </w:rPr>
-        <w:t xml:space="preserve">max-age=31536000</w:t>
-      </w:r>
-      <w:r>
-        <w:t xml:space="preserve">) makes the hostname hard to walk back.</w:t>
-      </w:r>
-    </w:p>
-    <w:p>
-      <w:pPr>
-        <w:pStyle w:val="Compact"/>
-        <w:numPr>
-          <w:ilvl w:val="0"/>
-          <w:numId w:val="1099"/>
-        </w:numPr>
-      </w:pPr>
-      <w:r>
-        <w:t xml:space="preserve">Point people at the production URL. The demo site can keep running as long as it's useful —</w:t>
-      </w:r>
-      <w:r>
-        <w:t xml:space="preserve"> </w:t>
-      </w:r>
-      <w:r>
-        <w:t xml:space="preserve">it is isolated by design (own site, own flag, zero backend reach).</w:t>
-      </w:r>
-    </w:p>
-    <w:p>
-      <w:pPr>
-        <w:pStyle w:val="Compact"/>
-        <w:numPr>
-          <w:ilvl w:val="0"/>
-          <w:numId w:val="1099"/>
-        </w:numPr>
-      </w:pPr>
-      <w:r>
-        <w:t xml:space="preserve">Tag the release: version + date in</w:t>
-      </w:r>
-      <w:r>
-        <w:t xml:space="preserve"> </w:t>
-      </w:r>
-      <w:r>
-        <w:rPr>
-          <w:rStyle w:val="VerbatimChar"/>
-        </w:rPr>
-        <w:t xml:space="preserve">CHANGELOG.md</w:t>
-      </w:r>
-      <w:r>
-        <w:t xml:space="preserve"> </w:t>
-      </w:r>
-      <w:r>
-        <w:t xml:space="preserve">(per repo convention),</w:t>
-      </w:r>
-      <w:r>
-        <w:t xml:space="preserve"> </w:t>
-      </w:r>
-      <w:r>
-        <w:rPr>
-          <w:rStyle w:val="VerbatimChar"/>
-        </w:rPr>
-        <w:t xml:space="preserve">git tag</w:t>
-      </w:r>
-      <w:r>
-        <w:t xml:space="preserve">.</w:t>
-      </w:r>
-    </w:p>
-    <w:bookmarkEnd w:id="144"/>
-    <w:bookmarkStart w:id="145" w:name="toc58"/>
-    <w:p>
-      <w:pPr>
-        <w:pStyle w:val="Heading3"/>
-      </w:pPr>
-      <w:r>
-        <w:t xml:space="preserve">5. Rollback</w:t>
-      </w:r>
-    </w:p>
-    <w:p>
-      <w:pPr>
-        <w:pStyle w:val="FirstParagraph"/>
-      </w:pPr>
-      <w:r>
-        <w:t xml:space="preserve">The demo is unaffected by anything above, so rollback is only about the production site:</w:t>
       </w:r>
     </w:p>
     <w:p>
@@ -45172,23 +45356,7 @@
         </w:numPr>
       </w:pPr>
       <w:r>
-        <w:t xml:space="preserve">Bad build → Netlify → Deploys →</w:t>
-      </w:r>
-      <w:r>
-        <w:t xml:space="preserve"> </w:t>
-      </w:r>
-      <w:r>
-        <w:rPr>
-          <w:b/>
-          <w:bCs/>
-        </w:rPr>
-        <w:t xml:space="preserve">Publish</w:t>
-      </w:r>
-      <w:r>
-        <w:t xml:space="preserve"> </w:t>
-      </w:r>
-      <w:r>
-        <w:t xml:space="preserve">the previous known-good deploy (instant).</w:t>
+        <w:t xml:space="preserve">Flip the production site's build settings + env per §3 (or merge the production TOML).</w:t>
       </w:r>
     </w:p>
     <w:p>
@@ -45200,7 +45368,29 @@
         </w:numPr>
       </w:pPr>
       <w:r>
-        <w:t xml:space="preserve">Bad config → restore §3 settings; redeploy.</w:t>
+        <w:t xml:space="preserve">Trigger the deploy; watch the Netlify build log — expect</w:t>
+      </w:r>
+      <w:r>
+        <w:t xml:space="preserve"> </w:t>
+      </w:r>
+      <w:r>
+        <w:rPr>
+          <w:b/>
+          <w:bCs/>
+        </w:rPr>
+        <w:t xml:space="preserve">functions deployed</w:t>
+      </w:r>
+      <w:r>
+        <w:t xml:space="preserve"> </w:t>
+      </w:r>
+      <w:r>
+        <w:t xml:space="preserve">(the</w:t>
+      </w:r>
+      <w:r>
+        <w:t xml:space="preserve"> </w:t>
+      </w:r>
+      <w:r>
+        <w:t xml:space="preserve">request-review route), unlike the demo's "No functions deployed".</w:t>
       </w:r>
     </w:p>
     <w:p>
@@ -45212,44 +45402,149 @@
         </w:numPr>
       </w:pPr>
       <w:r>
-        <w:t xml:space="preserve">Strapi-side trouble with</w:t>
-      </w:r>
-      <w:r>
-        <w:t xml:space="preserve"> </w:t>
-      </w:r>
-      <w:r>
-        <w:rPr>
-          <w:rStyle w:val="VerbatimChar"/>
-        </w:rPr>
-        <w:t xml:space="preserve">review-annotation</w:t>
-      </w:r>
-      <w:r>
-        <w:t xml:space="preserve"> </w:t>
-      </w:r>
-      <w:r>
-        <w:t xml:space="preserve">→ the Studio degrades cleanly: annotation</w:t>
-      </w:r>
-      <w:r>
-        <w:t xml:space="preserve"> </w:t>
-      </w:r>
-      <w:r>
-        <w:t xml:space="preserve">calls fail with toasts/console errors but drafts, editing, and publishing are untouched</w:t>
-      </w:r>
-      <w:r>
-        <w:t xml:space="preserve"> </w:t>
-      </w:r>
-      <w:r>
-        <w:t xml:space="preserve">(the adapter is only reached from the preview surfaces).</w:t>
-      </w:r>
-    </w:p>
-    <w:bookmarkEnd w:id="145"/>
-    <w:bookmarkStart w:id="146" w:name="toc59"/>
+        <w:t xml:space="preserve">Run the §2 checklist's top five lines against production (login ×2 roles, real content,</w:t>
+      </w:r>
+      <w:r>
+        <w:t xml:space="preserve"> </w:t>
+      </w:r>
+      <w:r>
+        <w:t xml:space="preserve">one annotation round-trip, one publish round-trip).</w:t>
+      </w:r>
+    </w:p>
+    <w:p>
+      <w:pPr>
+        <w:pStyle w:val="Compact"/>
+        <w:numPr>
+          <w:ilvl w:val="0"/>
+          <w:numId w:val="1100"/>
+        </w:numPr>
+      </w:pPr>
+      <w:r>
+        <w:rPr>
+          <w:b/>
+          <w:bCs/>
+        </w:rPr>
+        <w:t xml:space="preserve">Custom domain, if one is planned</w:t>
+      </w:r>
+      <w:r>
+        <w:t xml:space="preserve"> </w:t>
+      </w:r>
+      <w:r>
+        <w:t xml:space="preserve">(e.g.</w:t>
+      </w:r>
+      <w:r>
+        <w:t xml:space="preserve"> </w:t>
+      </w:r>
+      <w:r>
+        <w:rPr>
+          <w:rStyle w:val="VerbatimChar"/>
+        </w:rPr>
+        <w:t xml:space="preserve">studio.icjia.example</w:t>
+      </w:r>
+      <w:r>
+        <w:t xml:space="preserve">): add it to the</w:t>
+      </w:r>
+      <w:r>
+        <w:t xml:space="preserve"> </w:t>
+      </w:r>
+      <w:r>
+        <w:t xml:space="preserve">production Netlify site, wait for DNS + the auto-provisioned certificate, and re-run the</w:t>
+      </w:r>
+      <w:r>
+        <w:t xml:space="preserve"> </w:t>
+      </w:r>
+      <w:r>
+        <w:t xml:space="preserve">login smoke test from that hostname (it must also be in Strapi's CORS allowlist, §1.6).</w:t>
+      </w:r>
+      <w:r>
+        <w:t xml:space="preserve"> </w:t>
+      </w:r>
+      <w:r>
+        <w:t xml:space="preserve">Do this before announcing — HSTS (</w:t>
+      </w:r>
+      <w:r>
+        <w:rPr>
+          <w:rStyle w:val="VerbatimChar"/>
+        </w:rPr>
+        <w:t xml:space="preserve">max-age=31536000</w:t>
+      </w:r>
+      <w:r>
+        <w:t xml:space="preserve">) makes the hostname hard to walk back.</w:t>
+      </w:r>
+    </w:p>
+    <w:p>
+      <w:pPr>
+        <w:pStyle w:val="Compact"/>
+        <w:numPr>
+          <w:ilvl w:val="0"/>
+          <w:numId w:val="1100"/>
+        </w:numPr>
+      </w:pPr>
+      <w:r>
+        <w:t xml:space="preserve">Point people at the production URL. The demo site can keep running as long as it's useful —</w:t>
+      </w:r>
+      <w:r>
+        <w:t xml:space="preserve"> </w:t>
+      </w:r>
+      <w:r>
+        <w:t xml:space="preserve">it is isolated by design (own site, own flag, zero backend reach).</w:t>
+      </w:r>
+    </w:p>
+    <w:p>
+      <w:pPr>
+        <w:pStyle w:val="Compact"/>
+        <w:numPr>
+          <w:ilvl w:val="0"/>
+          <w:numId w:val="1100"/>
+        </w:numPr>
+      </w:pPr>
+      <w:r>
+        <w:t xml:space="preserve">Tag the release: version + date in</w:t>
+      </w:r>
+      <w:r>
+        <w:t xml:space="preserve"> </w:t>
+      </w:r>
+      <w:r>
+        <w:rPr>
+          <w:rStyle w:val="VerbatimChar"/>
+        </w:rPr>
+        <w:t xml:space="preserve">CHANGELOG.md</w:t>
+      </w:r>
+      <w:r>
+        <w:t xml:space="preserve"> </w:t>
+      </w:r>
+      <w:r>
+        <w:t xml:space="preserve">(per repo convention),</w:t>
+      </w:r>
+      <w:r>
+        <w:t xml:space="preserve"> </w:t>
+      </w:r>
+      <w:r>
+        <w:rPr>
+          <w:rStyle w:val="VerbatimChar"/>
+        </w:rPr>
+        <w:t xml:space="preserve">git tag</w:t>
+      </w:r>
+      <w:r>
+        <w:t xml:space="preserve">.</w:t>
+      </w:r>
+    </w:p>
+    <w:bookmarkEnd w:id="144"/>
+    <w:bookmarkStart w:id="145" w:name="toc58"/>
     <w:p>
       <w:pPr>
         <w:pStyle w:val="Heading3"/>
       </w:pPr>
       <w:r>
-        <w:t xml:space="preserve">6. Known launch-posture decisions (documented, deliberate)</w:t>
+        <w:t xml:space="preserve">5. Rollback</w:t>
+      </w:r>
+    </w:p>
+    <w:p>
+      <w:pPr>
+        <w:pStyle w:val="FirstParagraph"/>
+      </w:pPr>
+      <w:r>
+        <w:t xml:space="preserve">The demo is unaffected by anything above, so rollback is only about the production site:</w:t>
       </w:r>
     </w:p>
     <w:p>
@@ -45261,63 +45556,23 @@
         </w:numPr>
       </w:pPr>
       <w:r>
-        <w:rPr>
-          <w:b/>
-          <w:bCs/>
-        </w:rPr>
-        <w:t xml:space="preserve">Annotation freshness:</w:t>
-      </w:r>
-      <w:r>
-        <w:t xml:space="preserve"> </w:t>
-      </w:r>
-      <w:r>
-        <w:t xml:space="preserve">refetch on preview open and after every write. No polling, no</w:t>
-      </w:r>
-      <w:r>
-        <w:t xml:space="preserve"> </w:t>
-      </w:r>
-      <w:r>
-        <w:t xml:space="preserve">websockets. Two reviewers replying to the</w:t>
-      </w:r>
-      <w:r>
-        <w:t xml:space="preserve"> </w:t>
-      </w:r>
-      <w:r>
-        <w:rPr>
-          <w:i/>
-          <w:iCs/>
-        </w:rPr>
-        <w:t xml:space="preserve">same thread</w:t>
-      </w:r>
-      <w:r>
-        <w:t xml:space="preserve"> </w:t>
-      </w:r>
-      <w:r>
-        <w:t xml:space="preserve">in the same instant is</w:t>
-      </w:r>
-      <w:r>
-        <w:t xml:space="preserve"> </w:t>
-      </w:r>
-      <w:r>
-        <w:t xml:space="preserve">last-write-wins (</w:t>
-      </w:r>
-      <w:r>
-        <w:rPr>
-          <w:rStyle w:val="VerbatimChar"/>
-        </w:rPr>
-        <w:t xml:space="preserve">addComment</w:t>
-      </w:r>
-      <w:r>
-        <w:t xml:space="preserve"> </w:t>
-      </w:r>
-      <w:r>
-        <w:t xml:space="preserve">re-fetches then PUTs the whole row). Fine at ICJIA review</w:t>
-      </w:r>
-      <w:r>
-        <w:t xml:space="preserve"> </w:t>
-      </w:r>
-      <w:r>
-        <w:t xml:space="preserve">volumes; revisit only if it ever bites.</w:t>
+        <w:t xml:space="preserve">Bad build → Netlify → Deploys →</w:t>
+      </w:r>
+      <w:r>
+        <w:t xml:space="preserve"> </w:t>
+      </w:r>
+      <w:r>
+        <w:rPr>
+          <w:b/>
+          <w:bCs/>
+        </w:rPr>
+        <w:t xml:space="preserve">Publish</w:t>
+      </w:r>
+      <w:r>
+        <w:t xml:space="preserve"> </w:t>
+      </w:r>
+      <w:r>
+        <w:t xml:space="preserve">the previous known-good deploy (instant).</w:t>
       </w:r>
     </w:p>
     <w:p>
@@ -45329,50 +45584,7 @@
         </w:numPr>
       </w:pPr>
       <w:r>
-        <w:rPr>
-          <w:b/>
-          <w:bCs/>
-        </w:rPr>
-        <w:t xml:space="preserve">Annotation ids:</w:t>
-      </w:r>
-      <w:r>
-        <w:t xml:space="preserve"> </w:t>
-      </w:r>
-      <w:r>
-        <w:t xml:space="preserve">in production, an annotation's id IS its Strapi</w:t>
-      </w:r>
-      <w:r>
-        <w:t xml:space="preserve"> </w:t>
-      </w:r>
-      <w:r>
-        <w:rPr>
-          <w:rStyle w:val="VerbatimChar"/>
-        </w:rPr>
-        <w:t xml:space="preserve">documentId</w:t>
-      </w:r>
-      <w:r>
-        <w:t xml:space="preserve"> </w:t>
-      </w:r>
-      <w:r>
-        <w:t xml:space="preserve">(the</w:t>
-      </w:r>
-      <w:r>
-        <w:t xml:space="preserve"> </w:t>
-      </w:r>
-      <w:r>
-        <w:t xml:space="preserve">target entry's id lives in</w:t>
-      </w:r>
-      <w:r>
-        <w:t xml:space="preserve"> </w:t>
-      </w:r>
-      <w:r>
-        <w:rPr>
-          <w:rStyle w:val="VerbatimChar"/>
-        </w:rPr>
-        <w:t xml:space="preserve">targetDocumentId</w:t>
-      </w:r>
-      <w:r>
-        <w:t xml:space="preserve">). localStorage (demo) ids are client UUIDs.</w:t>
+        <w:t xml:space="preserve">Bad config → restore §3 settings; redeploy.</w:t>
       </w:r>
     </w:p>
     <w:p>
@@ -45384,29 +45596,44 @@
         </w:numPr>
       </w:pPr>
       <w:r>
-        <w:rPr>
-          <w:b/>
-          <w:bCs/>
-        </w:rPr>
-        <w:t xml:space="preserve">Demo annotations do not migrate.</w:t>
-      </w:r>
-      <w:r>
-        <w:t xml:space="preserve"> </w:t>
-      </w:r>
-      <w:r>
-        <w:t xml:space="preserve">localStorage threads live in individual browsers and</w:t>
-      </w:r>
-      <w:r>
-        <w:t xml:space="preserve"> </w:t>
-      </w:r>
-      <w:r>
-        <w:t xml:space="preserve">reference synthetic demo documentIds; they are demonstration data by definition. Anything</w:t>
-      </w:r>
-      <w:r>
-        <w:t xml:space="preserve"> </w:t>
-      </w:r>
-      <w:r>
-        <w:t xml:space="preserve">worth keeping should be re-entered against real drafts after cutover.</w:t>
+        <w:t xml:space="preserve">Strapi-side trouble with</w:t>
+      </w:r>
+      <w:r>
+        <w:t xml:space="preserve"> </w:t>
+      </w:r>
+      <w:r>
+        <w:rPr>
+          <w:rStyle w:val="VerbatimChar"/>
+        </w:rPr>
+        <w:t xml:space="preserve">review-annotation</w:t>
+      </w:r>
+      <w:r>
+        <w:t xml:space="preserve"> </w:t>
+      </w:r>
+      <w:r>
+        <w:t xml:space="preserve">→ the Studio degrades cleanly: annotation</w:t>
+      </w:r>
+      <w:r>
+        <w:t xml:space="preserve"> </w:t>
+      </w:r>
+      <w:r>
+        <w:t xml:space="preserve">calls fail with toasts/console errors but drafts, editing, and publishing are untouched</w:t>
+      </w:r>
+      <w:r>
+        <w:t xml:space="preserve"> </w:t>
+      </w:r>
+      <w:r>
+        <w:t xml:space="preserve">(the adapter is only reached from the preview surfaces).</w:t>
+      </w:r>
+    </w:p>
+    <w:bookmarkEnd w:id="145"/>
+    <w:bookmarkStart w:id="146" w:name="toc59"/>
+    <w:p>
+      <w:pPr>
+        <w:pStyle w:val="Heading3"/>
+      </w:pPr>
+      <w:r>
+        <w:t xml:space="preserve">6. Known launch-posture decisions (documented, deliberate)</w:t>
       </w:r>
     </w:p>
     <w:p>
@@ -45414,7 +45641,7 @@
         <w:pStyle w:val="Compact"/>
         <w:numPr>
           <w:ilvl w:val="0"/>
-          <w:numId w:val="1101"/>
+          <w:numId w:val="1102"/>
         </w:numPr>
       </w:pPr>
       <w:r>
@@ -45422,19 +45649,59 @@
           <w:b/>
           <w:bCs/>
         </w:rPr>
-        <w:t xml:space="preserve">Coarse RBAC on annotations</w:t>
-      </w:r>
-      <w:r>
-        <w:t xml:space="preserve"> </w:t>
-      </w:r>
-      <w:r>
-        <w:t xml:space="preserve">(any Author/Editor can CRUD all of them at the API level)</w:t>
-      </w:r>
-      <w:r>
-        <w:t xml:space="preserve"> </w:t>
-      </w:r>
-      <w:r>
-        <w:t xml:space="preserve">is intentional for launch; the UI enforces the polite rules.</w:t>
+        <w:t xml:space="preserve">Annotation freshness:</w:t>
+      </w:r>
+      <w:r>
+        <w:t xml:space="preserve"> </w:t>
+      </w:r>
+      <w:r>
+        <w:t xml:space="preserve">refetch on preview open and after every write. No polling, no</w:t>
+      </w:r>
+      <w:r>
+        <w:t xml:space="preserve"> </w:t>
+      </w:r>
+      <w:r>
+        <w:t xml:space="preserve">websockets. Two reviewers replying to the</w:t>
+      </w:r>
+      <w:r>
+        <w:t xml:space="preserve"> </w:t>
+      </w:r>
+      <w:r>
+        <w:rPr>
+          <w:i/>
+          <w:iCs/>
+        </w:rPr>
+        <w:t xml:space="preserve">same thread</w:t>
+      </w:r>
+      <w:r>
+        <w:t xml:space="preserve"> </w:t>
+      </w:r>
+      <w:r>
+        <w:t xml:space="preserve">in the same instant is</w:t>
+      </w:r>
+      <w:r>
+        <w:t xml:space="preserve"> </w:t>
+      </w:r>
+      <w:r>
+        <w:t xml:space="preserve">last-write-wins (</w:t>
+      </w:r>
+      <w:r>
+        <w:rPr>
+          <w:rStyle w:val="VerbatimChar"/>
+        </w:rPr>
+        <w:t xml:space="preserve">addComment</w:t>
+      </w:r>
+      <w:r>
+        <w:t xml:space="preserve"> </w:t>
+      </w:r>
+      <w:r>
+        <w:t xml:space="preserve">re-fetches then PUTs the whole row). Fine at ICJIA review</w:t>
+      </w:r>
+      <w:r>
+        <w:t xml:space="preserve"> </w:t>
+      </w:r>
+      <w:r>
+        <w:t xml:space="preserve">volumes; revisit only if it ever bites.</w:t>
       </w:r>
     </w:p>
     <w:p>
@@ -45442,7 +45709,7 @@
         <w:pStyle w:val="Compact"/>
         <w:numPr>
           <w:ilvl w:val="0"/>
-          <w:numId w:val="1101"/>
+          <w:numId w:val="1102"/>
         </w:numPr>
       </w:pPr>
       <w:r>
@@ -45450,46 +45717,46 @@
           <w:b/>
           <w:bCs/>
         </w:rPr>
-        <w:t xml:space="preserve">Non-blocking polish backlog:</w:t>
-      </w:r>
-      <w:r>
-        <w:t xml:space="preserve"> </w:t>
-      </w:r>
-      <w:r>
-        <w:t xml:space="preserve">the Phase-1 final review logged a hardening follow-up</w:t>
-      </w:r>
-      <w:r>
-        <w:t xml:space="preserve"> </w:t>
-      </w:r>
-      <w:r>
-        <w:t xml:space="preserve">list at the end of</w:t>
-      </w:r>
-      <w:r>
-        <w:t xml:space="preserve"> </w:t>
-      </w:r>
-      <w:r>
-        <w:rPr>
-          <w:rStyle w:val="VerbatimChar"/>
-        </w:rPr>
-        <w:t xml:space="preserve">.superpowers/sdd/progress.md</w:t>
-      </w:r>
-      <w:r>
-        <w:t xml:space="preserve"> </w:t>
-      </w:r>
-      <w:r>
-        <w:t xml:space="preserve">(annotation a11y riders: swatch</w:t>
-      </w:r>
-      <w:r>
-        <w:t xml:space="preserve"> </w:t>
-      </w:r>
-      <w:r>
-        <w:t xml:space="preserve">radiogroup semantics, roving toolbar tabindex, drawer dialog semantics, document-level</w:t>
-      </w:r>
-      <w:r>
-        <w:t xml:space="preserve"> </w:t>
-      </w:r>
-      <w:r>
-        <w:t xml:space="preserve">keyboard-create listener). None block launch; keep them visible.</w:t>
+        <w:t xml:space="preserve">Annotation ids:</w:t>
+      </w:r>
+      <w:r>
+        <w:t xml:space="preserve"> </w:t>
+      </w:r>
+      <w:r>
+        <w:t xml:space="preserve">in production, an annotation's id IS its Strapi</w:t>
+      </w:r>
+      <w:r>
+        <w:t xml:space="preserve"> </w:t>
+      </w:r>
+      <w:r>
+        <w:rPr>
+          <w:rStyle w:val="VerbatimChar"/>
+        </w:rPr>
+        <w:t xml:space="preserve">documentId</w:t>
+      </w:r>
+      <w:r>
+        <w:t xml:space="preserve"> </w:t>
+      </w:r>
+      <w:r>
+        <w:t xml:space="preserve">(the</w:t>
+      </w:r>
+      <w:r>
+        <w:t xml:space="preserve"> </w:t>
+      </w:r>
+      <w:r>
+        <w:t xml:space="preserve">target entry's id lives in</w:t>
+      </w:r>
+      <w:r>
+        <w:t xml:space="preserve"> </w:t>
+      </w:r>
+      <w:r>
+        <w:rPr>
+          <w:rStyle w:val="VerbatimChar"/>
+        </w:rPr>
+        <w:t xml:space="preserve">targetDocumentId</w:t>
+      </w:r>
+      <w:r>
+        <w:t xml:space="preserve">). localStorage (demo) ids are client UUIDs.</w:t>
       </w:r>
     </w:p>
     <w:p>
@@ -45497,7 +45764,124 @@
         <w:pStyle w:val="Compact"/>
         <w:numPr>
           <w:ilvl w:val="0"/>
-          <w:numId w:val="1101"/>
+          <w:numId w:val="1102"/>
+        </w:numPr>
+      </w:pPr>
+      <w:r>
+        <w:rPr>
+          <w:b/>
+          <w:bCs/>
+        </w:rPr>
+        <w:t xml:space="preserve">Demo annotations do not migrate.</w:t>
+      </w:r>
+      <w:r>
+        <w:t xml:space="preserve"> </w:t>
+      </w:r>
+      <w:r>
+        <w:t xml:space="preserve">localStorage threads live in individual browsers and</w:t>
+      </w:r>
+      <w:r>
+        <w:t xml:space="preserve"> </w:t>
+      </w:r>
+      <w:r>
+        <w:t xml:space="preserve">reference synthetic demo documentIds; they are demonstration data by definition. Anything</w:t>
+      </w:r>
+      <w:r>
+        <w:t xml:space="preserve"> </w:t>
+      </w:r>
+      <w:r>
+        <w:t xml:space="preserve">worth keeping should be re-entered against real drafts after cutover.</w:t>
+      </w:r>
+    </w:p>
+    <w:p>
+      <w:pPr>
+        <w:pStyle w:val="Compact"/>
+        <w:numPr>
+          <w:ilvl w:val="0"/>
+          <w:numId w:val="1102"/>
+        </w:numPr>
+      </w:pPr>
+      <w:r>
+        <w:rPr>
+          <w:b/>
+          <w:bCs/>
+        </w:rPr>
+        <w:t xml:space="preserve">Coarse RBAC on annotations</w:t>
+      </w:r>
+      <w:r>
+        <w:t xml:space="preserve"> </w:t>
+      </w:r>
+      <w:r>
+        <w:t xml:space="preserve">(any Author/Editor can CRUD all of them at the API level)</w:t>
+      </w:r>
+      <w:r>
+        <w:t xml:space="preserve"> </w:t>
+      </w:r>
+      <w:r>
+        <w:t xml:space="preserve">is intentional for launch; the UI enforces the polite rules.</w:t>
+      </w:r>
+    </w:p>
+    <w:p>
+      <w:pPr>
+        <w:pStyle w:val="Compact"/>
+        <w:numPr>
+          <w:ilvl w:val="0"/>
+          <w:numId w:val="1102"/>
+        </w:numPr>
+      </w:pPr>
+      <w:r>
+        <w:rPr>
+          <w:b/>
+          <w:bCs/>
+        </w:rPr>
+        <w:t xml:space="preserve">Non-blocking polish backlog:</w:t>
+      </w:r>
+      <w:r>
+        <w:t xml:space="preserve"> </w:t>
+      </w:r>
+      <w:r>
+        <w:t xml:space="preserve">the Phase-1 final review logged a hardening follow-up</w:t>
+      </w:r>
+      <w:r>
+        <w:t xml:space="preserve"> </w:t>
+      </w:r>
+      <w:r>
+        <w:t xml:space="preserve">list at the end of</w:t>
+      </w:r>
+      <w:r>
+        <w:t xml:space="preserve"> </w:t>
+      </w:r>
+      <w:r>
+        <w:rPr>
+          <w:rStyle w:val="VerbatimChar"/>
+        </w:rPr>
+        <w:t xml:space="preserve">.superpowers/sdd/progress.md</w:t>
+      </w:r>
+      <w:r>
+        <w:t xml:space="preserve"> </w:t>
+      </w:r>
+      <w:r>
+        <w:t xml:space="preserve">(annotation a11y riders: swatch</w:t>
+      </w:r>
+      <w:r>
+        <w:t xml:space="preserve"> </w:t>
+      </w:r>
+      <w:r>
+        <w:t xml:space="preserve">radiogroup semantics, roving toolbar tabindex, drawer dialog semantics, document-level</w:t>
+      </w:r>
+      <w:r>
+        <w:t xml:space="preserve"> </w:t>
+      </w:r>
+      <w:r>
+        <w:t xml:space="preserve">keyboard-create listener). None block launch; keep them visible.</w:t>
+      </w:r>
+    </w:p>
+    <w:p>
+      <w:pPr>
+        <w:pStyle w:val="Compact"/>
+        <w:numPr>
+          <w:ilvl w:val="0"/>
+          <w:numId w:val="1102"/>
         </w:numPr>
       </w:pPr>
       <w:r>
@@ -46564,6 +46948,9 @@
     <w:abstractNumId w:val="992"/>
   </w:num>
   <w:num w:numId="1099">
+    <w:abstractNumId w:val="992"/>
+  </w:num>
+  <w:num w:numId="1100">
     <w:abstractNumId w:val="99411"/>
     <w:lvlOverride w:ilvl="0">
       <w:startOverride w:val="1"/>
@@ -46593,10 +46980,10 @@
       <w:startOverride w:val="1"/>
     </w:lvlOverride>
   </w:num>
-  <w:num w:numId="1100">
+  <w:num w:numId="1101">
     <w:abstractNumId w:val="991"/>
   </w:num>
-  <w:num w:numId="1101">
+  <w:num w:numId="1102">
     <w:abstractNumId w:val="991"/>
   </w:num>
 </w:numbering>

</xml_diff>

<commit_message>
release(0.8.2): uptime monitoring runbook'd (UptimeRobot, Strapi /_health verified 204) + Sentry formally deferred with design notes — docs-only, 868 tests / 109 files; Word editions regenerated (0 field codes)
</commit_message>
<xml_diff>
--- a/docs/ICJIA-Studio-20-analysis-roadmap-copperhead.docx
+++ b/docs/ICJIA-Studio-20-analysis-roadmap-copperhead.docx
@@ -3986,13 +3986,53 @@
                 <w:b/>
                 <w:bCs/>
               </w:rPr>
+              <w:t xml:space="preserve">◑ Uptime half done (v0.8.2, 2026-07-17); error-reporter half deferred by decision (2026-07-17).</w:t>
+            </w:r>
+            <w:r>
+              <w:t xml:space="preserve"> </w:t>
+            </w:r>
+            <w:r>
+              <w:rPr>
+                <w:b/>
+                <w:bCs/>
+              </w:rPr>
               <w:t xml:space="preserve">Error monitoring + uptime checks.</w:t>
             </w:r>
             <w:r>
               <w:t xml:space="preserve"> </w:t>
             </w:r>
             <w:r>
-              <w:t xml:space="preserve">Wire a client error reporter (e.g. Sentry, allowed by adding one host to the production CSP) and simple uptime probes on the Studio and the Strapi API, alerting R&amp;A/dev.</w:t>
+              <w:t xml:space="preserve">Uptime: UptimeRobot probes on the Studio URL and the Strapi</w:t>
+            </w:r>
+            <w:r>
+              <w:t xml:space="preserve"> </w:t>
+            </w:r>
+            <w:r>
+              <w:rPr>
+                <w:rStyle w:val="VerbatimChar"/>
+              </w:rPr>
+              <w:t xml:space="preserve">/_health</w:t>
+            </w:r>
+            <w:r>
+              <w:t xml:space="preserve"> </w:t>
+            </w:r>
+            <w:r>
+              <w:t xml:space="preserve">endpoint (returns 204 unauthenticated — verified) are runbook'd (§4a) and turn on at cutover. Error reporter (Sentry): management chose to build it in at a later date; the design notes for the future build-in are recorded in</w:t>
+            </w:r>
+            <w:r>
+              <w:t xml:space="preserve"> </w:t>
+            </w:r>
+            <w:r>
+              <w:rPr>
+                <w:rStyle w:val="VerbatimChar"/>
+              </w:rPr>
+              <w:t xml:space="preserve">ROADMAP.md</w:t>
+            </w:r>
+            <w:r>
+              <w:t xml:space="preserve"> </w:t>
+            </w:r>
+            <w:r>
+              <w:t xml:space="preserve">(Deferred).</w:t>
             </w:r>
           </w:p>
         </w:tc>
@@ -4014,18 +4054,18 @@
               <w:pStyle w:val="Compact"/>
             </w:pPr>
             <w:r>
-              <w:t xml:space="preserve">No monitoring/error-reporting code or config anywhere</w:t>
-            </w:r>
-          </w:p>
-        </w:tc>
-        <w:tc>
-          <w:tcPr/>
-          <w:p>
-            <w:pPr>
-              <w:pStyle w:val="Compact"/>
-            </w:pPr>
-            <w:r>
-              <w:t xml:space="preserve">0.5–1 day</w:t>
+              <w:t xml:space="preserve">Runbook §4a; ROADMAP Deferred entry</w:t>
+            </w:r>
+          </w:p>
+        </w:tc>
+        <w:tc>
+          <w:tcPr/>
+          <w:p>
+            <w:pPr>
+              <w:pStyle w:val="Compact"/>
+            </w:pPr>
+            <w:r>
+              <w:t xml:space="preserve">uptime: done · reporter: deferred</w:t>
             </w:r>
           </w:p>
         </w:tc>
@@ -6693,7 +6733,7 @@
           <w:b/>
           <w:bCs/>
         </w:rPr>
-        <w:t xml:space="preserve">Hub Studio 2.0 · Studio build v0.8.1</w:t>
+        <w:t xml:space="preserve">Hub Studio 2.0 · Studio build v0.8.2</w:t>
       </w:r>
       <w:r>
         <w:t xml:space="preserve"> </w:t>
@@ -22266,7 +22306,7 @@
           <w:b/>
           <w:bCs/>
         </w:rPr>
-        <w:t xml:space="preserve">Hub Studio 2.0 · Studio build v0.8.1</w:t>
+        <w:t xml:space="preserve">Hub Studio 2.0 · Studio build v0.8.2</w:t>
       </w:r>
       <w:r>
         <w:t xml:space="preserve"> </w:t>
@@ -42558,7 +42598,7 @@
     <w:bookmarkEnd w:id="137"/>
     <w:bookmarkEnd w:id="138"/>
     <w:bookmarkEnd w:id="139"/>
-    <w:bookmarkStart w:id="148" w:name="toc51"/>
+    <w:bookmarkStart w:id="149" w:name="toc51"/>
     <w:p>
       <w:pPr>
         <w:pStyle w:val="Heading1"/>
@@ -42579,7 +42619,7 @@
         <w:t xml:space="preserve">Companion document, included in full (current as of this edition's date). Sections below keep their own internal numbering.</w:t>
       </w:r>
     </w:p>
-    <w:bookmarkStart w:id="147" w:name="toc52"/>
+    <w:bookmarkStart w:id="148" w:name="toc52"/>
     <w:p>
       <w:pPr>
         <w:pStyle w:val="Heading2"/>
@@ -45617,7 +45657,7 @@
       </w:r>
     </w:p>
     <w:bookmarkEnd w:id="143"/>
-    <w:bookmarkStart w:id="144" w:name="toc57"/>
+    <w:bookmarkStart w:id="145" w:name="toc57"/>
     <w:p>
       <w:pPr>
         <w:pStyle w:val="Heading3"/>
@@ -45835,14 +45875,25 @@
         <w:t xml:space="preserve">.</w:t>
       </w:r>
     </w:p>
-    <w:bookmarkEnd w:id="144"/>
-    <w:bookmarkStart w:id="145" w:name="toc58"/>
-    <w:p>
-      <w:pPr>
-        <w:pStyle w:val="Heading3"/>
-      </w:pPr>
-      <w:r>
-        <w:t xml:space="preserve">5. Rollback</w:t>
+    <w:p>
+      <w:pPr>
+        <w:pStyle w:val="Compact"/>
+        <w:numPr>
+          <w:ilvl w:val="0"/>
+          <w:numId w:val="1100"/>
+        </w:numPr>
+      </w:pPr>
+      <w:r>
+        <w:t xml:space="preserve">Turn on the uptime monitors (§4a) and confirm the test alert reaches a real inbox.</w:t>
+      </w:r>
+    </w:p>
+    <w:bookmarkStart w:id="144" w:name="Xb1ef1b0afa08df8442136559285c45830964517"/>
+    <w:p>
+      <w:pPr>
+        <w:pStyle w:val="Heading4"/>
+      </w:pPr>
+      <w:r>
+        <w:t xml:space="preserve">4a. Uptime monitors (UptimeRobot — turn on at cutover)</w:t>
       </w:r>
     </w:p>
     <w:p>
@@ -45850,7 +45901,19 @@
         <w:pStyle w:val="FirstParagraph"/>
       </w:pPr>
       <w:r>
-        <w:t xml:space="preserve">The demo is unaffected by anything above, so rollback is only about the production site:</w:t>
+        <w:t xml:space="preserve">Outside-in "is it actually up" probes, so downtime is known before an author reports it</w:t>
+      </w:r>
+      <w:r>
+        <w:t xml:space="preserve"> </w:t>
+      </w:r>
+      <w:r>
+        <w:t xml:space="preserve">(analysis-roadmap §5.4-7). UptimeRobot's free tier (50 monitors, 5-minute interval, email</w:t>
+      </w:r>
+      <w:r>
+        <w:t xml:space="preserve"> </w:t>
+      </w:r>
+      <w:r>
+        <w:t xml:space="preserve">alerts) is sufficient; no code or CSP changes are involved.</w:t>
       </w:r>
     </w:p>
     <w:p>
@@ -45862,23 +45925,7 @@
         </w:numPr>
       </w:pPr>
       <w:r>
-        <w:t xml:space="preserve">Bad build → Netlify → Deploys →</w:t>
-      </w:r>
-      <w:r>
-        <w:t xml:space="preserve"> </w:t>
-      </w:r>
-      <w:r>
-        <w:rPr>
-          <w:b/>
-          <w:bCs/>
-        </w:rPr>
-        <w:t xml:space="preserve">Publish</w:t>
-      </w:r>
-      <w:r>
-        <w:t xml:space="preserve"> </w:t>
-      </w:r>
-      <w:r>
-        <w:t xml:space="preserve">the previous known-good deploy (instant).</w:t>
+        <w:t xml:space="preserve">Create a free UptimeRobot account owned by a shared R&amp;A/dev identity, not an individual.</w:t>
       </w:r>
     </w:p>
     <w:p>
@@ -45890,7 +45937,23 @@
         </w:numPr>
       </w:pPr>
       <w:r>
-        <w:t xml:space="preserve">Bad config → restore §3 settings; redeploy.</w:t>
+        <w:rPr>
+          <w:b/>
+          <w:bCs/>
+        </w:rPr>
+        <w:t xml:space="preserve">Monitor 1 — the Studio:</w:t>
+      </w:r>
+      <w:r>
+        <w:t xml:space="preserve"> </w:t>
+      </w:r>
+      <w:r>
+        <w:t xml:space="preserve">HTTPS monitor on the production Studio URL. Any 2xx counts</w:t>
+      </w:r>
+      <w:r>
+        <w:t xml:space="preserve"> </w:t>
+      </w:r>
+      <w:r>
+        <w:t xml:space="preserve">as up.</w:t>
       </w:r>
     </w:p>
     <w:p>
@@ -45902,44 +45965,164 @@
         </w:numPr>
       </w:pPr>
       <w:r>
-        <w:t xml:space="preserve">Strapi-side trouble with</w:t>
-      </w:r>
-      <w:r>
-        <w:t xml:space="preserve"> </w:t>
-      </w:r>
-      <w:r>
-        <w:rPr>
-          <w:rStyle w:val="VerbatimChar"/>
-        </w:rPr>
-        <w:t xml:space="preserve">review-annotation</w:t>
-      </w:r>
-      <w:r>
-        <w:t xml:space="preserve"> </w:t>
-      </w:r>
-      <w:r>
-        <w:t xml:space="preserve">→ the Studio degrades cleanly: annotation</w:t>
-      </w:r>
-      <w:r>
-        <w:t xml:space="preserve"> </w:t>
-      </w:r>
-      <w:r>
-        <w:t xml:space="preserve">calls fail with toasts/console errors but drafts, editing, and publishing are untouched</w:t>
-      </w:r>
-      <w:r>
-        <w:t xml:space="preserve"> </w:t>
-      </w:r>
-      <w:r>
-        <w:t xml:space="preserve">(the adapter is only reached from the preview surfaces).</w:t>
-      </w:r>
-    </w:p>
+        <w:rPr>
+          <w:b/>
+          <w:bCs/>
+        </w:rPr>
+        <w:t xml:space="preserve">Monitor 2 — the Strapi API:</w:t>
+      </w:r>
+      <w:r>
+        <w:t xml:space="preserve"> </w:t>
+      </w:r>
+      <w:r>
+        <w:t xml:space="preserve">HTTPS monitor on</w:t>
+      </w:r>
+      <w:r>
+        <w:t xml:space="preserve"> </w:t>
+      </w:r>
+      <w:r>
+        <w:rPr>
+          <w:rStyle w:val="VerbatimChar"/>
+        </w:rPr>
+        <w:t xml:space="preserve">https://v2.hub.icjia-api.cloud/_health</w:t>
+      </w:r>
+      <w:r>
+        <w:t xml:space="preserve"> </w:t>
+      </w:r>
+      <w:r>
+        <w:t xml:space="preserve">— Strapi's built-in health endpoint, which</w:t>
+      </w:r>
+      <w:r>
+        <w:t xml:space="preserve"> </w:t>
+      </w:r>
+      <w:r>
+        <w:t xml:space="preserve">returns</w:t>
+      </w:r>
+      <w:r>
+        <w:t xml:space="preserve"> </w:t>
+      </w:r>
+      <w:r>
+        <w:rPr>
+          <w:b/>
+          <w:bCs/>
+        </w:rPr>
+        <w:t xml:space="preserve">HTTP 204 No Content</w:t>
+      </w:r>
+      <w:r>
+        <w:t xml:space="preserve"> </w:t>
+      </w:r>
+      <w:r>
+        <w:t xml:space="preserve">unauthenticated (verified 2026-07-17); 204 is 2xx, so</w:t>
+      </w:r>
+      <w:r>
+        <w:t xml:space="preserve"> </w:t>
+      </w:r>
+      <w:r>
+        <w:t xml:space="preserve">the default monitor treats it as up.</w:t>
+      </w:r>
+    </w:p>
+    <w:p>
+      <w:pPr>
+        <w:pStyle w:val="Compact"/>
+        <w:numPr>
+          <w:ilvl w:val="0"/>
+          <w:numId w:val="1101"/>
+        </w:numPr>
+      </w:pPr>
+      <w:r>
+        <w:t xml:space="preserve">Point alert contacts at a shared inbox R&amp;A and the developer both read.</w:t>
+      </w:r>
+    </w:p>
+    <w:p>
+      <w:pPr>
+        <w:pStyle w:val="Compact"/>
+        <w:numPr>
+          <w:ilvl w:val="0"/>
+          <w:numId w:val="1101"/>
+        </w:numPr>
+      </w:pPr>
+      <w:r>
+        <w:rPr>
+          <w:i/>
+          <w:iCs/>
+        </w:rPr>
+        <w:t xml:space="preserve">(Optional, during the §2 rehearsal window)</w:t>
+      </w:r>
+      <w:r>
+        <w:t xml:space="preserve"> </w:t>
+      </w:r>
+      <w:r>
+        <w:t xml:space="preserve">a third monitor on the staging site;</w:t>
+      </w:r>
+      <w:r>
+        <w:t xml:space="preserve"> </w:t>
+      </w:r>
+      <w:r>
+        <w:t xml:space="preserve">delete it when staging is retired.</w:t>
+      </w:r>
+    </w:p>
+    <w:p>
+      <w:pPr>
+        <w:pStyle w:val="FirstParagraph"/>
+      </w:pPr>
+      <w:r>
+        <w:t xml:space="preserve">The client-side</w:t>
+      </w:r>
+      <w:r>
+        <w:t xml:space="preserve"> </w:t>
+      </w:r>
+      <w:r>
+        <w:rPr>
+          <w:b/>
+          <w:bCs/>
+        </w:rPr>
+        <w:t xml:space="preserve">error reporter</w:t>
+      </w:r>
+      <w:r>
+        <w:t xml:space="preserve"> </w:t>
+      </w:r>
+      <w:r>
+        <w:t xml:space="preserve">half of §5.4-7 (Sentry) is deliberately deferred — see</w:t>
+      </w:r>
+      <w:r>
+        <w:t xml:space="preserve"> </w:t>
+      </w:r>
+      <w:r>
+        <w:rPr>
+          <w:rStyle w:val="VerbatimChar"/>
+        </w:rPr>
+        <w:t xml:space="preserve">ROADMAP.md</w:t>
+      </w:r>
+      <w:r>
+        <w:t xml:space="preserve"> </w:t>
+      </w:r>
+      <w:r>
+        <w:t xml:space="preserve">(Deferred) for the decision and the recorded design notes for building it in</w:t>
+      </w:r>
+      <w:r>
+        <w:t xml:space="preserve"> </w:t>
+      </w:r>
+      <w:r>
+        <w:t xml:space="preserve">later.</w:t>
+      </w:r>
+    </w:p>
+    <w:bookmarkEnd w:id="144"/>
     <w:bookmarkEnd w:id="145"/>
-    <w:bookmarkStart w:id="146" w:name="toc59"/>
+    <w:bookmarkStart w:id="146" w:name="toc58"/>
     <w:p>
       <w:pPr>
         <w:pStyle w:val="Heading3"/>
       </w:pPr>
       <w:r>
-        <w:t xml:space="preserve">6. Known launch-posture decisions (documented, deliberate)</w:t>
+        <w:t xml:space="preserve">5. Rollback</w:t>
+      </w:r>
+    </w:p>
+    <w:p>
+      <w:pPr>
+        <w:pStyle w:val="FirstParagraph"/>
+      </w:pPr>
+      <w:r>
+        <w:t xml:space="preserve">The demo is unaffected by anything above, so rollback is only about the production site:</w:t>
       </w:r>
     </w:p>
     <w:p>
@@ -45951,63 +46134,23 @@
         </w:numPr>
       </w:pPr>
       <w:r>
-        <w:rPr>
-          <w:b/>
-          <w:bCs/>
-        </w:rPr>
-        <w:t xml:space="preserve">Annotation freshness:</w:t>
-      </w:r>
-      <w:r>
-        <w:t xml:space="preserve"> </w:t>
-      </w:r>
-      <w:r>
-        <w:t xml:space="preserve">refetch on preview open and after every write. No polling, no</w:t>
-      </w:r>
-      <w:r>
-        <w:t xml:space="preserve"> </w:t>
-      </w:r>
-      <w:r>
-        <w:t xml:space="preserve">websockets. Two reviewers replying to the</w:t>
-      </w:r>
-      <w:r>
-        <w:t xml:space="preserve"> </w:t>
-      </w:r>
-      <w:r>
-        <w:rPr>
-          <w:i/>
-          <w:iCs/>
-        </w:rPr>
-        <w:t xml:space="preserve">same thread</w:t>
-      </w:r>
-      <w:r>
-        <w:t xml:space="preserve"> </w:t>
-      </w:r>
-      <w:r>
-        <w:t xml:space="preserve">in the same instant is</w:t>
-      </w:r>
-      <w:r>
-        <w:t xml:space="preserve"> </w:t>
-      </w:r>
-      <w:r>
-        <w:t xml:space="preserve">last-write-wins (</w:t>
-      </w:r>
-      <w:r>
-        <w:rPr>
-          <w:rStyle w:val="VerbatimChar"/>
-        </w:rPr>
-        <w:t xml:space="preserve">addComment</w:t>
-      </w:r>
-      <w:r>
-        <w:t xml:space="preserve"> </w:t>
-      </w:r>
-      <w:r>
-        <w:t xml:space="preserve">re-fetches then PUTs the whole row). Fine at ICJIA review</w:t>
-      </w:r>
-      <w:r>
-        <w:t xml:space="preserve"> </w:t>
-      </w:r>
-      <w:r>
-        <w:t xml:space="preserve">volumes; revisit only if it ever bites.</w:t>
+        <w:t xml:space="preserve">Bad build → Netlify → Deploys →</w:t>
+      </w:r>
+      <w:r>
+        <w:t xml:space="preserve"> </w:t>
+      </w:r>
+      <w:r>
+        <w:rPr>
+          <w:b/>
+          <w:bCs/>
+        </w:rPr>
+        <w:t xml:space="preserve">Publish</w:t>
+      </w:r>
+      <w:r>
+        <w:t xml:space="preserve"> </w:t>
+      </w:r>
+      <w:r>
+        <w:t xml:space="preserve">the previous known-good deploy (instant).</w:t>
       </w:r>
     </w:p>
     <w:p>
@@ -46019,50 +46162,7 @@
         </w:numPr>
       </w:pPr>
       <w:r>
-        <w:rPr>
-          <w:b/>
-          <w:bCs/>
-        </w:rPr>
-        <w:t xml:space="preserve">Annotation ids:</w:t>
-      </w:r>
-      <w:r>
-        <w:t xml:space="preserve"> </w:t>
-      </w:r>
-      <w:r>
-        <w:t xml:space="preserve">in production, an annotation's id IS its Strapi</w:t>
-      </w:r>
-      <w:r>
-        <w:t xml:space="preserve"> </w:t>
-      </w:r>
-      <w:r>
-        <w:rPr>
-          <w:rStyle w:val="VerbatimChar"/>
-        </w:rPr>
-        <w:t xml:space="preserve">documentId</w:t>
-      </w:r>
-      <w:r>
-        <w:t xml:space="preserve"> </w:t>
-      </w:r>
-      <w:r>
-        <w:t xml:space="preserve">(the</w:t>
-      </w:r>
-      <w:r>
-        <w:t xml:space="preserve"> </w:t>
-      </w:r>
-      <w:r>
-        <w:t xml:space="preserve">target entry's id lives in</w:t>
-      </w:r>
-      <w:r>
-        <w:t xml:space="preserve"> </w:t>
-      </w:r>
-      <w:r>
-        <w:rPr>
-          <w:rStyle w:val="VerbatimChar"/>
-        </w:rPr>
-        <w:t xml:space="preserve">targetDocumentId</w:t>
-      </w:r>
-      <w:r>
-        <w:t xml:space="preserve">). localStorage (demo) ids are client UUIDs.</w:t>
+        <w:t xml:space="preserve">Bad config → restore §3 settings; redeploy.</w:t>
       </w:r>
     </w:p>
     <w:p>
@@ -46074,29 +46174,44 @@
         </w:numPr>
       </w:pPr>
       <w:r>
-        <w:rPr>
-          <w:b/>
-          <w:bCs/>
-        </w:rPr>
-        <w:t xml:space="preserve">Demo annotations do not migrate.</w:t>
-      </w:r>
-      <w:r>
-        <w:t xml:space="preserve"> </w:t>
-      </w:r>
-      <w:r>
-        <w:t xml:space="preserve">localStorage threads live in individual browsers and</w:t>
-      </w:r>
-      <w:r>
-        <w:t xml:space="preserve"> </w:t>
-      </w:r>
-      <w:r>
-        <w:t xml:space="preserve">reference synthetic demo documentIds; they are demonstration data by definition. Anything</w:t>
-      </w:r>
-      <w:r>
-        <w:t xml:space="preserve"> </w:t>
-      </w:r>
-      <w:r>
-        <w:t xml:space="preserve">worth keeping should be re-entered against real drafts after cutover.</w:t>
+        <w:t xml:space="preserve">Strapi-side trouble with</w:t>
+      </w:r>
+      <w:r>
+        <w:t xml:space="preserve"> </w:t>
+      </w:r>
+      <w:r>
+        <w:rPr>
+          <w:rStyle w:val="VerbatimChar"/>
+        </w:rPr>
+        <w:t xml:space="preserve">review-annotation</w:t>
+      </w:r>
+      <w:r>
+        <w:t xml:space="preserve"> </w:t>
+      </w:r>
+      <w:r>
+        <w:t xml:space="preserve">→ the Studio degrades cleanly: annotation</w:t>
+      </w:r>
+      <w:r>
+        <w:t xml:space="preserve"> </w:t>
+      </w:r>
+      <w:r>
+        <w:t xml:space="preserve">calls fail with toasts/console errors but drafts, editing, and publishing are untouched</w:t>
+      </w:r>
+      <w:r>
+        <w:t xml:space="preserve"> </w:t>
+      </w:r>
+      <w:r>
+        <w:t xml:space="preserve">(the adapter is only reached from the preview surfaces).</w:t>
+      </w:r>
+    </w:p>
+    <w:bookmarkEnd w:id="146"/>
+    <w:bookmarkStart w:id="147" w:name="toc59"/>
+    <w:p>
+      <w:pPr>
+        <w:pStyle w:val="Heading3"/>
+      </w:pPr>
+      <w:r>
+        <w:t xml:space="preserve">6. Known launch-posture decisions (documented, deliberate)</w:t>
       </w:r>
     </w:p>
     <w:p>
@@ -46104,7 +46219,7 @@
         <w:pStyle w:val="Compact"/>
         <w:numPr>
           <w:ilvl w:val="0"/>
-          <w:numId w:val="1102"/>
+          <w:numId w:val="1103"/>
         </w:numPr>
       </w:pPr>
       <w:r>
@@ -46112,19 +46227,59 @@
           <w:b/>
           <w:bCs/>
         </w:rPr>
-        <w:t xml:space="preserve">Coarse RBAC on annotations</w:t>
-      </w:r>
-      <w:r>
-        <w:t xml:space="preserve"> </w:t>
-      </w:r>
-      <w:r>
-        <w:t xml:space="preserve">(any Author/Editor can CRUD all of them at the API level)</w:t>
-      </w:r>
-      <w:r>
-        <w:t xml:space="preserve"> </w:t>
-      </w:r>
-      <w:r>
-        <w:t xml:space="preserve">is intentional for launch; the UI enforces the polite rules.</w:t>
+        <w:t xml:space="preserve">Annotation freshness:</w:t>
+      </w:r>
+      <w:r>
+        <w:t xml:space="preserve"> </w:t>
+      </w:r>
+      <w:r>
+        <w:t xml:space="preserve">refetch on preview open and after every write. No polling, no</w:t>
+      </w:r>
+      <w:r>
+        <w:t xml:space="preserve"> </w:t>
+      </w:r>
+      <w:r>
+        <w:t xml:space="preserve">websockets. Two reviewers replying to the</w:t>
+      </w:r>
+      <w:r>
+        <w:t xml:space="preserve"> </w:t>
+      </w:r>
+      <w:r>
+        <w:rPr>
+          <w:i/>
+          <w:iCs/>
+        </w:rPr>
+        <w:t xml:space="preserve">same thread</w:t>
+      </w:r>
+      <w:r>
+        <w:t xml:space="preserve"> </w:t>
+      </w:r>
+      <w:r>
+        <w:t xml:space="preserve">in the same instant is</w:t>
+      </w:r>
+      <w:r>
+        <w:t xml:space="preserve"> </w:t>
+      </w:r>
+      <w:r>
+        <w:t xml:space="preserve">last-write-wins (</w:t>
+      </w:r>
+      <w:r>
+        <w:rPr>
+          <w:rStyle w:val="VerbatimChar"/>
+        </w:rPr>
+        <w:t xml:space="preserve">addComment</w:t>
+      </w:r>
+      <w:r>
+        <w:t xml:space="preserve"> </w:t>
+      </w:r>
+      <w:r>
+        <w:t xml:space="preserve">re-fetches then PUTs the whole row). Fine at ICJIA review</w:t>
+      </w:r>
+      <w:r>
+        <w:t xml:space="preserve"> </w:t>
+      </w:r>
+      <w:r>
+        <w:t xml:space="preserve">volumes; revisit only if it ever bites.</w:t>
       </w:r>
     </w:p>
     <w:p>
@@ -46132,7 +46287,7 @@
         <w:pStyle w:val="Compact"/>
         <w:numPr>
           <w:ilvl w:val="0"/>
-          <w:numId w:val="1102"/>
+          <w:numId w:val="1103"/>
         </w:numPr>
       </w:pPr>
       <w:r>
@@ -46140,46 +46295,46 @@
           <w:b/>
           <w:bCs/>
         </w:rPr>
-        <w:t xml:space="preserve">Non-blocking polish backlog:</w:t>
-      </w:r>
-      <w:r>
-        <w:t xml:space="preserve"> </w:t>
-      </w:r>
-      <w:r>
-        <w:t xml:space="preserve">the Phase-1 final review logged a hardening follow-up</w:t>
-      </w:r>
-      <w:r>
-        <w:t xml:space="preserve"> </w:t>
-      </w:r>
-      <w:r>
-        <w:t xml:space="preserve">list at the end of</w:t>
-      </w:r>
-      <w:r>
-        <w:t xml:space="preserve"> </w:t>
-      </w:r>
-      <w:r>
-        <w:rPr>
-          <w:rStyle w:val="VerbatimChar"/>
-        </w:rPr>
-        <w:t xml:space="preserve">.superpowers/sdd/progress.md</w:t>
-      </w:r>
-      <w:r>
-        <w:t xml:space="preserve"> </w:t>
-      </w:r>
-      <w:r>
-        <w:t xml:space="preserve">(annotation a11y riders: swatch</w:t>
-      </w:r>
-      <w:r>
-        <w:t xml:space="preserve"> </w:t>
-      </w:r>
-      <w:r>
-        <w:t xml:space="preserve">radiogroup semantics, roving toolbar tabindex, drawer dialog semantics, document-level</w:t>
-      </w:r>
-      <w:r>
-        <w:t xml:space="preserve"> </w:t>
-      </w:r>
-      <w:r>
-        <w:t xml:space="preserve">keyboard-create listener). None block launch; keep them visible.</w:t>
+        <w:t xml:space="preserve">Annotation ids:</w:t>
+      </w:r>
+      <w:r>
+        <w:t xml:space="preserve"> </w:t>
+      </w:r>
+      <w:r>
+        <w:t xml:space="preserve">in production, an annotation's id IS its Strapi</w:t>
+      </w:r>
+      <w:r>
+        <w:t xml:space="preserve"> </w:t>
+      </w:r>
+      <w:r>
+        <w:rPr>
+          <w:rStyle w:val="VerbatimChar"/>
+        </w:rPr>
+        <w:t xml:space="preserve">documentId</w:t>
+      </w:r>
+      <w:r>
+        <w:t xml:space="preserve"> </w:t>
+      </w:r>
+      <w:r>
+        <w:t xml:space="preserve">(the</w:t>
+      </w:r>
+      <w:r>
+        <w:t xml:space="preserve"> </w:t>
+      </w:r>
+      <w:r>
+        <w:t xml:space="preserve">target entry's id lives in</w:t>
+      </w:r>
+      <w:r>
+        <w:t xml:space="preserve"> </w:t>
+      </w:r>
+      <w:r>
+        <w:rPr>
+          <w:rStyle w:val="VerbatimChar"/>
+        </w:rPr>
+        <w:t xml:space="preserve">targetDocumentId</w:t>
+      </w:r>
+      <w:r>
+        <w:t xml:space="preserve">). localStorage (demo) ids are client UUIDs.</w:t>
       </w:r>
     </w:p>
     <w:p>
@@ -46187,7 +46342,7 @@
         <w:pStyle w:val="Compact"/>
         <w:numPr>
           <w:ilvl w:val="0"/>
-          <w:numId w:val="1102"/>
+          <w:numId w:val="1103"/>
         </w:numPr>
       </w:pPr>
       <w:r>
@@ -46195,6 +46350,123 @@
           <w:b/>
           <w:bCs/>
         </w:rPr>
+        <w:t xml:space="preserve">Demo annotations do not migrate.</w:t>
+      </w:r>
+      <w:r>
+        <w:t xml:space="preserve"> </w:t>
+      </w:r>
+      <w:r>
+        <w:t xml:space="preserve">localStorage threads live in individual browsers and</w:t>
+      </w:r>
+      <w:r>
+        <w:t xml:space="preserve"> </w:t>
+      </w:r>
+      <w:r>
+        <w:t xml:space="preserve">reference synthetic demo documentIds; they are demonstration data by definition. Anything</w:t>
+      </w:r>
+      <w:r>
+        <w:t xml:space="preserve"> </w:t>
+      </w:r>
+      <w:r>
+        <w:t xml:space="preserve">worth keeping should be re-entered against real drafts after cutover.</w:t>
+      </w:r>
+    </w:p>
+    <w:p>
+      <w:pPr>
+        <w:pStyle w:val="Compact"/>
+        <w:numPr>
+          <w:ilvl w:val="0"/>
+          <w:numId w:val="1103"/>
+        </w:numPr>
+      </w:pPr>
+      <w:r>
+        <w:rPr>
+          <w:b/>
+          <w:bCs/>
+        </w:rPr>
+        <w:t xml:space="preserve">Coarse RBAC on annotations</w:t>
+      </w:r>
+      <w:r>
+        <w:t xml:space="preserve"> </w:t>
+      </w:r>
+      <w:r>
+        <w:t xml:space="preserve">(any Author/Editor can CRUD all of them at the API level)</w:t>
+      </w:r>
+      <w:r>
+        <w:t xml:space="preserve"> </w:t>
+      </w:r>
+      <w:r>
+        <w:t xml:space="preserve">is intentional for launch; the UI enforces the polite rules.</w:t>
+      </w:r>
+    </w:p>
+    <w:p>
+      <w:pPr>
+        <w:pStyle w:val="Compact"/>
+        <w:numPr>
+          <w:ilvl w:val="0"/>
+          <w:numId w:val="1103"/>
+        </w:numPr>
+      </w:pPr>
+      <w:r>
+        <w:rPr>
+          <w:b/>
+          <w:bCs/>
+        </w:rPr>
+        <w:t xml:space="preserve">Non-blocking polish backlog:</w:t>
+      </w:r>
+      <w:r>
+        <w:t xml:space="preserve"> </w:t>
+      </w:r>
+      <w:r>
+        <w:t xml:space="preserve">the Phase-1 final review logged a hardening follow-up</w:t>
+      </w:r>
+      <w:r>
+        <w:t xml:space="preserve"> </w:t>
+      </w:r>
+      <w:r>
+        <w:t xml:space="preserve">list at the end of</w:t>
+      </w:r>
+      <w:r>
+        <w:t xml:space="preserve"> </w:t>
+      </w:r>
+      <w:r>
+        <w:rPr>
+          <w:rStyle w:val="VerbatimChar"/>
+        </w:rPr>
+        <w:t xml:space="preserve">.superpowers/sdd/progress.md</w:t>
+      </w:r>
+      <w:r>
+        <w:t xml:space="preserve"> </w:t>
+      </w:r>
+      <w:r>
+        <w:t xml:space="preserve">(annotation a11y riders: swatch</w:t>
+      </w:r>
+      <w:r>
+        <w:t xml:space="preserve"> </w:t>
+      </w:r>
+      <w:r>
+        <w:t xml:space="preserve">radiogroup semantics, roving toolbar tabindex, drawer dialog semantics, document-level</w:t>
+      </w:r>
+      <w:r>
+        <w:t xml:space="preserve"> </w:t>
+      </w:r>
+      <w:r>
+        <w:t xml:space="preserve">keyboard-create listener). None block launch; keep them visible.</w:t>
+      </w:r>
+    </w:p>
+    <w:p>
+      <w:pPr>
+        <w:pStyle w:val="Compact"/>
+        <w:numPr>
+          <w:ilvl w:val="0"/>
+          <w:numId w:val="1103"/>
+        </w:numPr>
+      </w:pPr>
+      <w:r>
+        <w:rPr>
+          <w:b/>
+          <w:bCs/>
+        </w:rPr>
         <w:t xml:space="preserve">Dev bypass ships-but-unreachable — and the CI launch gate.</w:t>
       </w:r>
       <w:r>
@@ -46314,9 +46586,9 @@
         <w:t xml:space="preserve">the same PR — from then on CI proves every production bundle ships without the bypass.</w:t>
       </w:r>
     </w:p>
-    <w:bookmarkEnd w:id="146"/>
     <w:bookmarkEnd w:id="147"/>
     <w:bookmarkEnd w:id="148"/>
+    <w:bookmarkEnd w:id="149"/>
     <w:sectPr>
       <w:footnotePr>
         <w:numRestart w:val="eachSect"/>
@@ -47287,9 +47559,39 @@
     </w:lvlOverride>
   </w:num>
   <w:num w:numId="1101">
+    <w:abstractNumId w:val="99411"/>
+    <w:lvlOverride w:ilvl="0">
+      <w:startOverride w:val="1"/>
+    </w:lvlOverride>
+    <w:lvlOverride w:ilvl="1">
+      <w:startOverride w:val="1"/>
+    </w:lvlOverride>
+    <w:lvlOverride w:ilvl="2">
+      <w:startOverride w:val="1"/>
+    </w:lvlOverride>
+    <w:lvlOverride w:ilvl="3">
+      <w:startOverride w:val="1"/>
+    </w:lvlOverride>
+    <w:lvlOverride w:ilvl="4">
+      <w:startOverride w:val="1"/>
+    </w:lvlOverride>
+    <w:lvlOverride w:ilvl="5">
+      <w:startOverride w:val="1"/>
+    </w:lvlOverride>
+    <w:lvlOverride w:ilvl="6">
+      <w:startOverride w:val="1"/>
+    </w:lvlOverride>
+    <w:lvlOverride w:ilvl="7">
+      <w:startOverride w:val="1"/>
+    </w:lvlOverride>
+    <w:lvlOverride w:ilvl="8">
+      <w:startOverride w:val="1"/>
+    </w:lvlOverride>
+  </w:num>
+  <w:num w:numId="1102">
     <w:abstractNumId w:val="991"/>
   </w:num>
-  <w:num w:numId="1102">
+  <w:num w:numId="1103">
     <w:abstractNumId w:val="991"/>
   </w:num>
 </w:numbering>

</xml_diff>

<commit_message>
release(0.8.3): the smalls — relation read-only posture documented (runbook §6 + Deferred sketch), a11y riders scheduled as Next №1, dependency currency (CI actions v7, 13-update minor group with locally-regenerated lockfile) — 868 tests / 109 files; docs current; Word editions regenerated (0 field codes)
</commit_message>
<xml_diff>
--- a/docs/ICJIA-Studio-20-analysis-roadmap-copperhead.docx
+++ b/docs/ICJIA-Studio-20-analysis-roadmap-copperhead.docx
@@ -4402,13 +4402,38 @@
                 <w:b/>
                 <w:bCs/>
               </w:rPr>
+              <w:t xml:space="preserve">✅ Scheduled (v0.8.3, 2026-07-17).</w:t>
+            </w:r>
+            <w:r>
+              <w:t xml:space="preserve"> </w:t>
+            </w:r>
+            <w:r>
+              <w:rPr>
+                <w:b/>
+                <w:bCs/>
+              </w:rPr>
               <w:t xml:space="preserve">Accessibility polish backlog</w:t>
             </w:r>
             <w:r>
               <w:t xml:space="preserve"> </w:t>
             </w:r>
             <w:r>
-              <w:t xml:space="preserve">(four small riders from the annotations review: color-swatch radiogroup semantics, roving toolbar tabindex, drawer dialog semantics, document-level keyboard-create listener).</w:t>
+              <w:t xml:space="preserve">(four small riders from the annotations review: color-swatch radiogroup semantics, roving toolbar tabindex, drawer dialog semantics, document-level keyboard-create listener). Now</w:t>
+            </w:r>
+            <w:r>
+              <w:t xml:space="preserve"> </w:t>
+            </w:r>
+            <w:r>
+              <w:rPr>
+                <w:rStyle w:val="VerbatimChar"/>
+              </w:rPr>
+              <w:t xml:space="preserve">ROADMAP.md</w:t>
+            </w:r>
+            <w:r>
+              <w:t xml:space="preserve"> </w:t>
+            </w:r>
+            <w:r>
+              <w:t xml:space="preserve">Next №1 — a single small release.</w:t>
             </w:r>
           </w:p>
         </w:tc>
@@ -4435,27 +4460,18 @@
               <w:t xml:space="preserve"> </w:t>
             </w:r>
             <w:r>
-              <w:t xml:space="preserve">already on the tracked list — schedule them so they don't evaporate.</w:t>
-            </w:r>
-          </w:p>
-        </w:tc>
-        <w:tc>
-          <w:tcPr/>
-          <w:p>
-            <w:pPr>
-              <w:pStyle w:val="Compact"/>
-            </w:pPr>
-            <w:r>
-              <w:t xml:space="preserve">Runbook §6 pointer;</w:t>
-            </w:r>
-            <w:r>
-              <w:t xml:space="preserve"> </w:t>
-            </w:r>
-            <w:r>
-              <w:rPr>
-                <w:rStyle w:val="VerbatimChar"/>
-              </w:rPr>
-              <w:t xml:space="preserve">.superpowers/sdd/progress.md</w:t>
+              <w:t xml:space="preserve">already on the tracked list — scheduled so they don't evaporate.</w:t>
+            </w:r>
+          </w:p>
+        </w:tc>
+        <w:tc>
+          <w:tcPr/>
+          <w:p>
+            <w:pPr>
+              <w:pStyle w:val="Compact"/>
+            </w:pPr>
+            <w:r>
+              <w:t xml:space="preserve">ROADMAP Next №1; runbook §6 pointer</w:t>
             </w:r>
           </w:p>
         </w:tc>
@@ -6733,7 +6749,7 @@
           <w:b/>
           <w:bCs/>
         </w:rPr>
-        <w:t xml:space="preserve">Hub Studio 2.0 · Studio build v0.8.2</w:t>
+        <w:t xml:space="preserve">Hub Studio 2.0 · Studio build v0.8.3</w:t>
       </w:r>
       <w:r>
         <w:t xml:space="preserve"> </w:t>
@@ -22306,7 +22322,7 @@
           <w:b/>
           <w:bCs/>
         </w:rPr>
-        <w:t xml:space="preserve">Hub Studio 2.0 · Studio build v0.8.2</w:t>
+        <w:t xml:space="preserve">Hub Studio 2.0 · Studio build v0.8.3</w:t>
       </w:r>
       <w:r>
         <w:t xml:space="preserve"> </w:t>
@@ -46212,6 +46228,85 @@
       </w:pPr>
       <w:r>
         <w:t xml:space="preserve">6. Known launch-posture decisions (documented, deliberate)</w:t>
+      </w:r>
+    </w:p>
+    <w:p>
+      <w:pPr>
+        <w:pStyle w:val="Compact"/>
+        <w:numPr>
+          <w:ilvl w:val="0"/>
+          <w:numId w:val="1103"/>
+        </w:numPr>
+      </w:pPr>
+      <w:r>
+        <w:rPr>
+          <w:b/>
+          <w:bCs/>
+        </w:rPr>
+        <w:t xml:space="preserve">Relation editing is read-only in the Studio (decided 2026-07-17):</w:t>
+      </w:r>
+      <w:r>
+        <w:t xml:space="preserve"> </w:t>
+      </w:r>
+      <w:r>
+        <w:t xml:space="preserve">the forms SHOW</w:t>
+      </w:r>
+      <w:r>
+        <w:t xml:space="preserve"> </w:t>
+      </w:r>
+      <w:r>
+        <w:t xml:space="preserve">related content (article ↔ apps ↔ datasets, hydrated from the Content-Manager relations</w:t>
+      </w:r>
+      <w:r>
+        <w:t xml:space="preserve"> </w:t>
+      </w:r>
+      <w:r>
+        <w:t xml:space="preserve">endpoint) but linking/unlinking happens in the Strapi admin. Saves are safe by</w:t>
+      </w:r>
+      <w:r>
+        <w:t xml:space="preserve"> </w:t>
+      </w:r>
+      <w:r>
+        <w:t xml:space="preserve">construction — write payloads omit relation fields entirely, and Strapi leaves omitted</w:t>
+      </w:r>
+      <w:r>
+        <w:t xml:space="preserve"> </w:t>
+      </w:r>
+      <w:r>
+        <w:t xml:space="preserve">fields untouched — so an author editing an article can never destroy links R&amp;A curated.</w:t>
+      </w:r>
+      <w:r>
+        <w:t xml:space="preserve"> </w:t>
+      </w:r>
+      <w:r>
+        <w:t xml:space="preserve">The forms say so honestly ("Linking related content is not editable here"). Build-in</w:t>
+      </w:r>
+      <w:r>
+        <w:t xml:space="preserve"> </w:t>
+      </w:r>
+      <w:r>
+        <w:t xml:space="preserve">sketch recorded in</w:t>
+      </w:r>
+      <w:r>
+        <w:t xml:space="preserve"> </w:t>
+      </w:r>
+      <w:r>
+        <w:rPr>
+          <w:rStyle w:val="VerbatimChar"/>
+        </w:rPr>
+        <w:t xml:space="preserve">ROADMAP.md</w:t>
+      </w:r>
+      <w:r>
+        <w:t xml:space="preserve"> </w:t>
+      </w:r>
+      <w:r>
+        <w:t xml:space="preserve">(Deferred); revisit once real usage shows whether</w:t>
+      </w:r>
+      <w:r>
+        <w:t xml:space="preserve"> </w:t>
+      </w:r>
+      <w:r>
+        <w:t xml:space="preserve">authors need it or R&amp;A keeps curating links in the admin.</w:t>
       </w:r>
     </w:p>
     <w:p>

</xml_diff>

<commit_message>
release(0.8.5): in-app /changelog + /roadmap pages — status-bar doc links render the repo's own markdown inside the Studio (repo is private; GitHub blob links 404'd for managers; /spec seam: build-time ?raw through the html:false pipeline, public, current per deploy; only Repository stays external) + share-preview/AI-readability meta from the metapeek.icjia.app assessment (canonical via Netlify URL env, meta author, JSON-LD WebApplication w/ publisher + build-stamped dateModified; robots/llms.txt exclusions deliberately KEPT — audited runbook-§3 posture) + spec digest at TOP of the rewrite doc (stale header date/677-count fixed, entries strictly newest-first) — 885 tests / 111 files (6 new, test-first); typecheck clean; demo generate verified (routes present; canonical/author/JSON-LD/absolute og:image confirmed in output); Word editions regenerated (0 field codes)
</commit_message>
<xml_diff>
--- a/docs/ICJIA-Studio-20-analysis-roadmap-copperhead.docx
+++ b/docs/ICJIA-Studio-20-analysis-roadmap-copperhead.docx
@@ -6823,7 +6823,7 @@
           <w:b/>
           <w:bCs/>
         </w:rPr>
-        <w:t xml:space="preserve">Hub Studio 2.0 · Studio build v0.8.4</w:t>
+        <w:t xml:space="preserve">Hub Studio 2.0 · Studio build v0.8.5</w:t>
       </w:r>
       <w:r>
         <w:t xml:space="preserve"> </w:t>
@@ -7299,7 +7299,7 @@
                 <w:b/>
                 <w:bCs/>
               </w:rPr>
-              <w:t xml:space="preserve">revised 2026-07-17 (v0.8.4)</w:t>
+              <w:t xml:space="preserve">revised 2026-07-17 (v0.8.5)</w:t>
             </w:r>
             <w:r>
               <w:t xml:space="preserve"> </w:t>
@@ -7673,6 +7673,70 @@
       </w:hyperlink>
       <w:r>
         <w:t xml:space="preserve">.</w:t>
+      </w:r>
+    </w:p>
+    <w:p>
+      <w:pPr>
+        <w:pStyle w:val="Compact"/>
+        <w:numPr>
+          <w:ilvl w:val="0"/>
+          <w:numId w:val="1018"/>
+        </w:numPr>
+      </w:pPr>
+      <w:r>
+        <w:rPr>
+          <w:b/>
+          <w:bCs/>
+        </w:rPr>
+        <w:t xml:space="preserve">2026-07-17 — Changelog &amp; Roadmap now readable inside the Studio (v0.8.5).</w:t>
+      </w:r>
+      <w:r>
+        <w:t xml:space="preserve"> </w:t>
+      </w:r>
+      <w:r>
+        <w:t xml:space="preserve">The</w:t>
+      </w:r>
+      <w:r>
+        <w:t xml:space="preserve"> </w:t>
+      </w:r>
+      <w:r>
+        <w:t xml:space="preserve">bottom status bar's Changelog and Roadmap links open in-app pages rendering the</w:t>
+      </w:r>
+      <w:r>
+        <w:t xml:space="preserve"> </w:t>
+      </w:r>
+      <w:r>
+        <w:t xml:space="preserve">repository's own records — no GitHub account or repository access needed (the</w:t>
+      </w:r>
+      <w:r>
+        <w:t xml:space="preserve"> </w:t>
+      </w:r>
+      <w:r>
+        <w:t xml:space="preserve">repository is private while in development; the old links produced "not found" errors</w:t>
+      </w:r>
+      <w:r>
+        <w:t xml:space="preserve"> </w:t>
+      </w:r>
+      <w:r>
+        <w:t xml:space="preserve">for managers). Like this document's own Spec &amp; status page, they re-render from the</w:t>
+      </w:r>
+      <w:r>
+        <w:t xml:space="preserve"> </w:t>
+      </w:r>
+      <w:r>
+        <w:t xml:space="preserve">repository on every deploy, so they always match the running build. This document's</w:t>
+      </w:r>
+      <w:r>
+        <w:t xml:space="preserve"> </w:t>
+      </w:r>
+      <w:r>
+        <w:t xml:space="preserve">dated digest also moved here, to the top, so the latest changes are the first thing a</w:t>
+      </w:r>
+      <w:r>
+        <w:t xml:space="preserve"> </w:t>
+      </w:r>
+      <w:r>
+        <w:t xml:space="preserve">reader sees.</w:t>
       </w:r>
     </w:p>
     <w:p>
@@ -22506,7 +22570,7 @@
           <w:b/>
           <w:bCs/>
         </w:rPr>
-        <w:t xml:space="preserve">Hub Studio 2.0 · Studio build v0.8.4</w:t>
+        <w:t xml:space="preserve">Hub Studio 2.0 · Studio build v0.8.5</w:t>
       </w:r>
       <w:r>
         <w:t xml:space="preserve"> </w:t>

</xml_diff>

<commit_message>
docs(posture): search/AI exclusion re-affirmed against the MetaPeek AI-readiness scan (user decision) — runbook §3 gains a 'deliberate scorecard failures — do not fix' note (robots.txt AI-bot blocks + absent llms.txt are the hardening working as designed); audit delta log records the re-affirmation; Word edition regenerated (0 field codes)
</commit_message>
<xml_diff>
--- a/docs/ICJIA-Studio-20-analysis-roadmap-copperhead.docx
+++ b/docs/ICJIA-Studio-20-analysis-roadmap-copperhead.docx
@@ -23456,6 +23456,79 @@
       </w:pPr>
       <w:r>
         <w:rPr>
+          <w:b/>
+          <w:bCs/>
+        </w:rPr>
+        <w:t xml:space="preserve">Search/AI-exclusion posture re-affirmed (2026-07-17).</w:t>
+      </w:r>
+      <w:r>
+        <w:t xml:space="preserve"> </w:t>
+      </w:r>
+      <w:r>
+        <w:t xml:space="preserve">An external SEO/AI-readiness</w:t>
+      </w:r>
+      <w:r>
+        <w:t xml:space="preserve"> </w:t>
+      </w:r>
+      <w:r>
+        <w:t xml:space="preserve">scan (MetaPeek) flagged the deny-all</w:t>
+      </w:r>
+      <w:r>
+        <w:t xml:space="preserve"> </w:t>
+      </w:r>
+      <w:r>
+        <w:rPr>
+          <w:rStyle w:val="VerbatimChar"/>
+        </w:rPr>
+        <w:t xml:space="preserve">robots.txt</w:t>
+      </w:r>
+      <w:r>
+        <w:t xml:space="preserve"> </w:t>
+      </w:r>
+      <w:r>
+        <w:t xml:space="preserve">(8 AI bots blocked) and missing</w:t>
+      </w:r>
+      <w:r>
+        <w:t xml:space="preserve"> </w:t>
+      </w:r>
+      <w:r>
+        <w:rPr>
+          <w:rStyle w:val="VerbatimChar"/>
+        </w:rPr>
+        <w:t xml:space="preserve">llms.txt</w:t>
+      </w:r>
+      <w:r>
+        <w:t xml:space="preserve">; the user explicitly chose to KEEP the exclusion — the runbook-§3 hardening</w:t>
+      </w:r>
+      <w:r>
+        <w:t xml:space="preserve"> </w:t>
+      </w:r>
+      <w:r>
+        <w:t xml:space="preserve">stands, now with an inline "deliberate scorecard failures — do not fix" note so the</w:t>
+      </w:r>
+      <w:r>
+        <w:t xml:space="preserve"> </w:t>
+      </w:r>
+      <w:r>
+        <w:t xml:space="preserve">finding can't be 'helpfully' reversed later. The scan's legitimate metadata items</w:t>
+      </w:r>
+      <w:r>
+        <w:t xml:space="preserve"> </w:t>
+      </w:r>
+      <w:r>
+        <w:t xml:space="preserve">(canonical, author, JSON-LD, freshness) shipped in 0.8.5 as inert head markup.</w:t>
+      </w:r>
+    </w:p>
+    <w:p>
+      <w:pPr>
+        <w:pStyle w:val="Compact"/>
+        <w:numPr>
+          <w:ilvl w:val="0"/>
+          <w:numId w:val="1031"/>
+        </w:numPr>
+      </w:pPr>
+      <w:r>
+        <w:rPr>
           <w:rStyle w:val="VerbatimChar"/>
           <w:b/>
           <w:bCs/>
@@ -46693,6 +46766,139 @@
       </w:r>
       <w:r>
         <w:t xml:space="preserve">) — no action needed here.</w:t>
+      </w:r>
+    </w:p>
+    <w:p>
+      <w:pPr>
+        <w:pStyle w:val="BlockText"/>
+      </w:pPr>
+      <w:r>
+        <w:rPr>
+          <w:b/>
+          <w:bCs/>
+        </w:rPr>
+        <w:t xml:space="preserve">Deliberate scorecard "failures" — do not "fix" (re-affirmed 2026-07-17).</w:t>
+      </w:r>
+      <w:r>
+        <w:t xml:space="preserve"> </w:t>
+      </w:r>
+      <w:r>
+        <w:t xml:space="preserve">SEO / AI-readiness</w:t>
+      </w:r>
+      <w:r>
+        <w:t xml:space="preserve"> </w:t>
+      </w:r>
+      <w:r>
+        <w:t xml:space="preserve">checkers (e.g. MetaPeek) will report two FAILs against this site forever:</w:t>
+      </w:r>
+      <w:r>
+        <w:t xml:space="preserve"> </w:t>
+      </w:r>
+      <w:r>
+        <w:rPr>
+          <w:i/>
+          <w:iCs/>
+        </w:rPr>
+        <w:t xml:space="preserve">"robots.txt blocks</w:t>
+      </w:r>
+      <w:r>
+        <w:rPr>
+          <w:i/>
+          <w:iCs/>
+        </w:rPr>
+        <w:t xml:space="preserve"> </w:t>
+      </w:r>
+      <w:r>
+        <w:rPr>
+          <w:i/>
+          <w:iCs/>
+        </w:rPr>
+        <w:t xml:space="preserve">AI bots"</w:t>
+      </w:r>
+      <w:r>
+        <w:t xml:space="preserve"> </w:t>
+      </w:r>
+      <w:r>
+        <w:t xml:space="preserve">and</w:t>
+      </w:r>
+      <w:r>
+        <w:t xml:space="preserve"> </w:t>
+      </w:r>
+      <w:r>
+        <w:rPr>
+          <w:i/>
+          <w:iCs/>
+        </w:rPr>
+        <w:t xml:space="preserve">"no llms.txt."</w:t>
+      </w:r>
+      <w:r>
+        <w:t xml:space="preserve"> </w:t>
+      </w:r>
+      <w:r>
+        <w:t xml:space="preserve">Both are THIS hardening working as designed — the Studio is an</w:t>
+      </w:r>
+      <w:r>
+        <w:t xml:space="preserve"> </w:t>
+      </w:r>
+      <w:r>
+        <w:t xml:space="preserve">internal tool whose demo is shared by link, not meant to be indexed by search engines or</w:t>
+      </w:r>
+      <w:r>
+        <w:t xml:space="preserve"> </w:t>
+      </w:r>
+      <w:r>
+        <w:t xml:space="preserve">ingested/cited by AI systems. The 2026-07-17 assessment closed every other item (canonical,</w:t>
+      </w:r>
+      <w:r>
+        <w:t xml:space="preserve"> </w:t>
+      </w:r>
+      <w:r>
+        <w:t xml:space="preserve">author, JSON-LD, freshness — inert head metadata for the humans a shared link reaches) and the</w:t>
+      </w:r>
+      <w:r>
+        <w:t xml:space="preserve"> </w:t>
+      </w:r>
+      <w:r>
+        <w:t xml:space="preserve">user explicitly chose to keep the exclusion. Unblocking AI bots or adding an llms.txt is a</w:t>
+      </w:r>
+      <w:r>
+        <w:t xml:space="preserve"> </w:t>
+      </w:r>
+      <w:r>
+        <w:t xml:space="preserve">posture decision, not a metadata fix — if ever wanted, change this section, the deny-all</w:t>
+      </w:r>
+      <w:r>
+        <w:t xml:space="preserve"> </w:t>
+      </w:r>
+      <w:r>
+        <w:rPr>
+          <w:rStyle w:val="VerbatimChar"/>
+        </w:rPr>
+        <w:t xml:space="preserve">public/robots.txt</w:t>
+      </w:r>
+      <w:r>
+        <w:t xml:space="preserve">, and the</w:t>
+      </w:r>
+      <w:r>
+        <w:t xml:space="preserve"> </w:t>
+      </w:r>
+      <w:r>
+        <w:rPr>
+          <w:rStyle w:val="VerbatimChar"/>
+        </w:rPr>
+        <w:t xml:space="preserve">security-headers.test.ts</w:t>
+      </w:r>
+      <w:r>
+        <w:t xml:space="preserve"> </w:t>
+      </w:r>
+      <w:r>
+        <w:t xml:space="preserve">guards together, and record it in the</w:t>
+      </w:r>
+      <w:r>
+        <w:t xml:space="preserve"> </w:t>
+      </w:r>
+      <w:r>
+        <w:t xml:space="preserve">security-audit delta log.</w:t>
       </w:r>
     </w:p>
     <w:bookmarkEnd w:id="144"/>

</xml_diff>